<commit_message>
I tried to have AI tell me what to update but it's becoming more time consuming than doing it manually
Signed-off-by: frothbeast <frothbeast@gmail.com>
</commit_message>
<xml_diff>
--- a/Union bylaws.docx
+++ b/Union bylaws.docx
@@ -1,6 +1,6 @@
 
 <file path=word/document.xml><?xml version="1.0" encoding="utf-8"?>
-<w:document xmlns:wpc="http://schemas.microsoft.com/office/word/2010/wordprocessingCanvas" xmlns:cx="http://schemas.microsoft.com/office/drawing/2014/chartex" xmlns:cx1="http://schemas.microsoft.com/office/drawing/2015/9/8/chartex" xmlns:cx2="http://schemas.microsoft.com/office/drawing/2015/10/21/chartex" xmlns:cx3="http://schemas.microsoft.com/office/drawing/2016/5/9/chartex" xmlns:cx4="http://schemas.microsoft.com/office/drawing/2016/5/10/chartex" xmlns:cx5="http://schemas.microsoft.com/office/drawing/2016/5/11/chartex" xmlns:cx6="http://schemas.microsoft.com/office/drawing/2016/5/12/chartex" xmlns:cx7="http://schemas.microsoft.com/office/drawing/2016/5/13/chartex" xmlns:cx8="http://schemas.microsoft.com/office/drawing/2016/5/14/chartex" xmlns:mc="http://schemas.openxmlformats.org/markup-compatibility/2006" xmlns:aink="http://schemas.microsoft.com/office/drawing/2016/ink" xmlns:am3d="http://schemas.microsoft.com/office/drawing/2017/model3d" xmlns:o="urn:schemas-microsoft-com:office:office" xmlns:oel="http://schemas.microsoft.com/office/2019/extlst" xmlns:r="http://schemas.openxmlformats.org/officeDocument/2006/relationships" xmlns:m="http://schemas.openxmlformats.org/officeDocument/2006/math" xmlns:v="urn:schemas-microsoft-com:vml" xmlns:wp14="http://schemas.microsoft.com/office/word/2010/wordprocessingDrawing" xmlns:wp="http://schemas.openxmlformats.org/drawingml/2006/wordprocessingDrawing" xmlns:w10="urn:schemas-microsoft-com:office:word" xmlns:w="http://schemas.openxmlformats.org/wordprocessingml/2006/main" xmlns:w14="http://schemas.microsoft.com/office/word/2010/wordml" xmlns:w15="http://schemas.microsoft.com/office/word/2012/wordml" xmlns:w16cex="http://schemas.microsoft.com/office/word/2018/wordml/cex" xmlns:w16cid="http://schemas.microsoft.com/office/word/2016/wordml/cid" xmlns:w16="http://schemas.microsoft.com/office/word/2018/wordml" xmlns:w16du="http://schemas.microsoft.com/office/word/2023/wordml/word16du" xmlns:w16sdtdh="http://schemas.microsoft.com/office/word/2020/wordml/sdtdatahash" xmlns:w16se="http://schemas.microsoft.com/office/word/2015/wordml/symex" xmlns:wpg="http://schemas.microsoft.com/office/word/2010/wordprocessingGroup" xmlns:wpi="http://schemas.microsoft.com/office/word/2010/wordprocessingInk" xmlns:wne="http://schemas.microsoft.com/office/word/2006/wordml" xmlns:wps="http://schemas.microsoft.com/office/word/2010/wordprocessingShape" mc:Ignorable="w14 w15 w16se w16cid w16 w16cex w16sdtdh w16du wp14">
+<w:document xmlns:wpc="http://schemas.microsoft.com/office/word/2010/wordprocessingCanvas" xmlns:cx="http://schemas.microsoft.com/office/drawing/2014/chartex" xmlns:cx1="http://schemas.microsoft.com/office/drawing/2015/9/8/chartex" xmlns:cx2="http://schemas.microsoft.com/office/drawing/2015/10/21/chartex" xmlns:cx3="http://schemas.microsoft.com/office/drawing/2016/5/9/chartex" xmlns:cx4="http://schemas.microsoft.com/office/drawing/2016/5/10/chartex" xmlns:cx5="http://schemas.microsoft.com/office/drawing/2016/5/11/chartex" xmlns:cx6="http://schemas.microsoft.com/office/drawing/2016/5/12/chartex" xmlns:cx7="http://schemas.microsoft.com/office/drawing/2016/5/13/chartex" xmlns:cx8="http://schemas.microsoft.com/office/drawing/2016/5/14/chartex" xmlns:mc="http://schemas.openxmlformats.org/markup-compatibility/2006" xmlns:aink="http://schemas.microsoft.com/office/drawing/2016/ink" xmlns:am3d="http://schemas.microsoft.com/office/drawing/2017/model3d" xmlns:o="urn:schemas-microsoft-com:office:office" xmlns:oel="http://schemas.microsoft.com/office/2019/extlst" xmlns:r="http://schemas.openxmlformats.org/officeDocument/2006/relationships" xmlns:m="http://schemas.openxmlformats.org/officeDocument/2006/math" xmlns:v="urn:schemas-microsoft-com:vml" xmlns:wp14="http://schemas.microsoft.com/office/word/2010/wordprocessingDrawing" xmlns:wp="http://schemas.openxmlformats.org/drawingml/2006/wordprocessingDrawing" xmlns:w10="urn:schemas-microsoft-com:office:word" xmlns:w="http://schemas.openxmlformats.org/wordprocessingml/2006/main" xmlns:w14="http://schemas.microsoft.com/office/word/2010/wordml" xmlns:w15="http://schemas.microsoft.com/office/word/2012/wordml" xmlns:w16cex="http://schemas.microsoft.com/office/word/2018/wordml/cex" xmlns:w16cid="http://schemas.microsoft.com/office/word/2016/wordml/cid" xmlns:w16="http://schemas.microsoft.com/office/word/2018/wordml" xmlns:w16du="http://schemas.microsoft.com/office/word/2023/wordml/word16du" xmlns:w16sdtdh="http://schemas.microsoft.com/office/word/2020/wordml/sdtdatahash" xmlns:w16sdtfl="http://schemas.microsoft.com/office/word/2024/wordml/sdtformatlock" xmlns:w16se="http://schemas.microsoft.com/office/word/2015/wordml/symex" xmlns:wpg="http://schemas.microsoft.com/office/word/2010/wordprocessingGroup" xmlns:wpi="http://schemas.microsoft.com/office/word/2010/wordprocessingInk" xmlns:wne="http://schemas.microsoft.com/office/word/2006/wordml" xmlns:wps="http://schemas.microsoft.com/office/word/2010/wordprocessingShape" mc:Ignorable="w14 w15 w16se w16cid w16 w16cex w16sdtdh w16sdtfl w16du wp14">
   <w:body>
     <w:p>
       <w:pPr>
@@ -415,12 +415,48 @@
           <w:rFonts w:ascii="Lato" w:hAnsi="Lato"/>
           <w:b/>
           <w:bCs/>
+          <w:color w:val="FF0000"/>
+          <w:sz w:val="28"/>
+          <w:szCs w:val="28"/>
+        </w:rPr>
+        <w:t xml:space="preserve"> Dec 06, </w:t>
+      </w:r>
+      <w:proofErr w:type="gramStart"/>
+      <w:r>
+        <w:rPr>
+          <w:rFonts w:ascii="Lato" w:hAnsi="Lato"/>
+          <w:b/>
+          <w:bCs/>
+          <w:color w:val="FF0000"/>
+          <w:sz w:val="28"/>
+          <w:szCs w:val="28"/>
+        </w:rPr>
+        <w:t xml:space="preserve">2024 </w:t>
+      </w:r>
+      <w:r>
+        <w:rPr>
+          <w:rFonts w:ascii="Lato" w:hAnsi="Lato"/>
+          <w:b/>
+          <w:bCs/>
           <w:strike/>
           <w:color w:val="FF0000"/>
           <w:sz w:val="28"/>
           <w:szCs w:val="28"/>
         </w:rPr>
-        <w:t xml:space="preserve"> Dec 12, 2017</w:t>
+        <w:t xml:space="preserve"> Dec</w:t>
+      </w:r>
+      <w:proofErr w:type="gramEnd"/>
+      <w:r>
+        <w:rPr>
+          <w:rFonts w:ascii="Lato" w:hAnsi="Lato"/>
+          <w:b/>
+          <w:bCs/>
+          <w:strike/>
+          <w:color w:val="FF0000"/>
+          <w:sz w:val="28"/>
+          <w:szCs w:val="28"/>
+        </w:rPr>
+        <w:t xml:space="preserve"> 12, 2017</w:t>
       </w:r>
     </w:p>
     <w:p>
@@ -610,7 +646,33 @@
         <w:rPr>
           <w:rFonts w:ascii="Lato" w:hAnsi="Lato"/>
         </w:rPr>
-        <w:t>The objectives of this organization shall be to improve the working conditions to establish wages in accordance with the existing economic conditions, to protect our rights to bargain collectively</w:t>
+        <w:t xml:space="preserve">The objectives of this organization </w:t>
+      </w:r>
+      <w:proofErr w:type="gramStart"/>
+      <w:r>
+        <w:rPr>
+          <w:rFonts w:ascii="Lato" w:hAnsi="Lato"/>
+        </w:rPr>
+        <w:t>shall</w:t>
+      </w:r>
+      <w:proofErr w:type="gramEnd"/>
+      <w:r>
+        <w:rPr>
+          <w:rFonts w:ascii="Lato" w:hAnsi="Lato"/>
+        </w:rPr>
+        <w:t xml:space="preserve"> be to improve the working </w:t>
+      </w:r>
+      <w:r>
+        <w:rPr>
+          <w:rFonts w:ascii="Lato" w:hAnsi="Lato"/>
+        </w:rPr>
+        <w:t>conditions,</w:t>
+      </w:r>
+      <w:r>
+        <w:rPr>
+          <w:rFonts w:ascii="Lato" w:hAnsi="Lato"/>
+        </w:rPr>
+        <w:t xml:space="preserve"> to establish wages in accordance with the existing economic conditions, to protect our rights to bargain collectively</w:t>
       </w:r>
       <w:r>
         <w:rPr>
@@ -622,7 +684,21 @@
         <w:rPr>
           <w:rFonts w:ascii="Lato" w:hAnsi="Lato"/>
         </w:rPr>
-        <w:t xml:space="preserve"> with our employers at all times and promote a better way of life.</w:t>
+        <w:t xml:space="preserve"> with our employers at all times and promote a better way of life</w:t>
+      </w:r>
+      <w:r>
+        <w:rPr>
+          <w:rFonts w:ascii="Lato" w:hAnsi="Lato"/>
+          <w:color w:val="92D050"/>
+        </w:rPr>
+        <w:t>.</w:t>
+      </w:r>
+      <w:r>
+        <w:rPr>
+          <w:rFonts w:ascii="Lato" w:hAnsi="Lato"/>
+          <w:color w:val="92D050"/>
+        </w:rPr>
+        <w:t xml:space="preserve"> The regulation of labour relations and collective bargaining between employers and employees.</w:t>
       </w:r>
     </w:p>
     <w:p>
@@ -2986,32 +3062,12 @@
       <w:r>
         <w:rPr>
           <w:rFonts w:ascii="Lato" w:hAnsi="Lato"/>
-          <w:color w:val="FF0000"/>
-          <w:sz w:val="20"/>
-          <w:szCs w:val="20"/>
-          <w:lang w:val="en-US"/>
-        </w:rPr>
-        <w:t>G</w:t>
-      </w:r>
-      <w:r>
-        <w:rPr>
-          <w:rFonts w:ascii="Lato" w:hAnsi="Lato"/>
-          <w:color w:val="FF0000"/>
-          <w:sz w:val="20"/>
-          <w:szCs w:val="20"/>
-          <w:lang w:val="en-US"/>
-        </w:rPr>
-        <w:t xml:space="preserve">eneral membership meetings </w:t>
-      </w:r>
-      <w:r>
-        <w:rPr>
-          <w:rFonts w:ascii="Lato" w:hAnsi="Lato"/>
-          <w:color w:val="FF0000"/>
-          <w:sz w:val="20"/>
-          <w:szCs w:val="20"/>
-          <w:lang w:val="en-US"/>
-        </w:rPr>
-        <w:t xml:space="preserve">and </w:t>
+          <w:color w:val="92D050"/>
+          <w:sz w:val="20"/>
+          <w:szCs w:val="20"/>
+          <w:lang w:val="en-US"/>
+        </w:rPr>
+        <w:t xml:space="preserve">General membership meetings and </w:t>
       </w:r>
       <w:r>
         <w:rPr>
@@ -3137,19 +3193,111 @@
         <w:ind w:left="1134" w:hanging="1134"/>
         <w:rPr>
           <w:rFonts w:ascii="Lato" w:hAnsi="Lato"/>
-          <w:sz w:val="20"/>
-          <w:szCs w:val="20"/>
-          <w:lang w:val="en-US"/>
-        </w:rPr>
-      </w:pPr>
-      <w:r>
-        <w:rPr>
-          <w:rFonts w:ascii="Lato" w:hAnsi="Lato"/>
-          <w:sz w:val="20"/>
-          <w:szCs w:val="20"/>
-          <w:lang w:val="en-US"/>
-        </w:rPr>
-        <w:t xml:space="preserve">The Local Union shall have the following Executive Officers:  President, Vice-President, Secretary Treasurer, a Retired Workers Representative (if the Local has a Retired Workers Chapter) and three Trustees. The chairman of each unit bargaining committee will be a member at large of the Local Union Executive Board. </w:t>
+          <w:dstrike/>
+          <w:color w:val="92D050"/>
+          <w:sz w:val="20"/>
+          <w:szCs w:val="20"/>
+          <w:lang w:val="en-US"/>
+        </w:rPr>
+      </w:pPr>
+      <w:r>
+        <w:rPr>
+          <w:rFonts w:ascii="Lato" w:hAnsi="Lato"/>
+          <w:sz w:val="20"/>
+          <w:szCs w:val="20"/>
+          <w:lang w:val="en-US"/>
+        </w:rPr>
+        <w:t xml:space="preserve">The Local Union shall have the following Executive Officers:  President, Vice-President, </w:t>
+      </w:r>
+      <w:r>
+        <w:rPr>
+          <w:rFonts w:ascii="Lato" w:hAnsi="Lato"/>
+          <w:dstrike/>
+          <w:color w:val="92D050"/>
+          <w:sz w:val="20"/>
+          <w:szCs w:val="20"/>
+          <w:lang w:val="en-US"/>
+        </w:rPr>
+        <w:t>Secretary Treasurer, a Retired Workers Representative (if the Local has a Retired Workers Chapter)</w:t>
+      </w:r>
+      <w:r>
+        <w:rPr>
+          <w:rFonts w:ascii="Lato" w:hAnsi="Lato"/>
+          <w:color w:val="92D050"/>
+          <w:sz w:val="20"/>
+          <w:szCs w:val="20"/>
+          <w:lang w:val="en-US"/>
+        </w:rPr>
+        <w:t xml:space="preserve"> </w:t>
+      </w:r>
+      <w:r>
+        <w:rPr>
+          <w:rFonts w:ascii="Lato" w:hAnsi="Lato"/>
+          <w:color w:val="92D050"/>
+          <w:sz w:val="20"/>
+          <w:szCs w:val="20"/>
+          <w:lang w:val="en-US"/>
+        </w:rPr>
+        <w:t>Recording Secretary, Financial Secretary</w:t>
+      </w:r>
+      <w:r>
+        <w:rPr>
+          <w:rFonts w:ascii="Lato" w:hAnsi="Lato"/>
+          <w:color w:val="FF0000"/>
+          <w:sz w:val="20"/>
+          <w:szCs w:val="20"/>
+          <w:lang w:val="en-US"/>
+        </w:rPr>
+        <w:t>,</w:t>
+      </w:r>
+      <w:r>
+        <w:rPr>
+          <w:rFonts w:ascii="Lato" w:hAnsi="Lato"/>
+          <w:sz w:val="20"/>
+          <w:szCs w:val="20"/>
+          <w:lang w:val="en-US"/>
+        </w:rPr>
+        <w:t xml:space="preserve"> </w:t>
+      </w:r>
+      <w:r>
+        <w:rPr>
+          <w:rFonts w:ascii="Lato" w:hAnsi="Lato"/>
+          <w:sz w:val="20"/>
+          <w:szCs w:val="20"/>
+          <w:lang w:val="en-US"/>
+        </w:rPr>
+        <w:t>and three Trustees.</w:t>
+      </w:r>
+      <w:r>
+        <w:rPr>
+          <w:rFonts w:ascii="Lato" w:hAnsi="Lato"/>
+          <w:color w:val="92D050"/>
+          <w:sz w:val="20"/>
+          <w:szCs w:val="20"/>
+          <w:lang w:val="en-US"/>
+        </w:rPr>
+        <w:t xml:space="preserve"> Vacant Trustee positions must be filled by election.</w:t>
+      </w:r>
+      <w:r>
+        <w:rPr>
+          <w:rFonts w:ascii="Lato" w:hAnsi="Lato"/>
+          <w:color w:val="92D050"/>
+          <w:sz w:val="20"/>
+          <w:szCs w:val="20"/>
+          <w:lang w:val="en-US"/>
+        </w:rPr>
+        <w:t xml:space="preserve"> </w:t>
+      </w:r>
+      <w:r>
+        <w:rPr>
+          <w:rFonts w:ascii="Lato" w:hAnsi="Lato"/>
+          <w:dstrike/>
+          <w:color w:val="92D050"/>
+          <w:sz w:val="20"/>
+          <w:szCs w:val="20"/>
+          <w:lang w:val="en-US"/>
+        </w:rPr>
+        <w:t xml:space="preserve">The chairman of each unit bargaining committee will be a member at large of the Local Union Executive Board. </w:t>
       </w:r>
     </w:p>
     <w:p>
@@ -3163,14 +3311,17 @@
         <w:ind w:left="1134" w:hanging="1134"/>
         <w:rPr>
           <w:rFonts w:ascii="Lato" w:hAnsi="Lato"/>
-          <w:sz w:val="20"/>
-          <w:szCs w:val="20"/>
-          <w:lang w:val="en-US"/>
-        </w:rPr>
-      </w:pPr>
-      <w:r>
-        <w:rPr>
-          <w:rFonts w:ascii="Lato" w:hAnsi="Lato"/>
+          <w:dstrike/>
+          <w:color w:val="92D050"/>
+          <w:sz w:val="20"/>
+          <w:szCs w:val="20"/>
+          <w:lang w:val="en-US"/>
+        </w:rPr>
+      </w:pPr>
+      <w:r>
+        <w:rPr>
+          <w:rFonts w:ascii="Lato" w:hAnsi="Lato"/>
+          <w:color w:val="92D050"/>
           <w:sz w:val="20"/>
           <w:szCs w:val="20"/>
           <w:lang w:val="en-US"/>
@@ -3180,6 +3331,8 @@
       <w:r>
         <w:rPr>
           <w:rFonts w:ascii="Lato" w:hAnsi="Lato"/>
+          <w:dstrike/>
+          <w:color w:val="92D050"/>
           <w:sz w:val="20"/>
           <w:szCs w:val="20"/>
           <w:lang w:val="en-US"/>
@@ -3265,34 +3418,121 @@
         <w:ind w:left="1134" w:hanging="1134"/>
         <w:rPr>
           <w:rFonts w:ascii="Lato" w:hAnsi="Lato"/>
-          <w:sz w:val="20"/>
-          <w:szCs w:val="20"/>
-          <w:lang w:val="en-US"/>
-        </w:rPr>
-      </w:pPr>
-      <w:r>
-        <w:rPr>
-          <w:rFonts w:ascii="Lato" w:hAnsi="Lato"/>
-          <w:sz w:val="20"/>
-          <w:szCs w:val="20"/>
-          <w:lang w:val="en-US"/>
-        </w:rPr>
-        <w:t xml:space="preserve">No member shall be eligible for election as an Executive Officer, appointed position or for nomination, of the Local Union until the person has been a member in continuous good standing in the local </w:t>
-      </w:r>
-      <w:r>
-        <w:rPr>
-          <w:rFonts w:ascii="Lato" w:hAnsi="Lato"/>
+          <w:dstrike/>
           <w:color w:val="FF0000"/>
           <w:sz w:val="20"/>
           <w:szCs w:val="20"/>
           <w:lang w:val="en-US"/>
         </w:rPr>
-        <w:t xml:space="preserve">for </w:t>
-      </w:r>
-      <w:r>
-        <w:rPr>
-          <w:rFonts w:ascii="Lato" w:hAnsi="Lato"/>
-          <w:color w:val="FF0000"/>
+      </w:pPr>
+      <w:r>
+        <w:rPr>
+          <w:rFonts w:ascii="Lato" w:hAnsi="Lato"/>
+          <w:sz w:val="20"/>
+          <w:szCs w:val="20"/>
+          <w:lang w:val="en-US"/>
+        </w:rPr>
+        <w:t xml:space="preserve">No member shall be eligible for election as an Executive Officer, appointed position or for </w:t>
+      </w:r>
+      <w:proofErr w:type="gramStart"/>
+      <w:r>
+        <w:rPr>
+          <w:rFonts w:ascii="Lato" w:hAnsi="Lato"/>
+          <w:sz w:val="20"/>
+          <w:szCs w:val="20"/>
+          <w:lang w:val="en-US"/>
+        </w:rPr>
+        <w:t>nomination,</w:t>
+      </w:r>
+      <w:proofErr w:type="gramEnd"/>
+      <w:r>
+        <w:rPr>
+          <w:rFonts w:ascii="Lato" w:hAnsi="Lato"/>
+          <w:sz w:val="20"/>
+          <w:szCs w:val="20"/>
+          <w:lang w:val="en-US"/>
+        </w:rPr>
+        <w:t xml:space="preserve"> of the Local Union until the person has been a member in continuous good standing in the local</w:t>
+      </w:r>
+      <w:r>
+        <w:rPr>
+          <w:rFonts w:ascii="Lato" w:hAnsi="Lato"/>
+          <w:sz w:val="20"/>
+          <w:szCs w:val="20"/>
+          <w:lang w:val="en-US"/>
+        </w:rPr>
+        <w:t xml:space="preserve"> for</w:t>
+      </w:r>
+      <w:r>
+        <w:rPr>
+          <w:rFonts w:ascii="Lato" w:hAnsi="Lato"/>
+          <w:sz w:val="20"/>
+          <w:szCs w:val="20"/>
+          <w:lang w:val="en-US"/>
+        </w:rPr>
+        <w:t xml:space="preserve"> </w:t>
+      </w:r>
+      <w:r>
+        <w:rPr>
+          <w:rFonts w:ascii="Lato" w:hAnsi="Lato"/>
+          <w:color w:val="92D050"/>
+          <w:sz w:val="20"/>
+          <w:szCs w:val="20"/>
+          <w:lang w:val="en-US"/>
+        </w:rPr>
+        <w:t>one (1) year</w:t>
+      </w:r>
+      <w:r>
+        <w:rPr>
+          <w:rFonts w:ascii="Lato" w:hAnsi="Lato"/>
+          <w:color w:val="92D050"/>
+          <w:sz w:val="20"/>
+          <w:szCs w:val="20"/>
+          <w:lang w:val="en-US"/>
+        </w:rPr>
+        <w:t>.</w:t>
+      </w:r>
+      <w:r>
+        <w:rPr>
+          <w:color w:val="92D050"/>
+        </w:rPr>
+        <w:t xml:space="preserve"> </w:t>
+      </w:r>
+      <w:r>
+        <w:rPr>
+          <w:rFonts w:ascii="Lato" w:hAnsi="Lato"/>
+          <w:color w:val="92D050"/>
+          <w:sz w:val="20"/>
+          <w:szCs w:val="20"/>
+          <w:lang w:val="en-US"/>
+        </w:rPr>
+        <w:t>A member on layoff or leave ceases to be a member when they no longer have recall rights in their collective agreement, or when the member's employment has permanently ended because of a workplace closure, permanent layoff or other event.</w:t>
+      </w:r>
+      <w:r>
+        <w:rPr>
+          <w:rFonts w:ascii="Lato" w:hAnsi="Lato"/>
+          <w:color w:val="92D050"/>
+          <w:sz w:val="20"/>
+          <w:szCs w:val="20"/>
+          <w:lang w:val="en-US"/>
+        </w:rPr>
+        <w:t xml:space="preserve"> </w:t>
+      </w:r>
+      <w:r>
+        <w:rPr>
+          <w:rFonts w:ascii="Lato" w:hAnsi="Lato"/>
+          <w:color w:val="92D050"/>
+          <w:sz w:val="20"/>
+          <w:szCs w:val="20"/>
+          <w:lang w:val="en-US"/>
+        </w:rPr>
+        <w:t xml:space="preserve"> </w:t>
+      </w:r>
+      <w:r>
+        <w:rPr>
+          <w:rFonts w:ascii="Lato" w:hAnsi="Lato"/>
+          <w:dstrike/>
+          <w:color w:val="92D050"/>
           <w:sz w:val="20"/>
           <w:szCs w:val="20"/>
           <w:lang w:val="en-US"/>
@@ -3302,30 +3542,13 @@
       <w:r>
         <w:rPr>
           <w:rFonts w:ascii="Lato" w:hAnsi="Lato"/>
-          <w:color w:val="FF0000"/>
-          <w:sz w:val="20"/>
-          <w:szCs w:val="20"/>
-          <w:lang w:val="en-US"/>
-        </w:rPr>
-        <w:t xml:space="preserve"> immediately prior to nomination</w:t>
-      </w:r>
-      <w:r>
-        <w:rPr>
-          <w:rFonts w:ascii="Lato" w:hAnsi="Lato"/>
-          <w:sz w:val="20"/>
-          <w:szCs w:val="20"/>
-          <w:lang w:val="en-US"/>
-        </w:rPr>
-        <w:t>.</w:t>
-      </w:r>
-      <w:r>
-        <w:rPr>
-          <w:rFonts w:ascii="Lato" w:hAnsi="Lato"/>
-          <w:sz w:val="20"/>
-          <w:szCs w:val="20"/>
-          <w:lang w:val="en-US"/>
-        </w:rPr>
-        <w:t xml:space="preserve"> A laid off member will be considered in good standing for the month of the layoff, plus six (6) months, after which they must notify the Financial Secretary, and every month thereafter of his/her intent to remain in good standing.</w:t>
+          <w:dstrike/>
+          <w:color w:val="92D050"/>
+          <w:sz w:val="20"/>
+          <w:szCs w:val="20"/>
+          <w:lang w:val="en-US"/>
+        </w:rPr>
+        <w:t xml:space="preserve"> immediately prior to nomination. A laid off member will be considered in good standing for the month of the layoff, plus six (6) months, after which they must notify the Financial Secretary, and every month thereafter of his/her intent to remain in good standing.</w:t>
       </w:r>
     </w:p>
     <w:p>
@@ -3409,108 +3632,153 @@
         <w:ind w:left="1134" w:hanging="283"/>
         <w:rPr>
           <w:rFonts w:ascii="Lato" w:hAnsi="Lato"/>
-          <w:strike/>
+          <w:dstrike/>
+          <w:color w:val="92D050"/>
+          <w:sz w:val="20"/>
+          <w:szCs w:val="20"/>
+          <w:lang w:val="en-US"/>
+        </w:rPr>
+      </w:pPr>
+      <w:r>
+        <w:rPr>
+          <w:rFonts w:ascii="Lato" w:hAnsi="Lato"/>
+          <w:dstrike/>
+          <w:color w:val="92D050"/>
+          <w:sz w:val="20"/>
+          <w:szCs w:val="20"/>
+          <w:lang w:val="en-US"/>
+        </w:rPr>
+        <w:t>Any member in good standing may nominate any eligible member for office. Nominations shall be held at a General Membership meeting of the local and shall be made from the floor.  The membership shall be duly notified at least seven (7) days in advance of the time and place of nominations and notice containing both the time and place of the elections shall be given at least fifteen (15) days in advance of the election, and at least seven (7) days shall elapse between the time of nominations and the date the election shall take place.</w:t>
+      </w:r>
+    </w:p>
+    <w:p>
+      <w:pPr>
+        <w:pStyle w:val="ListParagraph"/>
+        <w:keepNext/>
+        <w:keepLines/>
+        <w:ind w:left="1134"/>
+        <w:rPr>
+          <w:rFonts w:ascii="Lato" w:hAnsi="Lato"/>
+          <w:dstrike/>
+          <w:color w:val="92D050"/>
+        </w:rPr>
+      </w:pPr>
+    </w:p>
+    <w:p>
+      <w:pPr>
+        <w:pStyle w:val="ListParagraph"/>
+        <w:keepNext/>
+        <w:keepLines/>
+        <w:ind w:left="1134"/>
+        <w:rPr>
+          <w:rFonts w:ascii="Lato" w:hAnsi="Lato"/>
+          <w:dstrike/>
+          <w:color w:val="92D050"/>
+          <w:sz w:val="20"/>
+          <w:szCs w:val="20"/>
+          <w:lang w:val="en-US"/>
+        </w:rPr>
+      </w:pPr>
+      <w:r>
+        <w:rPr>
+          <w:rFonts w:ascii="Lato" w:hAnsi="Lato"/>
+          <w:dstrike/>
+          <w:color w:val="92D050"/>
+        </w:rPr>
+        <w:t>A member in good standing has the right to propose any eligible member for a position in office. These nominations will be conducted during a General Membership meeting of the local, and they must be made during the meeting. The entire membership will be formally informed at least seven (7) days prior to the scheduled nominations, specifying both the time and location. Furthermore, a notice disclosing the time and place of the elections must be provided at least fifteen (15) days before the election date. Additionally, there should be a minimum of seven (7) days between the nomination period and the actual election date.</w:t>
+      </w:r>
+    </w:p>
+    <w:p>
+      <w:pPr>
+        <w:pStyle w:val="ListParagraph"/>
+        <w:keepNext/>
+        <w:keepLines/>
+        <w:ind w:left="1134"/>
+        <w:rPr>
+          <w:rFonts w:ascii="Lato" w:hAnsi="Lato"/>
+          <w:color w:val="92D050"/>
+          <w:sz w:val="20"/>
+          <w:szCs w:val="20"/>
+          <w:lang w:val="en-US"/>
+        </w:rPr>
+      </w:pPr>
+    </w:p>
+    <w:p>
+      <w:pPr>
+        <w:pStyle w:val="ListParagraph"/>
+        <w:keepNext/>
+        <w:keepLines/>
+        <w:ind w:left="1134"/>
+        <w:rPr>
+          <w:rFonts w:ascii="Lato" w:hAnsi="Lato"/>
+          <w:color w:val="92D050"/>
+          <w:sz w:val="20"/>
+          <w:szCs w:val="20"/>
+          <w:lang w:val="en-US"/>
+        </w:rPr>
+      </w:pPr>
+      <w:r>
+        <w:rPr>
+          <w:rFonts w:ascii="Lato" w:hAnsi="Lato"/>
+          <w:color w:val="92D050"/>
+          <w:sz w:val="20"/>
+          <w:szCs w:val="20"/>
+          <w:lang w:val="en-US"/>
+        </w:rPr>
+        <w:t>Any member in good standing possesses the right to call for a special election by submitting a written request to the Executive Board. This request must outline the reasons for the proposed election and be signed by the member making the request. Upon receipt of such a request, the executive board shall promptly assess its validity and, if deemed appropriate, proceed to schedule, and conduct the special election in accordance with the established election procedures outlined in these bylaws.</w:t>
+      </w:r>
+      <w:r>
+        <w:rPr>
+          <w:rFonts w:ascii="Lato" w:hAnsi="Lato"/>
+          <w:color w:val="92D050"/>
+          <w:sz w:val="20"/>
+          <w:szCs w:val="20"/>
+          <w:lang w:val="en-US"/>
+        </w:rPr>
+        <w:br/>
+      </w:r>
+      <w:r>
+        <w:rPr>
+          <w:rFonts w:ascii="Lato" w:hAnsi="Lato"/>
+          <w:color w:val="92D050"/>
+          <w:sz w:val="20"/>
+          <w:szCs w:val="20"/>
+          <w:lang w:val="en-US"/>
+        </w:rPr>
+        <w:t xml:space="preserve">All elections of the Local Union shall be conducted in accordance with the </w:t>
+      </w:r>
+      <w:r>
+        <w:rPr>
+          <w:rFonts w:ascii="Lato" w:hAnsi="Lato"/>
+          <w:b/>
+          <w:bCs/>
+          <w:color w:val="92D050"/>
+          <w:sz w:val="20"/>
+          <w:szCs w:val="20"/>
+          <w:lang w:val="en-US"/>
+        </w:rPr>
+        <w:t>Policy Regarding Local Union Elections</w:t>
+      </w:r>
+      <w:r>
+        <w:rPr>
+          <w:rFonts w:ascii="Lato" w:hAnsi="Lato"/>
+          <w:color w:val="92D050"/>
+          <w:sz w:val="20"/>
+          <w:szCs w:val="20"/>
+          <w:lang w:val="en-US"/>
+        </w:rPr>
+        <w:t xml:space="preserve">. </w:t>
+      </w:r>
+    </w:p>
+    <w:p>
+      <w:pPr>
+        <w:pStyle w:val="ListParagraph"/>
+        <w:keepNext/>
+        <w:keepLines/>
+        <w:ind w:left="1134"/>
+        <w:rPr>
+          <w:rFonts w:ascii="Lato" w:hAnsi="Lato"/>
           <w:color w:val="FF0000"/>
-          <w:sz w:val="20"/>
-          <w:szCs w:val="20"/>
-          <w:lang w:val="en-US"/>
-        </w:rPr>
-      </w:pPr>
-      <w:r>
-        <w:rPr>
-          <w:rFonts w:ascii="Lato" w:hAnsi="Lato"/>
-          <w:strike/>
-          <w:color w:val="FF0000"/>
-          <w:sz w:val="20"/>
-          <w:szCs w:val="20"/>
-          <w:lang w:val="en-US"/>
-        </w:rPr>
-        <w:t>Any member in good standing may nominate any eligible member for office. Nominations shall be held at a General Membership meeting of the local and shall be made from the floor.  The membership shall be duly notified at least seven (7) days in advance of the time and place of nominations and notice containing both the time and place of the elections shall be given at least fifteen (15) days in advance of the election, and at least seven (7) days shall elapse between the time of nominations and the date the election shall take place.</w:t>
-      </w:r>
-    </w:p>
-    <w:p>
-      <w:pPr>
-        <w:pStyle w:val="ListParagraph"/>
-        <w:keepNext/>
-        <w:keepLines/>
-        <w:ind w:left="1134"/>
-        <w:rPr>
-          <w:rFonts w:ascii="Lato" w:hAnsi="Lato"/>
-          <w:color w:val="FF0000"/>
-        </w:rPr>
-      </w:pPr>
-    </w:p>
-    <w:p>
-      <w:pPr>
-        <w:pStyle w:val="ListParagraph"/>
-        <w:keepNext/>
-        <w:keepLines/>
-        <w:ind w:left="1134"/>
-        <w:rPr>
-          <w:rFonts w:ascii="Lato" w:hAnsi="Lato"/>
-          <w:strike/>
-          <w:color w:val="FF0000"/>
-          <w:sz w:val="20"/>
-          <w:szCs w:val="20"/>
-          <w:lang w:val="en-US"/>
-        </w:rPr>
-      </w:pPr>
-      <w:r>
-        <w:rPr>
-          <w:rFonts w:ascii="Lato" w:hAnsi="Lato"/>
-          <w:color w:val="FF0000"/>
-        </w:rPr>
-        <w:t>A member in good standing has the right to propose any eligible member for a position in office. These nominations will be conducted during a General Membership meeting of the local, and they must be made during the meeting. The entire membership will be formally informed at least seven (7) days prior to the scheduled nominations, specifying both the time and location. Furthermore, a notice disclosing the time and place of the elections must be provided at least fifteen (15) days before the election date. Additionally, there should be a minimum of seven (7) days between the nomination period and the actual election date.</w:t>
-      </w:r>
-    </w:p>
-    <w:p>
-      <w:pPr>
-        <w:pStyle w:val="ListParagraph"/>
-        <w:keepNext/>
-        <w:keepLines/>
-        <w:ind w:left="1134"/>
-        <w:rPr>
-          <w:rFonts w:ascii="Lato" w:hAnsi="Lato"/>
-          <w:color w:val="FF0000"/>
-          <w:sz w:val="20"/>
-          <w:szCs w:val="20"/>
-          <w:lang w:val="en-US"/>
-        </w:rPr>
-      </w:pPr>
-    </w:p>
-    <w:p>
-      <w:pPr>
-        <w:pStyle w:val="ListParagraph"/>
-        <w:keepNext/>
-        <w:keepLines/>
-        <w:ind w:left="1134"/>
-        <w:rPr>
-          <w:rFonts w:ascii="Lato" w:hAnsi="Lato"/>
-          <w:color w:val="FF0000"/>
-          <w:sz w:val="20"/>
-          <w:szCs w:val="20"/>
-          <w:lang w:val="en-US"/>
-        </w:rPr>
-      </w:pPr>
-      <w:r>
-        <w:rPr>
-          <w:rFonts w:ascii="Lato" w:hAnsi="Lato"/>
-          <w:color w:val="FF0000"/>
-          <w:sz w:val="20"/>
-          <w:szCs w:val="20"/>
-          <w:lang w:val="en-US"/>
-        </w:rPr>
-        <w:t>Any member in good standing possesses the right to call for a special election by submitting a written request to the Executive Board. This request must outline the reasons for the proposed election and be signed by the member making the request. Upon receipt of such a request, the executive board shall promptly assess its validity and, if deemed appropriate, proceed to schedule, and conduct the special election in accordance with the established election procedures outlined in these bylaws.</w:t>
-      </w:r>
-    </w:p>
-    <w:p>
-      <w:pPr>
-        <w:pStyle w:val="ListParagraph"/>
-        <w:keepNext/>
-        <w:keepLines/>
-        <w:ind w:left="1134"/>
-        <w:rPr>
-          <w:rFonts w:ascii="Lato" w:hAnsi="Lato"/>
           <w:sz w:val="20"/>
           <w:szCs w:val="20"/>
           <w:lang w:val="en-US"/>
@@ -3529,19 +3797,148 @@
         <w:ind w:left="1134" w:hanging="283"/>
         <w:rPr>
           <w:rFonts w:ascii="Lato" w:hAnsi="Lato"/>
-          <w:sz w:val="20"/>
-          <w:szCs w:val="20"/>
-          <w:lang w:val="en-US"/>
-        </w:rPr>
-      </w:pPr>
-      <w:r>
-        <w:rPr>
-          <w:rFonts w:ascii="Lato" w:hAnsi="Lato"/>
-          <w:sz w:val="20"/>
-          <w:szCs w:val="20"/>
-          <w:lang w:val="en-US"/>
-        </w:rPr>
-        <w:t xml:space="preserve"> Nominees shall notify to the Election Committee verbally or in writing of the intentions to stand for election within seventy-two (72) hours of the date of nomination. Failure to notify the Election Committee by the specified date will remove the nominee's name from the election list.</w:t>
+          <w:dstrike/>
+          <w:color w:val="92D050"/>
+          <w:sz w:val="20"/>
+          <w:szCs w:val="20"/>
+          <w:lang w:val="en-US"/>
+        </w:rPr>
+      </w:pPr>
+      <w:r>
+        <w:rPr>
+          <w:rFonts w:ascii="Lato" w:hAnsi="Lato"/>
+          <w:color w:val="92D050"/>
+          <w:sz w:val="20"/>
+          <w:szCs w:val="20"/>
+          <w:lang w:val="en-US"/>
+        </w:rPr>
+        <w:t xml:space="preserve"> </w:t>
+      </w:r>
+      <w:r>
+        <w:rPr>
+          <w:rFonts w:ascii="Lato" w:hAnsi="Lato"/>
+          <w:dstrike/>
+          <w:color w:val="92D050"/>
+          <w:sz w:val="20"/>
+          <w:szCs w:val="20"/>
+          <w:lang w:val="en-US"/>
+        </w:rPr>
+        <w:t xml:space="preserve">Nominees shall </w:t>
+      </w:r>
+      <w:proofErr w:type="gramStart"/>
+      <w:r>
+        <w:rPr>
+          <w:rFonts w:ascii="Lato" w:hAnsi="Lato"/>
+          <w:dstrike/>
+          <w:color w:val="92D050"/>
+          <w:sz w:val="20"/>
+          <w:szCs w:val="20"/>
+          <w:lang w:val="en-US"/>
+        </w:rPr>
+        <w:t>notify to</w:t>
+      </w:r>
+      <w:proofErr w:type="gramEnd"/>
+      <w:r>
+        <w:rPr>
+          <w:rFonts w:ascii="Lato" w:hAnsi="Lato"/>
+          <w:dstrike/>
+          <w:color w:val="92D050"/>
+          <w:sz w:val="20"/>
+          <w:szCs w:val="20"/>
+          <w:lang w:val="en-US"/>
+        </w:rPr>
+        <w:t xml:space="preserve"> the Election Committee verbally or in writing of the intentions to stand for election within seventy-two (72) hours of the date of nomination. Failure to notify the Election Committee by the specified date will remove the nominee's name from the election list.</w:t>
+      </w:r>
+    </w:p>
+    <w:p>
+      <w:pPr>
+        <w:pStyle w:val="ListParagraph"/>
+        <w:keepNext/>
+        <w:keepLines/>
+        <w:ind w:left="1134"/>
+        <w:rPr>
+          <w:rFonts w:ascii="Lato" w:hAnsi="Lato"/>
+          <w:color w:val="92D050"/>
+          <w:sz w:val="20"/>
+          <w:szCs w:val="20"/>
+          <w:lang w:val="en-US"/>
+        </w:rPr>
+      </w:pPr>
+      <w:r>
+        <w:rPr>
+          <w:rFonts w:ascii="Lato" w:hAnsi="Lato"/>
+          <w:color w:val="92D050"/>
+          <w:sz w:val="20"/>
+          <w:szCs w:val="20"/>
+          <w:lang w:val="en-US"/>
+        </w:rPr>
+        <w:t xml:space="preserve">A member in good standing has the right to propose any eligible member for a position in office. These nominations will be conducted during a General Membership meeting of the local, and they must be made during the meeting. The entire membership </w:t>
+      </w:r>
+      <w:r>
+        <w:rPr>
+          <w:rFonts w:ascii="Lato" w:hAnsi="Lato"/>
+          <w:b/>
+          <w:bCs/>
+          <w:color w:val="92D050"/>
+          <w:sz w:val="20"/>
+          <w:szCs w:val="20"/>
+          <w:lang w:val="en-US"/>
+        </w:rPr>
+        <w:t>shall</w:t>
+      </w:r>
+      <w:r>
+        <w:rPr>
+          <w:rFonts w:ascii="Lato" w:hAnsi="Lato"/>
+          <w:color w:val="92D050"/>
+          <w:sz w:val="20"/>
+          <w:szCs w:val="20"/>
+          <w:lang w:val="en-US"/>
+        </w:rPr>
+        <w:t xml:space="preserve"> be formally informed at least seven (7) days prior to the scheduled nominations, specifying both the time and location. Furthermore, a notice disclosing the time and place of the elections </w:t>
+      </w:r>
+      <w:r>
+        <w:rPr>
+          <w:rFonts w:ascii="Lato" w:hAnsi="Lato"/>
+          <w:b/>
+          <w:bCs/>
+          <w:color w:val="92D050"/>
+          <w:sz w:val="20"/>
+          <w:szCs w:val="20"/>
+          <w:lang w:val="en-US"/>
+        </w:rPr>
+        <w:t>shall</w:t>
+      </w:r>
+      <w:r>
+        <w:rPr>
+          <w:rFonts w:ascii="Lato" w:hAnsi="Lato"/>
+          <w:color w:val="92D050"/>
+          <w:sz w:val="20"/>
+          <w:szCs w:val="20"/>
+          <w:lang w:val="en-US"/>
+        </w:rPr>
+        <w:t xml:space="preserve"> be provided at least fifteen (15) days before the election date. Additionally, there </w:t>
+      </w:r>
+      <w:r>
+        <w:rPr>
+          <w:rFonts w:ascii="Lato" w:hAnsi="Lato"/>
+          <w:b/>
+          <w:bCs/>
+          <w:color w:val="92D050"/>
+          <w:sz w:val="20"/>
+          <w:szCs w:val="20"/>
+          <w:lang w:val="en-US"/>
+        </w:rPr>
+        <w:t>must</w:t>
+      </w:r>
+      <w:r>
+        <w:rPr>
+          <w:rFonts w:ascii="Lato" w:hAnsi="Lato"/>
+          <w:color w:val="92D050"/>
+          <w:sz w:val="20"/>
+          <w:szCs w:val="20"/>
+          <w:lang w:val="en-US"/>
+        </w:rPr>
+        <w:t xml:space="preserve"> be a minimum of seven (7) days between the nomination period and the actual election date.</w:t>
       </w:r>
     </w:p>
     <w:p>
@@ -3556,14 +3953,18 @@
         <w:ind w:left="1134" w:hanging="283"/>
         <w:rPr>
           <w:rFonts w:ascii="Lato" w:hAnsi="Lato"/>
-          <w:sz w:val="20"/>
-          <w:szCs w:val="20"/>
-          <w:lang w:val="en-US"/>
-        </w:rPr>
-      </w:pPr>
-      <w:r>
-        <w:rPr>
-          <w:rFonts w:ascii="Lato" w:hAnsi="Lato"/>
+          <w:dstrike/>
+          <w:color w:val="FF0000"/>
+          <w:sz w:val="20"/>
+          <w:szCs w:val="20"/>
+          <w:lang w:val="en-US"/>
+        </w:rPr>
+      </w:pPr>
+      <w:r>
+        <w:rPr>
+          <w:rFonts w:ascii="Lato" w:hAnsi="Lato"/>
+          <w:dstrike/>
+          <w:color w:val="FF0000"/>
           <w:sz w:val="20"/>
           <w:szCs w:val="20"/>
           <w:lang w:val="en-US"/>
@@ -3573,6 +3974,8 @@
       <w:r>
         <w:rPr>
           <w:rFonts w:ascii="Lato" w:hAnsi="Lato"/>
+          <w:dstrike/>
+          <w:color w:val="FF0000"/>
           <w:sz w:val="20"/>
           <w:szCs w:val="20"/>
           <w:lang w:val="en-US"/>
@@ -3582,11 +3985,60 @@
       <w:r>
         <w:rPr>
           <w:rFonts w:ascii="Lato" w:hAnsi="Lato"/>
+          <w:dstrike/>
+          <w:color w:val="FF0000"/>
           <w:sz w:val="20"/>
           <w:szCs w:val="20"/>
           <w:lang w:val="en-US"/>
         </w:rPr>
         <w:t xml:space="preserve"> it shall be the responsibility of the nominator to inform the nominee of the nomination.</w:t>
+      </w:r>
+    </w:p>
+    <w:p>
+      <w:pPr>
+        <w:pStyle w:val="ListParagraph"/>
+        <w:keepNext/>
+        <w:keepLines/>
+        <w:ind w:left="1134"/>
+        <w:rPr>
+          <w:rFonts w:ascii="Lato" w:hAnsi="Lato"/>
+          <w:color w:val="FF0000"/>
+          <w:sz w:val="20"/>
+          <w:szCs w:val="20"/>
+          <w:lang w:val="en-US"/>
+        </w:rPr>
+      </w:pPr>
+      <w:r>
+        <w:rPr>
+          <w:rFonts w:ascii="Lato" w:hAnsi="Lato"/>
+          <w:color w:val="FF0000"/>
+          <w:sz w:val="20"/>
+          <w:szCs w:val="20"/>
+          <w:lang w:val="en-US"/>
+        </w:rPr>
+        <w:t xml:space="preserve">Any member in good standing possesses the right to call for a special election by submitting a written request to the Executive Board. This request must outline the reasons for the proposed election and be signed by the </w:t>
+      </w:r>
+      <w:proofErr w:type="gramStart"/>
+      <w:r>
+        <w:rPr>
+          <w:rFonts w:ascii="Lato" w:hAnsi="Lato"/>
+          <w:color w:val="FF0000"/>
+          <w:sz w:val="20"/>
+          <w:szCs w:val="20"/>
+          <w:lang w:val="en-US"/>
+        </w:rPr>
+        <w:t>member</w:t>
+      </w:r>
+      <w:proofErr w:type="gramEnd"/>
+      <w:r>
+        <w:rPr>
+          <w:rFonts w:ascii="Lato" w:hAnsi="Lato"/>
+          <w:color w:val="FF0000"/>
+          <w:sz w:val="20"/>
+          <w:szCs w:val="20"/>
+          <w:lang w:val="en-US"/>
+        </w:rPr>
+        <w:t xml:space="preserve"> making the request. Upon receipt of such a request, the executive board shall promptly assess its validity and, if deemed appropriate, proceed to schedule and conduct the special election in accordance with the established election procedures outlined in these bylaws and the National Policy.</w:t>
       </w:r>
     </w:p>
     <w:p>
@@ -3654,7 +4106,67 @@
           <w:szCs w:val="20"/>
           <w:lang w:val="en-US"/>
         </w:rPr>
-        <w:t>Every member in good standing, (currently active, or a member who has been laid off for more than seven (7) months and has notified the Financial Secretary of their intention to remain in good standing, no less than one (1) month prior to the date of the election) shall be entitled to vote at all local union election.</w:t>
+        <w:lastRenderedPageBreak/>
+        <w:t>Every member in good standing, (currently active, or a member who has been laid off for more than</w:t>
+      </w:r>
+      <w:r>
+        <w:rPr>
+          <w:rFonts w:ascii="Lato" w:hAnsi="Lato"/>
+          <w:sz w:val="20"/>
+          <w:szCs w:val="20"/>
+          <w:lang w:val="en-US"/>
+        </w:rPr>
+        <w:t xml:space="preserve"> </w:t>
+      </w:r>
+      <w:r>
+        <w:rPr>
+          <w:rFonts w:ascii="Lato" w:hAnsi="Lato"/>
+          <w:color w:val="FF0000"/>
+          <w:sz w:val="20"/>
+          <w:szCs w:val="20"/>
+          <w:lang w:val="en-US"/>
+        </w:rPr>
+        <w:t>six (6)</w:t>
+      </w:r>
+      <w:r>
+        <w:rPr>
+          <w:rFonts w:ascii="Lato" w:hAnsi="Lato"/>
+          <w:color w:val="FF0000"/>
+          <w:sz w:val="20"/>
+          <w:szCs w:val="20"/>
+          <w:lang w:val="en-US"/>
+        </w:rPr>
+        <w:t xml:space="preserve"> </w:t>
+      </w:r>
+      <w:r>
+        <w:rPr>
+          <w:rFonts w:ascii="Lato" w:hAnsi="Lato"/>
+          <w:dstrike/>
+          <w:color w:val="FF0000"/>
+          <w:sz w:val="20"/>
+          <w:szCs w:val="20"/>
+          <w:lang w:val="en-US"/>
+        </w:rPr>
+        <w:t>seven (7)</w:t>
+      </w:r>
+      <w:r>
+        <w:rPr>
+          <w:rFonts w:ascii="Lato" w:hAnsi="Lato"/>
+          <w:color w:val="FF0000"/>
+          <w:sz w:val="20"/>
+          <w:szCs w:val="20"/>
+          <w:lang w:val="en-US"/>
+        </w:rPr>
+        <w:t xml:space="preserve"> </w:t>
+      </w:r>
+      <w:r>
+        <w:rPr>
+          <w:rFonts w:ascii="Lato" w:hAnsi="Lato"/>
+          <w:sz w:val="20"/>
+          <w:szCs w:val="20"/>
+          <w:lang w:val="en-US"/>
+        </w:rPr>
+        <w:t>months and has notified the Financial Secretary of their intention to remain in good standing, no less than one (1) month prior to the date of the election) shall be entitled to vote at all local union election.</w:t>
       </w:r>
     </w:p>
     <w:p>
@@ -3852,48 +4364,173 @@
           <w:szCs w:val="20"/>
           <w:lang w:val="en-US"/>
         </w:rPr>
-        <w:t xml:space="preserve">Section 1: An Election Committee of three (3) members in good standing, (currently active, or a member who has been laid off for more than seven (7) months and has notified the Financial Secretary of their intention to remain in good standing, no less than one (1) month prior to the call of this meeting) </w:t>
-      </w:r>
-      <w:r>
-        <w:rPr>
-          <w:rFonts w:ascii="Lato" w:hAnsi="Lato"/>
-          <w:strike/>
+        <w:t xml:space="preserve">An Election Committee of three (3) members in good standing, (currently active, or a member who has been laid off for more than seven </w:t>
+      </w:r>
+      <w:r>
+        <w:rPr>
+          <w:rFonts w:ascii="Lato" w:hAnsi="Lato"/>
           <w:color w:val="FF0000"/>
           <w:sz w:val="20"/>
           <w:szCs w:val="20"/>
           <w:lang w:val="en-US"/>
         </w:rPr>
-        <w:t>shall be elected by a show of hands at a regular or special membership meeting held at least one (1) month prior to the nominations</w:t>
-      </w:r>
-      <w:r>
-        <w:rPr>
-          <w:rFonts w:ascii="Lato" w:hAnsi="Lato"/>
-          <w:strike/>
+        <w:t xml:space="preserve">(6) months </w:t>
+      </w:r>
+      <w:r>
+        <w:rPr>
+          <w:rFonts w:ascii="Lato" w:hAnsi="Lato"/>
+          <w:dstrike/>
           <w:color w:val="FF0000"/>
           <w:sz w:val="20"/>
           <w:szCs w:val="20"/>
           <w:lang w:val="en-US"/>
         </w:rPr>
+        <w:t>(7) months</w:t>
+      </w:r>
+      <w:r>
+        <w:rPr>
+          <w:rFonts w:ascii="Lato" w:hAnsi="Lato"/>
+          <w:color w:val="FF0000"/>
+          <w:sz w:val="20"/>
+          <w:szCs w:val="20"/>
+          <w:lang w:val="en-US"/>
+        </w:rPr>
         <w:t xml:space="preserve"> </w:t>
       </w:r>
       <w:r>
         <w:rPr>
           <w:rFonts w:ascii="Lato" w:hAnsi="Lato"/>
+          <w:sz w:val="20"/>
+          <w:szCs w:val="20"/>
+          <w:lang w:val="en-US"/>
+        </w:rPr>
+        <w:t xml:space="preserve">and has notified the Financial Secretary of their intention to remain in good standing, no less than one (1) month prior to the call of this meeting) </w:t>
+      </w:r>
+      <w:r>
+        <w:rPr>
+          <w:rFonts w:ascii="Lato" w:hAnsi="Lato"/>
           <w:color w:val="FF0000"/>
           <w:sz w:val="20"/>
           <w:szCs w:val="20"/>
           <w:lang w:val="en-US"/>
         </w:rPr>
-        <w:t xml:space="preserve"> shall be elected either by a show of hands at a regular or special membership meeting held at least one (1) month prior to the nominations or through an electronic voting process approved by the executive board</w:t>
-      </w:r>
-      <w:r>
-        <w:rPr>
-          <w:rFonts w:ascii="Lato" w:hAnsi="Lato"/>
-          <w:sz w:val="20"/>
-          <w:szCs w:val="20"/>
-          <w:lang w:val="en-US"/>
-        </w:rPr>
-        <w:t>. Once elected to the election committee no member of that committee can stand for an elected position in the local.</w:t>
+        <w:t>shall be elected either by a show of hands at a regular or special membership meeting held at least</w:t>
+      </w:r>
+      <w:r>
+        <w:rPr>
+          <w:rFonts w:ascii="Lato" w:hAnsi="Lato"/>
+          <w:color w:val="FF0000"/>
+          <w:sz w:val="20"/>
+          <w:szCs w:val="20"/>
+          <w:lang w:val="en-US"/>
+        </w:rPr>
+        <w:t xml:space="preserve"> seven(7) days</w:t>
+      </w:r>
+      <w:r>
+        <w:rPr>
+          <w:rFonts w:ascii="Lato" w:hAnsi="Lato"/>
+          <w:color w:val="FF0000"/>
+          <w:sz w:val="20"/>
+          <w:szCs w:val="20"/>
+          <w:lang w:val="en-US"/>
+        </w:rPr>
+        <w:t xml:space="preserve"> </w:t>
+      </w:r>
+      <w:r>
+        <w:rPr>
+          <w:rFonts w:ascii="Lato" w:hAnsi="Lato"/>
+          <w:dstrike/>
+          <w:color w:val="FF0000"/>
+          <w:sz w:val="20"/>
+          <w:szCs w:val="20"/>
+          <w:lang w:val="en-US"/>
+        </w:rPr>
+        <w:t>one (1) month</w:t>
+      </w:r>
+      <w:r>
+        <w:rPr>
+          <w:rFonts w:ascii="Lato" w:hAnsi="Lato"/>
+          <w:color w:val="FF0000"/>
+          <w:sz w:val="20"/>
+          <w:szCs w:val="20"/>
+          <w:lang w:val="en-US"/>
+        </w:rPr>
+        <w:t xml:space="preserve"> prior to the nominations or through an electronic voting process</w:t>
+      </w:r>
+      <w:r>
+        <w:rPr>
+          <w:rFonts w:ascii="Lato" w:hAnsi="Lato"/>
+          <w:color w:val="FF0000"/>
+          <w:sz w:val="20"/>
+          <w:szCs w:val="20"/>
+          <w:lang w:val="en-US"/>
+        </w:rPr>
+        <w:t xml:space="preserve"> that is </w:t>
+      </w:r>
+      <w:r>
+        <w:rPr>
+          <w:rFonts w:ascii="Lato" w:hAnsi="Lato"/>
+          <w:color w:val="FF0000"/>
+          <w:sz w:val="20"/>
+          <w:szCs w:val="20"/>
+          <w:lang w:val="en-US"/>
+        </w:rPr>
+        <w:t xml:space="preserve"> </w:t>
+      </w:r>
+      <w:r>
+        <w:rPr>
+          <w:b/>
+          <w:bCs/>
+          <w:color w:val="FF0000"/>
+        </w:rPr>
+        <w:t>consistent with the Constitution and the Policy Regarding Local Union Elections</w:t>
+      </w:r>
+      <w:r>
+        <w:rPr>
+          <w:color w:val="FF0000"/>
+        </w:rPr>
+        <w:t>.</w:t>
+      </w:r>
+      <w:r>
+        <w:t xml:space="preserve"> </w:t>
+      </w:r>
+      <w:r>
+        <w:rPr>
+          <w:rFonts w:ascii="Lato" w:hAnsi="Lato"/>
+          <w:dstrike/>
+          <w:color w:val="FF0000"/>
+          <w:sz w:val="20"/>
+          <w:szCs w:val="20"/>
+          <w:lang w:val="en-US"/>
+        </w:rPr>
+        <w:t>approved by the executive board</w:t>
+      </w:r>
+      <w:r>
+        <w:rPr>
+          <w:rFonts w:ascii="Lato" w:hAnsi="Lato"/>
+          <w:sz w:val="20"/>
+          <w:szCs w:val="20"/>
+          <w:lang w:val="en-US"/>
+        </w:rPr>
+        <w:t>. Once elected to the election committee</w:t>
+      </w:r>
+      <w:r>
+        <w:rPr>
+          <w:rFonts w:ascii="Lato" w:hAnsi="Lato"/>
+          <w:sz w:val="20"/>
+          <w:szCs w:val="20"/>
+          <w:lang w:val="en-US"/>
+        </w:rPr>
+        <w:t>,</w:t>
+      </w:r>
+      <w:r>
+        <w:rPr>
+          <w:rFonts w:ascii="Lato" w:hAnsi="Lato"/>
+          <w:sz w:val="20"/>
+          <w:szCs w:val="20"/>
+          <w:lang w:val="en-US"/>
+        </w:rPr>
+        <w:t xml:space="preserve"> no member of that committee can stand for an elected position in the local.</w:t>
       </w:r>
     </w:p>
     <w:p>
@@ -4005,38 +4642,16 @@
         <w:rPr>
           <w:rFonts w:ascii="Lato" w:hAnsi="Lato"/>
           <w:strike/>
-          <w:color w:val="FF0000"/>
-          <w:sz w:val="20"/>
-          <w:szCs w:val="20"/>
-          <w:lang w:val="en-US"/>
-        </w:rPr>
-      </w:pPr>
-      <w:r>
-        <w:rPr>
-          <w:rFonts w:ascii="Lato" w:hAnsi="Lato"/>
-          <w:strike/>
-          <w:color w:val="FF0000"/>
-          <w:sz w:val="20"/>
-          <w:szCs w:val="20"/>
-          <w:lang w:val="en-US"/>
-        </w:rPr>
-        <w:t>Setting up a booth in the union hall or other appropriate locations, see to the printing of the ballots and the conduction of the election in a democratic way.</w:t>
-      </w:r>
-      <w:r>
-        <w:rPr>
-          <w:rFonts w:ascii="Lato" w:hAnsi="Lato"/>
-          <w:strike/>
-          <w:color w:val="FF0000"/>
-          <w:sz w:val="20"/>
-          <w:szCs w:val="20"/>
-          <w:lang w:val="en-US"/>
-        </w:rPr>
-        <w:t xml:space="preserve">   </w:t>
-      </w:r>
-      <w:r>
-        <w:rPr>
-          <w:rFonts w:ascii="Lato" w:hAnsi="Lato"/>
-          <w:color w:val="FF0000"/>
+          <w:color w:val="92D050"/>
+          <w:sz w:val="20"/>
+          <w:szCs w:val="20"/>
+          <w:lang w:val="en-US"/>
+        </w:rPr>
+      </w:pPr>
+      <w:r>
+        <w:rPr>
+          <w:rFonts w:ascii="Lato" w:hAnsi="Lato"/>
+          <w:color w:val="92D050"/>
           <w:sz w:val="20"/>
           <w:szCs w:val="20"/>
           <w:lang w:val="en-US"/>
@@ -4231,6 +4846,7 @@
           <w:szCs w:val="20"/>
           <w:lang w:val="en-US"/>
         </w:rPr>
+        <w:lastRenderedPageBreak/>
         <w:t>The Election Committee shall be responsible to the local membership and shall not be interfered with by any officer of the Executive Board.</w:t>
       </w:r>
     </w:p>
@@ -4273,14 +4889,43 @@
         <w:ind w:left="1134" w:hanging="1134"/>
         <w:rPr>
           <w:rFonts w:ascii="Lato" w:hAnsi="Lato"/>
-          <w:sz w:val="20"/>
-          <w:szCs w:val="20"/>
-          <w:lang w:val="en-US"/>
-        </w:rPr>
-      </w:pPr>
-      <w:r>
-        <w:rPr>
-          <w:rFonts w:ascii="Lato" w:hAnsi="Lato"/>
+          <w:color w:val="92D050"/>
+          <w:sz w:val="20"/>
+          <w:szCs w:val="20"/>
+          <w:lang w:val="en-US"/>
+        </w:rPr>
+      </w:pPr>
+      <w:r>
+        <w:rPr>
+          <w:rFonts w:ascii="Lato" w:hAnsi="Lato"/>
+          <w:color w:val="92D050"/>
+          <w:sz w:val="20"/>
+          <w:szCs w:val="20"/>
+          <w:lang w:val="en-US"/>
+        </w:rPr>
+        <w:t>Appeals are submitted in accordance with Article 18, B of the Constitution and the Procedure Policy on Constitutional Matters.</w:t>
+      </w:r>
+    </w:p>
+    <w:p>
+      <w:pPr>
+        <w:pStyle w:val="ListParagraph"/>
+        <w:keepNext/>
+        <w:keepLines/>
+        <w:ind w:left="1134"/>
+        <w:rPr>
+          <w:rFonts w:ascii="Lato" w:hAnsi="Lato"/>
+          <w:dstrike/>
+          <w:color w:val="FF0000"/>
+          <w:sz w:val="20"/>
+          <w:szCs w:val="20"/>
+          <w:lang w:val="en-US"/>
+        </w:rPr>
+      </w:pPr>
+      <w:r>
+        <w:rPr>
+          <w:rFonts w:ascii="Lato" w:hAnsi="Lato"/>
+          <w:dstrike/>
+          <w:color w:val="FF0000"/>
           <w:sz w:val="20"/>
           <w:szCs w:val="20"/>
           <w:lang w:val="en-US"/>
@@ -4325,7 +4970,6 @@
           <w:szCs w:val="24"/>
           <w:lang w:val="en-US"/>
         </w:rPr>
-        <w:lastRenderedPageBreak/>
         <w:t>Article 10 - Expenses of Officers</w:t>
       </w:r>
     </w:p>
@@ -4441,6 +5085,7 @@
           <w:szCs w:val="24"/>
           <w:lang w:val="en-US"/>
         </w:rPr>
+        <w:lastRenderedPageBreak/>
         <w:t>Article 11 - Duties of Local Union Executive Board</w:t>
       </w:r>
     </w:p>
@@ -4500,14 +5145,43 @@
         <w:ind w:left="1134" w:hanging="1134"/>
         <w:rPr>
           <w:rFonts w:ascii="Lato" w:hAnsi="Lato"/>
-          <w:sz w:val="20"/>
-          <w:szCs w:val="20"/>
-          <w:lang w:val="en-US"/>
-        </w:rPr>
-      </w:pPr>
-      <w:r>
-        <w:rPr>
-          <w:rFonts w:ascii="Lato" w:hAnsi="Lato"/>
+          <w:color w:val="FF0000"/>
+          <w:sz w:val="20"/>
+          <w:szCs w:val="20"/>
+          <w:lang w:val="en-US"/>
+        </w:rPr>
+      </w:pPr>
+      <w:r>
+        <w:rPr>
+          <w:rFonts w:ascii="Lato" w:hAnsi="Lato"/>
+          <w:color w:val="FF0000"/>
+          <w:sz w:val="20"/>
+          <w:szCs w:val="20"/>
+          <w:lang w:val="en-US"/>
+        </w:rPr>
+        <w:t>The mileage allowance shall be based on the rates used by Unifor National. Effective February 1, 2024, the rate is $0.70 per kilometer for the first 5,000 kilometers and $0.64 per kilometer for all kilometers over 5,000.</w:t>
+      </w:r>
+    </w:p>
+    <w:p>
+      <w:pPr>
+        <w:pStyle w:val="ListParagraph"/>
+        <w:keepNext/>
+        <w:keepLines/>
+        <w:ind w:left="1134"/>
+        <w:rPr>
+          <w:rFonts w:ascii="Lato" w:hAnsi="Lato"/>
+          <w:dstrike/>
+          <w:color w:val="FF0000"/>
+          <w:sz w:val="20"/>
+          <w:szCs w:val="20"/>
+          <w:lang w:val="en-US"/>
+        </w:rPr>
+      </w:pPr>
+      <w:r>
+        <w:rPr>
+          <w:rFonts w:ascii="Lato" w:hAnsi="Lato"/>
+          <w:dstrike/>
+          <w:color w:val="FF0000"/>
           <w:sz w:val="20"/>
           <w:szCs w:val="20"/>
           <w:lang w:val="en-US"/>
@@ -4518,6 +5192,7 @@
       <w:r>
         <w:rPr>
           <w:rFonts w:ascii="Lato" w:hAnsi="Lato"/>
+          <w:dstrike/>
           <w:color w:val="FF0000"/>
           <w:sz w:val="20"/>
           <w:szCs w:val="20"/>
@@ -4528,6 +5203,7 @@
       <w:r>
         <w:rPr>
           <w:rFonts w:ascii="Lato" w:hAnsi="Lato"/>
+          <w:dstrike/>
           <w:color w:val="FF0000"/>
           <w:sz w:val="20"/>
           <w:szCs w:val="20"/>
@@ -4539,6 +5215,8 @@
       <w:r>
         <w:rPr>
           <w:rFonts w:ascii="Lato" w:hAnsi="Lato"/>
+          <w:dstrike/>
+          <w:color w:val="FF0000"/>
           <w:sz w:val="20"/>
           <w:szCs w:val="20"/>
           <w:lang w:val="en-US"/>
@@ -4570,21 +5248,90 @@
           <w:szCs w:val="20"/>
           <w:lang w:val="en-US"/>
         </w:rPr>
-        <w:t>An ‘out of town’ overnight expense allowance will be eighty-five ($85.00) dollars per day plus room rate</w:t>
-      </w:r>
-      <w:r>
-        <w:rPr>
-          <w:rFonts w:ascii="Lato" w:hAnsi="Lato"/>
+        <w:t>An ‘out of town’ overnight expense allowance will be</w:t>
+      </w:r>
+      <w:r>
+        <w:rPr>
+          <w:rFonts w:ascii="Lato" w:hAnsi="Lato"/>
+          <w:sz w:val="20"/>
+          <w:szCs w:val="20"/>
+          <w:lang w:val="en-US"/>
+        </w:rPr>
+        <w:t xml:space="preserve"> </w:t>
+      </w:r>
+      <w:proofErr w:type="gramStart"/>
+      <w:r>
+        <w:rPr>
+          <w:rFonts w:ascii="Lato" w:hAnsi="Lato"/>
+          <w:sz w:val="20"/>
+          <w:szCs w:val="20"/>
+          <w:lang w:val="en-US"/>
+        </w:rPr>
+        <w:t>ninety(</w:t>
+      </w:r>
+      <w:proofErr w:type="gramEnd"/>
+      <w:r>
+        <w:rPr>
+          <w:rFonts w:ascii="Lato" w:hAnsi="Lato"/>
+          <w:sz w:val="20"/>
+          <w:szCs w:val="20"/>
+          <w:lang w:val="en-US"/>
+        </w:rPr>
+        <w:t>$90)</w:t>
+      </w:r>
+      <w:r>
+        <w:rPr>
+          <w:rFonts w:ascii="Lato" w:hAnsi="Lato"/>
+          <w:sz w:val="20"/>
+          <w:szCs w:val="20"/>
+          <w:lang w:val="en-US"/>
+        </w:rPr>
+        <w:t xml:space="preserve"> </w:t>
+      </w:r>
+      <w:r>
+        <w:rPr>
+          <w:rFonts w:ascii="Lato" w:hAnsi="Lato"/>
+          <w:dstrike/>
           <w:color w:val="FF0000"/>
           <w:sz w:val="20"/>
           <w:szCs w:val="20"/>
           <w:lang w:val="en-US"/>
         </w:rPr>
+        <w:t>eighty-five ($85.00)</w:t>
+      </w:r>
+      <w:r>
+        <w:rPr>
+          <w:rFonts w:ascii="Lato" w:hAnsi="Lato"/>
+          <w:sz w:val="20"/>
+          <w:szCs w:val="20"/>
+          <w:lang w:val="en-US"/>
+        </w:rPr>
+        <w:t xml:space="preserve"> dollars per day plus room rate</w:t>
+      </w:r>
+      <w:r>
+        <w:rPr>
+          <w:rFonts w:ascii="Lato" w:hAnsi="Lato"/>
+          <w:sz w:val="20"/>
+          <w:szCs w:val="20"/>
+          <w:lang w:val="en-US"/>
+        </w:rPr>
+        <w:t>.</w:t>
+      </w:r>
+      <w:r>
+        <w:rPr>
+          <w:rFonts w:ascii="Lato" w:hAnsi="Lato"/>
+          <w:dstrike/>
+          <w:color w:val="FF0000"/>
+          <w:sz w:val="20"/>
+          <w:szCs w:val="20"/>
+          <w:lang w:val="en-US"/>
+        </w:rPr>
         <w:t>, or rates used by Unifor National (whichever is higher)</w:t>
       </w:r>
       <w:r>
         <w:rPr>
           <w:rFonts w:ascii="Lato" w:hAnsi="Lato"/>
+          <w:dstrike/>
           <w:color w:val="FF0000"/>
           <w:sz w:val="20"/>
           <w:szCs w:val="20"/>
@@ -4605,33 +5352,89 @@
         <w:ind w:left="1134" w:hanging="1134"/>
         <w:rPr>
           <w:rFonts w:ascii="Lato" w:hAnsi="Lato"/>
-          <w:sz w:val="20"/>
-          <w:szCs w:val="20"/>
-          <w:lang w:val="en-US"/>
-        </w:rPr>
-      </w:pPr>
-      <w:r>
-        <w:rPr>
-          <w:rFonts w:ascii="Lato" w:hAnsi="Lato"/>
-          <w:sz w:val="20"/>
-          <w:szCs w:val="20"/>
-          <w:lang w:val="en-US"/>
-        </w:rPr>
-        <w:t>Any member on union business on a full day (beyond noon hour) basis outside the city but not stay overnight will be allowed fifty ($50.00) dollars</w:t>
-      </w:r>
-      <w:r>
-        <w:rPr>
-          <w:rFonts w:ascii="Lato" w:hAnsi="Lato"/>
           <w:color w:val="FF0000"/>
           <w:sz w:val="20"/>
           <w:szCs w:val="20"/>
           <w:lang w:val="en-US"/>
         </w:rPr>
+      </w:pPr>
+      <w:r>
+        <w:rPr>
+          <w:rFonts w:ascii="Lato" w:hAnsi="Lato"/>
+          <w:color w:val="FF0000"/>
+          <w:sz w:val="20"/>
+          <w:szCs w:val="20"/>
+          <w:lang w:val="en-US"/>
+        </w:rPr>
+        <w:t>Any member on union business same day return, provided the member travels at least 160 kilometers one way, will be allowed $45.00.</w:t>
+      </w:r>
+    </w:p>
+    <w:p>
+      <w:pPr>
+        <w:pStyle w:val="ListParagraph"/>
+        <w:keepNext/>
+        <w:keepLines/>
+        <w:ind w:left="1134"/>
+        <w:rPr>
+          <w:rFonts w:ascii="Lato" w:hAnsi="Lato"/>
+          <w:dstrike/>
+          <w:color w:val="FF0000"/>
+          <w:sz w:val="20"/>
+          <w:szCs w:val="20"/>
+          <w:lang w:val="en-US"/>
+        </w:rPr>
+      </w:pPr>
+      <w:r>
+        <w:rPr>
+          <w:rFonts w:ascii="Lato" w:hAnsi="Lato"/>
+          <w:dstrike/>
+          <w:color w:val="FF0000"/>
+          <w:sz w:val="20"/>
+          <w:szCs w:val="20"/>
+          <w:lang w:val="en-US"/>
+        </w:rPr>
+        <w:t xml:space="preserve">Any member on union business on a full day (beyond noon hour) basis outside the city but not </w:t>
+      </w:r>
+      <w:proofErr w:type="gramStart"/>
+      <w:r>
+        <w:rPr>
+          <w:rFonts w:ascii="Lato" w:hAnsi="Lato"/>
+          <w:dstrike/>
+          <w:color w:val="FF0000"/>
+          <w:sz w:val="20"/>
+          <w:szCs w:val="20"/>
+          <w:lang w:val="en-US"/>
+        </w:rPr>
+        <w:t>stay</w:t>
+      </w:r>
+      <w:proofErr w:type="gramEnd"/>
+      <w:r>
+        <w:rPr>
+          <w:rFonts w:ascii="Lato" w:hAnsi="Lato"/>
+          <w:dstrike/>
+          <w:color w:val="FF0000"/>
+          <w:sz w:val="20"/>
+          <w:szCs w:val="20"/>
+          <w:lang w:val="en-US"/>
+        </w:rPr>
+        <w:t xml:space="preserve"> overnight will be allowed fifty ($50.00) dollars</w:t>
+      </w:r>
+      <w:r>
+        <w:rPr>
+          <w:rFonts w:ascii="Lato" w:hAnsi="Lato"/>
+          <w:dstrike/>
+          <w:color w:val="FF0000"/>
+          <w:sz w:val="20"/>
+          <w:szCs w:val="20"/>
+          <w:lang w:val="en-US"/>
+        </w:rPr>
         <w:t>, or rates used by Unifor National (whichever is higher),</w:t>
       </w:r>
       <w:r>
         <w:rPr>
           <w:rFonts w:ascii="Lato" w:hAnsi="Lato"/>
+          <w:dstrike/>
+          <w:color w:val="FF0000"/>
           <w:sz w:val="20"/>
           <w:szCs w:val="20"/>
           <w:lang w:val="en-US"/>
@@ -4651,33 +5454,120 @@
         <w:ind w:left="1134" w:hanging="1134"/>
         <w:rPr>
           <w:rFonts w:ascii="Lato" w:hAnsi="Lato"/>
-          <w:sz w:val="20"/>
-          <w:szCs w:val="20"/>
-          <w:lang w:val="en-US"/>
-        </w:rPr>
-      </w:pPr>
-      <w:r>
-        <w:rPr>
-          <w:rFonts w:ascii="Lato" w:hAnsi="Lato"/>
-          <w:sz w:val="20"/>
-          <w:szCs w:val="20"/>
-          <w:lang w:val="en-US"/>
-        </w:rPr>
-        <w:t>Any member on union business within the municipality of Chatham-Kent will be reimbursed the greater of the sum of their receipts of twenty-five ($25.00) dollars</w:t>
-      </w:r>
-      <w:r>
-        <w:rPr>
-          <w:rFonts w:ascii="Lato" w:hAnsi="Lato"/>
           <w:color w:val="FF0000"/>
           <w:sz w:val="20"/>
           <w:szCs w:val="20"/>
           <w:lang w:val="en-US"/>
         </w:rPr>
+      </w:pPr>
+      <w:r>
+        <w:rPr>
+          <w:rFonts w:ascii="Lato" w:hAnsi="Lato"/>
+          <w:color w:val="FF0000"/>
+          <w:sz w:val="20"/>
+          <w:szCs w:val="20"/>
+          <w:lang w:val="en-US"/>
+        </w:rPr>
+        <w:t>Any member</w:t>
+      </w:r>
+      <w:r>
+        <w:rPr>
+          <w:rFonts w:ascii="Lato" w:hAnsi="Lato"/>
+          <w:color w:val="FF0000"/>
+          <w:sz w:val="20"/>
+          <w:szCs w:val="20"/>
+          <w:lang w:val="en-US"/>
+        </w:rPr>
+        <w:t>,</w:t>
+      </w:r>
+      <w:r>
+        <w:rPr>
+          <w:rFonts w:ascii="Lato" w:hAnsi="Lato"/>
+          <w:color w:val="FF0000"/>
+          <w:sz w:val="20"/>
+          <w:szCs w:val="20"/>
+          <w:lang w:val="en-US"/>
+        </w:rPr>
+        <w:t xml:space="preserve"> on union business within the municipality for eight (8) hour meetings where travel is less than 160 kilometers one way will be reimbursed $20.00.</w:t>
+      </w:r>
+    </w:p>
+    <w:p>
+      <w:pPr>
+        <w:pStyle w:val="ListParagraph"/>
+        <w:keepNext/>
+        <w:keepLines/>
+        <w:ind w:left="1134"/>
+        <w:rPr>
+          <w:rFonts w:ascii="Lato" w:hAnsi="Lato"/>
+          <w:dstrike/>
+          <w:color w:val="FF0000"/>
+          <w:sz w:val="20"/>
+          <w:szCs w:val="20"/>
+          <w:lang w:val="en-US"/>
+        </w:rPr>
+      </w:pPr>
+      <w:r>
+        <w:rPr>
+          <w:rFonts w:ascii="Lato" w:hAnsi="Lato"/>
+          <w:dstrike/>
+          <w:color w:val="FF0000"/>
+          <w:sz w:val="20"/>
+          <w:szCs w:val="20"/>
+          <w:lang w:val="en-US"/>
+        </w:rPr>
+        <w:t>Any member</w:t>
+      </w:r>
+      <w:r>
+        <w:rPr>
+          <w:rFonts w:ascii="Lato" w:hAnsi="Lato"/>
+          <w:dstrike/>
+          <w:color w:val="FF0000"/>
+          <w:sz w:val="20"/>
+          <w:szCs w:val="20"/>
+          <w:lang w:val="en-US"/>
+        </w:rPr>
+        <w:t xml:space="preserve"> </w:t>
+      </w:r>
+      <w:proofErr w:type="gramStart"/>
+      <w:r>
+        <w:rPr>
+          <w:rFonts w:ascii="Lato" w:hAnsi="Lato"/>
+          <w:dstrike/>
+          <w:color w:val="FF0000"/>
+          <w:sz w:val="20"/>
+          <w:szCs w:val="20"/>
+          <w:lang w:val="en-US"/>
+        </w:rPr>
+        <w:t>on</w:t>
+      </w:r>
+      <w:proofErr w:type="gramEnd"/>
+      <w:r>
+        <w:rPr>
+          <w:rFonts w:ascii="Lato" w:hAnsi="Lato"/>
+          <w:dstrike/>
+          <w:color w:val="FF0000"/>
+          <w:sz w:val="20"/>
+          <w:szCs w:val="20"/>
+          <w:lang w:val="en-US"/>
+        </w:rPr>
+        <w:t xml:space="preserve"> union business within the municipality of Chatham-Kent will be reimbursed the greater of the sum of their receipts of twenty-five ($25.00) dollars</w:t>
+      </w:r>
+      <w:r>
+        <w:rPr>
+          <w:rFonts w:ascii="Lato" w:hAnsi="Lato"/>
+          <w:dstrike/>
+          <w:color w:val="FF0000"/>
+          <w:sz w:val="20"/>
+          <w:szCs w:val="20"/>
+          <w:lang w:val="en-US"/>
+        </w:rPr>
         <w:t>, or rates used by Unifor National (whichever is higher)</w:t>
       </w:r>
       <w:r>
         <w:rPr>
           <w:rFonts w:ascii="Lato" w:hAnsi="Lato"/>
+          <w:dstrike/>
+          <w:color w:val="FF0000"/>
           <w:sz w:val="20"/>
           <w:szCs w:val="20"/>
           <w:lang w:val="en-US"/>
@@ -5083,6 +5973,7 @@
       <w:r>
         <w:rPr>
           <w:rFonts w:ascii="Lato" w:hAnsi="Lato"/>
+          <w:dstrike/>
           <w:sz w:val="20"/>
           <w:szCs w:val="20"/>
           <w:lang w:val="en-US"/>
@@ -5092,6 +5983,7 @@
       <w:r>
         <w:rPr>
           <w:rFonts w:ascii="Lato" w:hAnsi="Lato"/>
+          <w:dstrike/>
           <w:color w:val="FF0000"/>
           <w:sz w:val="20"/>
           <w:szCs w:val="20"/>
@@ -5145,11 +6037,75 @@
       <w:r>
         <w:rPr>
           <w:rFonts w:ascii="Lato" w:hAnsi="Lato"/>
+          <w:color w:val="FF0000"/>
+          <w:sz w:val="20"/>
+          <w:szCs w:val="20"/>
+          <w:lang w:val="en-US"/>
+        </w:rPr>
+        <w:t xml:space="preserve">A total of </w:t>
+      </w:r>
+      <w:r>
+        <w:rPr>
+          <w:rFonts w:ascii="Lato" w:hAnsi="Lato"/>
+          <w:b/>
+          <w:bCs/>
+          <w:color w:val="FF0000"/>
+          <w:sz w:val="20"/>
+          <w:szCs w:val="20"/>
+          <w:lang w:val="en-US"/>
+        </w:rPr>
+        <w:t>eight (8)</w:t>
+      </w:r>
+      <w:r>
+        <w:rPr>
+          <w:rFonts w:ascii="Lato" w:hAnsi="Lato"/>
+          <w:color w:val="FF0000"/>
+          <w:sz w:val="20"/>
+          <w:szCs w:val="20"/>
+          <w:lang w:val="en-US"/>
+        </w:rPr>
+        <w:t xml:space="preserve"> members </w:t>
+      </w:r>
+      <w:proofErr w:type="gramStart"/>
+      <w:r>
+        <w:rPr>
+          <w:rFonts w:ascii="Lato" w:hAnsi="Lato"/>
+          <w:color w:val="FF0000"/>
+          <w:sz w:val="20"/>
+          <w:szCs w:val="20"/>
+          <w:lang w:val="en-US"/>
+        </w:rPr>
+        <w:t>present</w:t>
+      </w:r>
+      <w:proofErr w:type="gramEnd"/>
+      <w:r>
+        <w:rPr>
+          <w:rFonts w:ascii="Lato" w:hAnsi="Lato"/>
+          <w:color w:val="FF0000"/>
+          <w:sz w:val="20"/>
+          <w:szCs w:val="20"/>
+          <w:lang w:val="en-US"/>
+        </w:rPr>
+        <w:t xml:space="preserve">, </w:t>
+      </w:r>
+      <w:r>
+        <w:rPr>
+          <w:rFonts w:ascii="Lato" w:hAnsi="Lato"/>
           <w:sz w:val="20"/>
           <w:szCs w:val="20"/>
           <w:lang w:val="en-US"/>
         </w:rPr>
         <w:t xml:space="preserve">including the Executive Board, at a regular meeting of the general membership of the local Union shall constitute a quorum for the transaction of Union business. All known new business at the time of posting the meeting shall be listed on the agenda. Notice of a regular membership meeting must be posted at least seven (7) days prior to the meeting. </w:t>
+      </w:r>
+      <w:r>
+        <w:rPr>
+          <w:rFonts w:ascii="Lato" w:hAnsi="Lato"/>
+          <w:color w:val="FF0000"/>
+          <w:sz w:val="20"/>
+          <w:szCs w:val="20"/>
+          <w:lang w:val="en-US"/>
+        </w:rPr>
+        <w:t>The seven (7) day notice may be waived for a special meeting in case of an emergency.</w:t>
       </w:r>
     </w:p>
     <w:p>
@@ -6787,7 +7743,27 @@
           <w:szCs w:val="20"/>
           <w:lang w:val="en-US"/>
         </w:rPr>
-        <w:t xml:space="preserve"> and it shall require a majority vote for adoption. </w:t>
+        <w:t xml:space="preserve"> and it </w:t>
+      </w:r>
+      <w:proofErr w:type="gramStart"/>
+      <w:r>
+        <w:rPr>
+          <w:rFonts w:ascii="Lato" w:hAnsi="Lato"/>
+          <w:sz w:val="20"/>
+          <w:szCs w:val="20"/>
+          <w:lang w:val="en-US"/>
+        </w:rPr>
+        <w:t>shall</w:t>
+      </w:r>
+      <w:proofErr w:type="gramEnd"/>
+      <w:r>
+        <w:rPr>
+          <w:rFonts w:ascii="Lato" w:hAnsi="Lato"/>
+          <w:sz w:val="20"/>
+          <w:szCs w:val="20"/>
+          <w:lang w:val="en-US"/>
+        </w:rPr>
+        <w:t xml:space="preserve"> require a majority vote for adoption. </w:t>
       </w:r>
     </w:p>
     <w:p>
@@ -6863,7 +7839,27 @@
           <w:szCs w:val="20"/>
           <w:lang w:val="en-US"/>
         </w:rPr>
-        <w:t xml:space="preserve"> may from time to time hereafter be altered or amended: and in the event of any conflict the constitution of the National Union Unifor-Canada shall govern.</w:t>
+        <w:t xml:space="preserve"> may from </w:t>
+      </w:r>
+      <w:proofErr w:type="gramStart"/>
+      <w:r>
+        <w:rPr>
+          <w:rFonts w:ascii="Lato" w:hAnsi="Lato"/>
+          <w:sz w:val="20"/>
+          <w:szCs w:val="20"/>
+          <w:lang w:val="en-US"/>
+        </w:rPr>
+        <w:t>time to time</w:t>
+      </w:r>
+      <w:proofErr w:type="gramEnd"/>
+      <w:r>
+        <w:rPr>
+          <w:rFonts w:ascii="Lato" w:hAnsi="Lato"/>
+          <w:sz w:val="20"/>
+          <w:szCs w:val="20"/>
+          <w:lang w:val="en-US"/>
+        </w:rPr>
+        <w:t xml:space="preserve"> hereafter be altered or amended: and in the event of any conflict the constitution of the National Union Unifor-Canada shall govern.</w:t>
       </w:r>
     </w:p>
     <w:p>
@@ -9238,8 +10234,8 @@
     </w:p>
     <w:sectPr>
       <w:footerReference w:type="default" r:id="rId9"/>
-      <w:pgSz w:w="12240" w:h="15840"/>
-      <w:pgMar w:top="1440" w:right="1440" w:bottom="1440" w:left="1440" w:header="708" w:footer="708" w:gutter="0"/>
+      <w:pgSz w:w="12240" w:h="15840" w:code="1"/>
+      <w:pgMar w:top="1440" w:right="1440" w:bottom="1440" w:left="1440" w:header="709" w:footer="709" w:gutter="0"/>
       <w:cols w:space="708"/>
       <w:docGrid w:linePitch="360"/>
     </w:sectPr>
@@ -9248,7 +10244,7 @@
 </file>
 
 <file path=word/endnotes.xml><?xml version="1.0" encoding="utf-8"?>
-<w:endnotes xmlns:wpc="http://schemas.microsoft.com/office/word/2010/wordprocessingCanvas" xmlns:cx="http://schemas.microsoft.com/office/drawing/2014/chartex" xmlns:cx1="http://schemas.microsoft.com/office/drawing/2015/9/8/chartex" xmlns:cx2="http://schemas.microsoft.com/office/drawing/2015/10/21/chartex" xmlns:cx3="http://schemas.microsoft.com/office/drawing/2016/5/9/chartex" xmlns:cx4="http://schemas.microsoft.com/office/drawing/2016/5/10/chartex" xmlns:cx5="http://schemas.microsoft.com/office/drawing/2016/5/11/chartex" xmlns:cx6="http://schemas.microsoft.com/office/drawing/2016/5/12/chartex" xmlns:cx7="http://schemas.microsoft.com/office/drawing/2016/5/13/chartex" xmlns:cx8="http://schemas.microsoft.com/office/drawing/2016/5/14/chartex" xmlns:mc="http://schemas.openxmlformats.org/markup-compatibility/2006" xmlns:aink="http://schemas.microsoft.com/office/drawing/2016/ink" xmlns:am3d="http://schemas.microsoft.com/office/drawing/2017/model3d" xmlns:o="urn:schemas-microsoft-com:office:office" xmlns:oel="http://schemas.microsoft.com/office/2019/extlst" xmlns:r="http://schemas.openxmlformats.org/officeDocument/2006/relationships" xmlns:m="http://schemas.openxmlformats.org/officeDocument/2006/math" xmlns:v="urn:schemas-microsoft-com:vml" xmlns:wp14="http://schemas.microsoft.com/office/word/2010/wordprocessingDrawing" xmlns:wp="http://schemas.openxmlformats.org/drawingml/2006/wordprocessingDrawing" xmlns:w10="urn:schemas-microsoft-com:office:word" xmlns:w="http://schemas.openxmlformats.org/wordprocessingml/2006/main" xmlns:w14="http://schemas.microsoft.com/office/word/2010/wordml" xmlns:w15="http://schemas.microsoft.com/office/word/2012/wordml" xmlns:w16cex="http://schemas.microsoft.com/office/word/2018/wordml/cex" xmlns:w16cid="http://schemas.microsoft.com/office/word/2016/wordml/cid" xmlns:w16="http://schemas.microsoft.com/office/word/2018/wordml" xmlns:w16du="http://schemas.microsoft.com/office/word/2023/wordml/word16du" xmlns:w16sdtdh="http://schemas.microsoft.com/office/word/2020/wordml/sdtdatahash" xmlns:w16se="http://schemas.microsoft.com/office/word/2015/wordml/symex" xmlns:wpg="http://schemas.microsoft.com/office/word/2010/wordprocessingGroup" xmlns:wpi="http://schemas.microsoft.com/office/word/2010/wordprocessingInk" xmlns:wne="http://schemas.microsoft.com/office/word/2006/wordml" xmlns:wps="http://schemas.microsoft.com/office/word/2010/wordprocessingShape" mc:Ignorable="w14 w15 w16se w16cid w16 w16cex w16sdtdh w16du wp14">
+<w:endnotes xmlns:wpc="http://schemas.microsoft.com/office/word/2010/wordprocessingCanvas" xmlns:cx="http://schemas.microsoft.com/office/drawing/2014/chartex" xmlns:cx1="http://schemas.microsoft.com/office/drawing/2015/9/8/chartex" xmlns:cx2="http://schemas.microsoft.com/office/drawing/2015/10/21/chartex" xmlns:cx3="http://schemas.microsoft.com/office/drawing/2016/5/9/chartex" xmlns:cx4="http://schemas.microsoft.com/office/drawing/2016/5/10/chartex" xmlns:cx5="http://schemas.microsoft.com/office/drawing/2016/5/11/chartex" xmlns:cx6="http://schemas.microsoft.com/office/drawing/2016/5/12/chartex" xmlns:cx7="http://schemas.microsoft.com/office/drawing/2016/5/13/chartex" xmlns:cx8="http://schemas.microsoft.com/office/drawing/2016/5/14/chartex" xmlns:mc="http://schemas.openxmlformats.org/markup-compatibility/2006" xmlns:aink="http://schemas.microsoft.com/office/drawing/2016/ink" xmlns:am3d="http://schemas.microsoft.com/office/drawing/2017/model3d" xmlns:o="urn:schemas-microsoft-com:office:office" xmlns:oel="http://schemas.microsoft.com/office/2019/extlst" xmlns:r="http://schemas.openxmlformats.org/officeDocument/2006/relationships" xmlns:m="http://schemas.openxmlformats.org/officeDocument/2006/math" xmlns:v="urn:schemas-microsoft-com:vml" xmlns:wp14="http://schemas.microsoft.com/office/word/2010/wordprocessingDrawing" xmlns:wp="http://schemas.openxmlformats.org/drawingml/2006/wordprocessingDrawing" xmlns:w10="urn:schemas-microsoft-com:office:word" xmlns:w="http://schemas.openxmlformats.org/wordprocessingml/2006/main" xmlns:w14="http://schemas.microsoft.com/office/word/2010/wordml" xmlns:w15="http://schemas.microsoft.com/office/word/2012/wordml" xmlns:w16cex="http://schemas.microsoft.com/office/word/2018/wordml/cex" xmlns:w16cid="http://schemas.microsoft.com/office/word/2016/wordml/cid" xmlns:w16="http://schemas.microsoft.com/office/word/2018/wordml" xmlns:w16du="http://schemas.microsoft.com/office/word/2023/wordml/word16du" xmlns:w16sdtdh="http://schemas.microsoft.com/office/word/2020/wordml/sdtdatahash" xmlns:w16sdtfl="http://schemas.microsoft.com/office/word/2024/wordml/sdtformatlock" xmlns:w16se="http://schemas.microsoft.com/office/word/2015/wordml/symex" xmlns:wpg="http://schemas.microsoft.com/office/word/2010/wordprocessingGroup" xmlns:wpi="http://schemas.microsoft.com/office/word/2010/wordprocessingInk" xmlns:wne="http://schemas.microsoft.com/office/word/2006/wordml" xmlns:wps="http://schemas.microsoft.com/office/word/2010/wordprocessingShape" mc:Ignorable="w14 w15 w16se w16cid w16 w16cex w16sdtdh w16sdtfl w16du wp14">
   <w:endnote w:type="separator" w:id="-1">
     <w:p>
       <w:r>
@@ -9267,7 +10263,7 @@
 </file>
 
 <file path=word/footer1.xml><?xml version="1.0" encoding="utf-8"?>
-<w:ftr xmlns:wpc="http://schemas.microsoft.com/office/word/2010/wordprocessingCanvas" xmlns:cx="http://schemas.microsoft.com/office/drawing/2014/chartex" xmlns:cx1="http://schemas.microsoft.com/office/drawing/2015/9/8/chartex" xmlns:cx2="http://schemas.microsoft.com/office/drawing/2015/10/21/chartex" xmlns:cx3="http://schemas.microsoft.com/office/drawing/2016/5/9/chartex" xmlns:cx4="http://schemas.microsoft.com/office/drawing/2016/5/10/chartex" xmlns:cx5="http://schemas.microsoft.com/office/drawing/2016/5/11/chartex" xmlns:cx6="http://schemas.microsoft.com/office/drawing/2016/5/12/chartex" xmlns:cx7="http://schemas.microsoft.com/office/drawing/2016/5/13/chartex" xmlns:cx8="http://schemas.microsoft.com/office/drawing/2016/5/14/chartex" xmlns:mc="http://schemas.openxmlformats.org/markup-compatibility/2006" xmlns:aink="http://schemas.microsoft.com/office/drawing/2016/ink" xmlns:am3d="http://schemas.microsoft.com/office/drawing/2017/model3d" xmlns:o="urn:schemas-microsoft-com:office:office" xmlns:oel="http://schemas.microsoft.com/office/2019/extlst" xmlns:r="http://schemas.openxmlformats.org/officeDocument/2006/relationships" xmlns:m="http://schemas.openxmlformats.org/officeDocument/2006/math" xmlns:v="urn:schemas-microsoft-com:vml" xmlns:wp14="http://schemas.microsoft.com/office/word/2010/wordprocessingDrawing" xmlns:wp="http://schemas.openxmlformats.org/drawingml/2006/wordprocessingDrawing" xmlns:w10="urn:schemas-microsoft-com:office:word" xmlns:w="http://schemas.openxmlformats.org/wordprocessingml/2006/main" xmlns:w14="http://schemas.microsoft.com/office/word/2010/wordml" xmlns:w15="http://schemas.microsoft.com/office/word/2012/wordml" xmlns:w16cex="http://schemas.microsoft.com/office/word/2018/wordml/cex" xmlns:w16cid="http://schemas.microsoft.com/office/word/2016/wordml/cid" xmlns:w16="http://schemas.microsoft.com/office/word/2018/wordml" xmlns:w16du="http://schemas.microsoft.com/office/word/2023/wordml/word16du" xmlns:w16sdtdh="http://schemas.microsoft.com/office/word/2020/wordml/sdtdatahash" xmlns:w16se="http://schemas.microsoft.com/office/word/2015/wordml/symex" xmlns:wpg="http://schemas.microsoft.com/office/word/2010/wordprocessingGroup" xmlns:wpi="http://schemas.microsoft.com/office/word/2010/wordprocessingInk" xmlns:wne="http://schemas.microsoft.com/office/word/2006/wordml" xmlns:wps="http://schemas.microsoft.com/office/word/2010/wordprocessingShape" mc:Ignorable="w14 w15 w16se w16cid w16 w16cex w16sdtdh w16du wp14">
+<w:ftr xmlns:wpc="http://schemas.microsoft.com/office/word/2010/wordprocessingCanvas" xmlns:cx="http://schemas.microsoft.com/office/drawing/2014/chartex" xmlns:cx1="http://schemas.microsoft.com/office/drawing/2015/9/8/chartex" xmlns:cx2="http://schemas.microsoft.com/office/drawing/2015/10/21/chartex" xmlns:cx3="http://schemas.microsoft.com/office/drawing/2016/5/9/chartex" xmlns:cx4="http://schemas.microsoft.com/office/drawing/2016/5/10/chartex" xmlns:cx5="http://schemas.microsoft.com/office/drawing/2016/5/11/chartex" xmlns:cx6="http://schemas.microsoft.com/office/drawing/2016/5/12/chartex" xmlns:cx7="http://schemas.microsoft.com/office/drawing/2016/5/13/chartex" xmlns:cx8="http://schemas.microsoft.com/office/drawing/2016/5/14/chartex" xmlns:mc="http://schemas.openxmlformats.org/markup-compatibility/2006" xmlns:aink="http://schemas.microsoft.com/office/drawing/2016/ink" xmlns:am3d="http://schemas.microsoft.com/office/drawing/2017/model3d" xmlns:o="urn:schemas-microsoft-com:office:office" xmlns:oel="http://schemas.microsoft.com/office/2019/extlst" xmlns:r="http://schemas.openxmlformats.org/officeDocument/2006/relationships" xmlns:m="http://schemas.openxmlformats.org/officeDocument/2006/math" xmlns:v="urn:schemas-microsoft-com:vml" xmlns:wp14="http://schemas.microsoft.com/office/word/2010/wordprocessingDrawing" xmlns:wp="http://schemas.openxmlformats.org/drawingml/2006/wordprocessingDrawing" xmlns:w10="urn:schemas-microsoft-com:office:word" xmlns:w="http://schemas.openxmlformats.org/wordprocessingml/2006/main" xmlns:w14="http://schemas.microsoft.com/office/word/2010/wordml" xmlns:w15="http://schemas.microsoft.com/office/word/2012/wordml" xmlns:w16cex="http://schemas.microsoft.com/office/word/2018/wordml/cex" xmlns:w16cid="http://schemas.microsoft.com/office/word/2016/wordml/cid" xmlns:w16="http://schemas.microsoft.com/office/word/2018/wordml" xmlns:w16du="http://schemas.microsoft.com/office/word/2023/wordml/word16du" xmlns:w16sdtdh="http://schemas.microsoft.com/office/word/2020/wordml/sdtdatahash" xmlns:w16sdtfl="http://schemas.microsoft.com/office/word/2024/wordml/sdtformatlock" xmlns:w16se="http://schemas.microsoft.com/office/word/2015/wordml/symex" xmlns:wpg="http://schemas.microsoft.com/office/word/2010/wordprocessingGroup" xmlns:wpi="http://schemas.microsoft.com/office/word/2010/wordprocessingInk" xmlns:wne="http://schemas.microsoft.com/office/word/2006/wordml" xmlns:wps="http://schemas.microsoft.com/office/word/2010/wordprocessingShape" mc:Ignorable="w14 w15 w16se w16cid w16 w16cex w16sdtdh w16sdtfl w16du wp14">
   <w:sdt>
     <w:sdtPr>
       <w:id w:val="-2068255027"/>
@@ -9411,7 +10407,7 @@
 </file>
 
 <file path=word/footnotes.xml><?xml version="1.0" encoding="utf-8"?>
-<w:footnotes xmlns:wpc="http://schemas.microsoft.com/office/word/2010/wordprocessingCanvas" xmlns:cx="http://schemas.microsoft.com/office/drawing/2014/chartex" xmlns:cx1="http://schemas.microsoft.com/office/drawing/2015/9/8/chartex" xmlns:cx2="http://schemas.microsoft.com/office/drawing/2015/10/21/chartex" xmlns:cx3="http://schemas.microsoft.com/office/drawing/2016/5/9/chartex" xmlns:cx4="http://schemas.microsoft.com/office/drawing/2016/5/10/chartex" xmlns:cx5="http://schemas.microsoft.com/office/drawing/2016/5/11/chartex" xmlns:cx6="http://schemas.microsoft.com/office/drawing/2016/5/12/chartex" xmlns:cx7="http://schemas.microsoft.com/office/drawing/2016/5/13/chartex" xmlns:cx8="http://schemas.microsoft.com/office/drawing/2016/5/14/chartex" xmlns:mc="http://schemas.openxmlformats.org/markup-compatibility/2006" xmlns:aink="http://schemas.microsoft.com/office/drawing/2016/ink" xmlns:am3d="http://schemas.microsoft.com/office/drawing/2017/model3d" xmlns:o="urn:schemas-microsoft-com:office:office" xmlns:oel="http://schemas.microsoft.com/office/2019/extlst" xmlns:r="http://schemas.openxmlformats.org/officeDocument/2006/relationships" xmlns:m="http://schemas.openxmlformats.org/officeDocument/2006/math" xmlns:v="urn:schemas-microsoft-com:vml" xmlns:wp14="http://schemas.microsoft.com/office/word/2010/wordprocessingDrawing" xmlns:wp="http://schemas.openxmlformats.org/drawingml/2006/wordprocessingDrawing" xmlns:w10="urn:schemas-microsoft-com:office:word" xmlns:w="http://schemas.openxmlformats.org/wordprocessingml/2006/main" xmlns:w14="http://schemas.microsoft.com/office/word/2010/wordml" xmlns:w15="http://schemas.microsoft.com/office/word/2012/wordml" xmlns:w16cex="http://schemas.microsoft.com/office/word/2018/wordml/cex" xmlns:w16cid="http://schemas.microsoft.com/office/word/2016/wordml/cid" xmlns:w16="http://schemas.microsoft.com/office/word/2018/wordml" xmlns:w16du="http://schemas.microsoft.com/office/word/2023/wordml/word16du" xmlns:w16sdtdh="http://schemas.microsoft.com/office/word/2020/wordml/sdtdatahash" xmlns:w16se="http://schemas.microsoft.com/office/word/2015/wordml/symex" xmlns:wpg="http://schemas.microsoft.com/office/word/2010/wordprocessingGroup" xmlns:wpi="http://schemas.microsoft.com/office/word/2010/wordprocessingInk" xmlns:wne="http://schemas.microsoft.com/office/word/2006/wordml" xmlns:wps="http://schemas.microsoft.com/office/word/2010/wordprocessingShape" mc:Ignorable="w14 w15 w16se w16cid w16 w16cex w16sdtdh w16du wp14">
+<w:footnotes xmlns:wpc="http://schemas.microsoft.com/office/word/2010/wordprocessingCanvas" xmlns:cx="http://schemas.microsoft.com/office/drawing/2014/chartex" xmlns:cx1="http://schemas.microsoft.com/office/drawing/2015/9/8/chartex" xmlns:cx2="http://schemas.microsoft.com/office/drawing/2015/10/21/chartex" xmlns:cx3="http://schemas.microsoft.com/office/drawing/2016/5/9/chartex" xmlns:cx4="http://schemas.microsoft.com/office/drawing/2016/5/10/chartex" xmlns:cx5="http://schemas.microsoft.com/office/drawing/2016/5/11/chartex" xmlns:cx6="http://schemas.microsoft.com/office/drawing/2016/5/12/chartex" xmlns:cx7="http://schemas.microsoft.com/office/drawing/2016/5/13/chartex" xmlns:cx8="http://schemas.microsoft.com/office/drawing/2016/5/14/chartex" xmlns:mc="http://schemas.openxmlformats.org/markup-compatibility/2006" xmlns:aink="http://schemas.microsoft.com/office/drawing/2016/ink" xmlns:am3d="http://schemas.microsoft.com/office/drawing/2017/model3d" xmlns:o="urn:schemas-microsoft-com:office:office" xmlns:oel="http://schemas.microsoft.com/office/2019/extlst" xmlns:r="http://schemas.openxmlformats.org/officeDocument/2006/relationships" xmlns:m="http://schemas.openxmlformats.org/officeDocument/2006/math" xmlns:v="urn:schemas-microsoft-com:vml" xmlns:wp14="http://schemas.microsoft.com/office/word/2010/wordprocessingDrawing" xmlns:wp="http://schemas.openxmlformats.org/drawingml/2006/wordprocessingDrawing" xmlns:w10="urn:schemas-microsoft-com:office:word" xmlns:w="http://schemas.openxmlformats.org/wordprocessingml/2006/main" xmlns:w14="http://schemas.microsoft.com/office/word/2010/wordml" xmlns:w15="http://schemas.microsoft.com/office/word/2012/wordml" xmlns:w16cex="http://schemas.microsoft.com/office/word/2018/wordml/cex" xmlns:w16cid="http://schemas.microsoft.com/office/word/2016/wordml/cid" xmlns:w16="http://schemas.microsoft.com/office/word/2018/wordml" xmlns:w16du="http://schemas.microsoft.com/office/word/2023/wordml/word16du" xmlns:w16sdtdh="http://schemas.microsoft.com/office/word/2020/wordml/sdtdatahash" xmlns:w16sdtfl="http://schemas.microsoft.com/office/word/2024/wordml/sdtformatlock" xmlns:w16se="http://schemas.microsoft.com/office/word/2015/wordml/symex" xmlns:wpg="http://schemas.microsoft.com/office/word/2010/wordprocessingGroup" xmlns:wpi="http://schemas.microsoft.com/office/word/2010/wordprocessingInk" xmlns:wne="http://schemas.microsoft.com/office/word/2006/wordml" xmlns:wps="http://schemas.microsoft.com/office/word/2010/wordprocessingShape" mc:Ignorable="w14 w15 w16se w16cid w16 w16cex w16sdtdh w16sdtfl w16du wp14">
   <w:footnote w:type="separator" w:id="-1">
     <w:p>
       <w:r>
@@ -9430,7 +10426,7 @@
 </file>
 
 <file path=word/numbering.xml><?xml version="1.0" encoding="utf-8"?>
-<w:numbering xmlns:wpc="http://schemas.microsoft.com/office/word/2010/wordprocessingCanvas" xmlns:cx="http://schemas.microsoft.com/office/drawing/2014/chartex" xmlns:cx1="http://schemas.microsoft.com/office/drawing/2015/9/8/chartex" xmlns:cx2="http://schemas.microsoft.com/office/drawing/2015/10/21/chartex" xmlns:cx3="http://schemas.microsoft.com/office/drawing/2016/5/9/chartex" xmlns:cx4="http://schemas.microsoft.com/office/drawing/2016/5/10/chartex" xmlns:cx5="http://schemas.microsoft.com/office/drawing/2016/5/11/chartex" xmlns:cx6="http://schemas.microsoft.com/office/drawing/2016/5/12/chartex" xmlns:cx7="http://schemas.microsoft.com/office/drawing/2016/5/13/chartex" xmlns:cx8="http://schemas.microsoft.com/office/drawing/2016/5/14/chartex" xmlns:mc="http://schemas.openxmlformats.org/markup-compatibility/2006" xmlns:aink="http://schemas.microsoft.com/office/drawing/2016/ink" xmlns:am3d="http://schemas.microsoft.com/office/drawing/2017/model3d" xmlns:o="urn:schemas-microsoft-com:office:office" xmlns:oel="http://schemas.microsoft.com/office/2019/extlst" xmlns:r="http://schemas.openxmlformats.org/officeDocument/2006/relationships" xmlns:m="http://schemas.openxmlformats.org/officeDocument/2006/math" xmlns:v="urn:schemas-microsoft-com:vml" xmlns:wp14="http://schemas.microsoft.com/office/word/2010/wordprocessingDrawing" xmlns:wp="http://schemas.openxmlformats.org/drawingml/2006/wordprocessingDrawing" xmlns:w10="urn:schemas-microsoft-com:office:word" xmlns:w="http://schemas.openxmlformats.org/wordprocessingml/2006/main" xmlns:w14="http://schemas.microsoft.com/office/word/2010/wordml" xmlns:w15="http://schemas.microsoft.com/office/word/2012/wordml" xmlns:w16cex="http://schemas.microsoft.com/office/word/2018/wordml/cex" xmlns:w16cid="http://schemas.microsoft.com/office/word/2016/wordml/cid" xmlns:w16="http://schemas.microsoft.com/office/word/2018/wordml" xmlns:w16du="http://schemas.microsoft.com/office/word/2023/wordml/word16du" xmlns:w16sdtdh="http://schemas.microsoft.com/office/word/2020/wordml/sdtdatahash" xmlns:w16se="http://schemas.microsoft.com/office/word/2015/wordml/symex" xmlns:wpg="http://schemas.microsoft.com/office/word/2010/wordprocessingGroup" xmlns:wpi="http://schemas.microsoft.com/office/word/2010/wordprocessingInk" xmlns:wne="http://schemas.microsoft.com/office/word/2006/wordml" xmlns:wps="http://schemas.microsoft.com/office/word/2010/wordprocessingShape" mc:Ignorable="w14 w15 w16se w16cid w16 w16cex w16sdtdh w16du wp14">
+<w:numbering xmlns:wpc="http://schemas.microsoft.com/office/word/2010/wordprocessingCanvas" xmlns:cx="http://schemas.microsoft.com/office/drawing/2014/chartex" xmlns:cx1="http://schemas.microsoft.com/office/drawing/2015/9/8/chartex" xmlns:cx2="http://schemas.microsoft.com/office/drawing/2015/10/21/chartex" xmlns:cx3="http://schemas.microsoft.com/office/drawing/2016/5/9/chartex" xmlns:cx4="http://schemas.microsoft.com/office/drawing/2016/5/10/chartex" xmlns:cx5="http://schemas.microsoft.com/office/drawing/2016/5/11/chartex" xmlns:cx6="http://schemas.microsoft.com/office/drawing/2016/5/12/chartex" xmlns:cx7="http://schemas.microsoft.com/office/drawing/2016/5/13/chartex" xmlns:cx8="http://schemas.microsoft.com/office/drawing/2016/5/14/chartex" xmlns:mc="http://schemas.openxmlformats.org/markup-compatibility/2006" xmlns:aink="http://schemas.microsoft.com/office/drawing/2016/ink" xmlns:am3d="http://schemas.microsoft.com/office/drawing/2017/model3d" xmlns:o="urn:schemas-microsoft-com:office:office" xmlns:oel="http://schemas.microsoft.com/office/2019/extlst" xmlns:r="http://schemas.openxmlformats.org/officeDocument/2006/relationships" xmlns:m="http://schemas.openxmlformats.org/officeDocument/2006/math" xmlns:v="urn:schemas-microsoft-com:vml" xmlns:wp14="http://schemas.microsoft.com/office/word/2010/wordprocessingDrawing" xmlns:wp="http://schemas.openxmlformats.org/drawingml/2006/wordprocessingDrawing" xmlns:w10="urn:schemas-microsoft-com:office:word" xmlns:w="http://schemas.openxmlformats.org/wordprocessingml/2006/main" xmlns:w14="http://schemas.microsoft.com/office/word/2010/wordml" xmlns:w15="http://schemas.microsoft.com/office/word/2012/wordml" xmlns:w16cex="http://schemas.microsoft.com/office/word/2018/wordml/cex" xmlns:w16cid="http://schemas.microsoft.com/office/word/2016/wordml/cid" xmlns:w16="http://schemas.microsoft.com/office/word/2018/wordml" xmlns:w16du="http://schemas.microsoft.com/office/word/2023/wordml/word16du" xmlns:w16sdtdh="http://schemas.microsoft.com/office/word/2020/wordml/sdtdatahash" xmlns:w16sdtfl="http://schemas.microsoft.com/office/word/2024/wordml/sdtformatlock" xmlns:w16se="http://schemas.microsoft.com/office/word/2015/wordml/symex" xmlns:wpg="http://schemas.microsoft.com/office/word/2010/wordprocessingGroup" xmlns:wpi="http://schemas.microsoft.com/office/word/2010/wordprocessingInk" xmlns:wne="http://schemas.microsoft.com/office/word/2006/wordml" xmlns:wps="http://schemas.microsoft.com/office/word/2010/wordprocessingShape" mc:Ignorable="w14 w15 w16se w16cid w16 w16cex w16sdtdh w16sdtfl w16du wp14">
   <w:abstractNum w:abstractNumId="0" w15:restartNumberingAfterBreak="0">
     <w:nsid w:val="04320FC4"/>
     <w:multiLevelType w:val="hybridMultilevel"/>
@@ -10361,8 +11357,8 @@
   <w:abstractNum w:abstractNumId="10" w15:restartNumberingAfterBreak="0">
     <w:nsid w:val="3E3E00D1"/>
     <w:multiLevelType w:val="hybridMultilevel"/>
-    <w:tmpl w:val="232CD3C2"/>
-    <w:lvl w:ilvl="0" w:tplc="A628E5D0">
+    <w:tmpl w:val="023ADC26"/>
+    <w:lvl w:ilvl="0" w:tplc="4552DF5A">
       <w:start w:val="1"/>
       <w:numFmt w:val="decimal"/>
       <w:lvlText w:val="Section %1:"/>
@@ -10377,6 +11373,8 @@
         <w:rFonts w:hint="default"/>
         <w:b/>
         <w:bCs/>
+        <w:dstrike w:val="0"/>
+        <w:color w:val="auto"/>
       </w:rPr>
     </w:lvl>
     <w:lvl w:ilvl="1" w:tplc="FFFFFFFF" w:tentative="1">
@@ -11320,7 +12318,7 @@
 </file>
 
 <file path=word/styles.xml><?xml version="1.0" encoding="utf-8"?>
-<w:styles xmlns:mc="http://schemas.openxmlformats.org/markup-compatibility/2006" xmlns:r="http://schemas.openxmlformats.org/officeDocument/2006/relationships" xmlns:w="http://schemas.openxmlformats.org/wordprocessingml/2006/main" xmlns:w14="http://schemas.microsoft.com/office/word/2010/wordml" xmlns:w15="http://schemas.microsoft.com/office/word/2012/wordml" xmlns:w16cex="http://schemas.microsoft.com/office/word/2018/wordml/cex" xmlns:w16cid="http://schemas.microsoft.com/office/word/2016/wordml/cid" xmlns:w16="http://schemas.microsoft.com/office/word/2018/wordml" xmlns:w16du="http://schemas.microsoft.com/office/word/2023/wordml/word16du" xmlns:w16sdtdh="http://schemas.microsoft.com/office/word/2020/wordml/sdtdatahash" xmlns:w16se="http://schemas.microsoft.com/office/word/2015/wordml/symex" mc:Ignorable="w14 w15 w16se w16cid w16 w16cex w16sdtdh w16du">
+<w:styles xmlns:mc="http://schemas.openxmlformats.org/markup-compatibility/2006" xmlns:r="http://schemas.openxmlformats.org/officeDocument/2006/relationships" xmlns:w="http://schemas.openxmlformats.org/wordprocessingml/2006/main" xmlns:w14="http://schemas.microsoft.com/office/word/2010/wordml" xmlns:w15="http://schemas.microsoft.com/office/word/2012/wordml" xmlns:w16cex="http://schemas.microsoft.com/office/word/2018/wordml/cex" xmlns:w16cid="http://schemas.microsoft.com/office/word/2016/wordml/cid" xmlns:w16="http://schemas.microsoft.com/office/word/2018/wordml" xmlns:w16du="http://schemas.microsoft.com/office/word/2023/wordml/word16du" xmlns:w16sdtdh="http://schemas.microsoft.com/office/word/2020/wordml/sdtdatahash" xmlns:w16sdtfl="http://schemas.microsoft.com/office/word/2024/wordml/sdtformatlock" xmlns:w16se="http://schemas.microsoft.com/office/word/2015/wordml/symex" mc:Ignorable="w14 w15 w16se w16cid w16 w16cex w16sdtdh w16sdtfl w16du">
   <w:docDefaults>
     <w:rPrDefault>
       <w:rPr>
@@ -11948,7 +12946,6 @@
   <w:style w:type="character" w:default="1" w:styleId="DefaultParagraphFont">
     <w:name w:val="Default Paragraph Font"/>
     <w:uiPriority w:val="1"/>
-    <w:semiHidden/>
     <w:unhideWhenUsed/>
   </w:style>
   <w:style w:type="table" w:default="1" w:styleId="TableNormal">

</xml_diff>

<commit_message>
Changed Article 6 to convert red text to automatic since it was approved in the review
Signed-off-by: frothbeast <frothbeast@gmail.com>
</commit_message>
<xml_diff>
--- a/Union bylaws.docx
+++ b/Union bylaws.docx
@@ -1,6 +1,6 @@
 
 <file path=word/document.xml><?xml version="1.0" encoding="utf-8"?>
-<w:document xmlns:wpc="http://schemas.microsoft.com/office/word/2010/wordprocessingCanvas" xmlns:cx="http://schemas.microsoft.com/office/drawing/2014/chartex" xmlns:cx1="http://schemas.microsoft.com/office/drawing/2015/9/8/chartex" xmlns:cx2="http://schemas.microsoft.com/office/drawing/2015/10/21/chartex" xmlns:cx3="http://schemas.microsoft.com/office/drawing/2016/5/9/chartex" xmlns:cx4="http://schemas.microsoft.com/office/drawing/2016/5/10/chartex" xmlns:cx5="http://schemas.microsoft.com/office/drawing/2016/5/11/chartex" xmlns:cx6="http://schemas.microsoft.com/office/drawing/2016/5/12/chartex" xmlns:cx7="http://schemas.microsoft.com/office/drawing/2016/5/13/chartex" xmlns:cx8="http://schemas.microsoft.com/office/drawing/2016/5/14/chartex" xmlns:mc="http://schemas.openxmlformats.org/markup-compatibility/2006" xmlns:aink="http://schemas.microsoft.com/office/drawing/2016/ink" xmlns:am3d="http://schemas.microsoft.com/office/drawing/2017/model3d" xmlns:o="urn:schemas-microsoft-com:office:office" xmlns:oel="http://schemas.microsoft.com/office/2019/extlst" xmlns:r="http://schemas.openxmlformats.org/officeDocument/2006/relationships" xmlns:m="http://schemas.openxmlformats.org/officeDocument/2006/math" xmlns:v="urn:schemas-microsoft-com:vml" xmlns:wp14="http://schemas.microsoft.com/office/word/2010/wordprocessingDrawing" xmlns:wp="http://schemas.openxmlformats.org/drawingml/2006/wordprocessingDrawing" xmlns:w10="urn:schemas-microsoft-com:office:word" xmlns:w="http://schemas.openxmlformats.org/wordprocessingml/2006/main" xmlns:w14="http://schemas.microsoft.com/office/word/2010/wordml" xmlns:w15="http://schemas.microsoft.com/office/word/2012/wordml" xmlns:w16cex="http://schemas.microsoft.com/office/word/2018/wordml/cex" xmlns:w16cid="http://schemas.microsoft.com/office/word/2016/wordml/cid" xmlns:w16="http://schemas.microsoft.com/office/word/2018/wordml" xmlns:w16du="http://schemas.microsoft.com/office/word/2023/wordml/word16du" xmlns:w16sdtdh="http://schemas.microsoft.com/office/word/2020/wordml/sdtdatahash" xmlns:w16se="http://schemas.microsoft.com/office/word/2015/wordml/symex" xmlns:wpg="http://schemas.microsoft.com/office/word/2010/wordprocessingGroup" xmlns:wpi="http://schemas.microsoft.com/office/word/2010/wordprocessingInk" xmlns:wne="http://schemas.microsoft.com/office/word/2006/wordml" xmlns:wps="http://schemas.microsoft.com/office/word/2010/wordprocessingShape" mc:Ignorable="w14 w15 w16se w16cid w16 w16cex w16sdtdh w16du wp14">
+<w:document xmlns:wpc="http://schemas.microsoft.com/office/word/2010/wordprocessingCanvas" xmlns:cx="http://schemas.microsoft.com/office/drawing/2014/chartex" xmlns:cx1="http://schemas.microsoft.com/office/drawing/2015/9/8/chartex" xmlns:cx2="http://schemas.microsoft.com/office/drawing/2015/10/21/chartex" xmlns:cx3="http://schemas.microsoft.com/office/drawing/2016/5/9/chartex" xmlns:cx4="http://schemas.microsoft.com/office/drawing/2016/5/10/chartex" xmlns:cx5="http://schemas.microsoft.com/office/drawing/2016/5/11/chartex" xmlns:cx6="http://schemas.microsoft.com/office/drawing/2016/5/12/chartex" xmlns:cx7="http://schemas.microsoft.com/office/drawing/2016/5/13/chartex" xmlns:cx8="http://schemas.microsoft.com/office/drawing/2016/5/14/chartex" xmlns:mc="http://schemas.openxmlformats.org/markup-compatibility/2006" xmlns:aink="http://schemas.microsoft.com/office/drawing/2016/ink" xmlns:am3d="http://schemas.microsoft.com/office/drawing/2017/model3d" xmlns:o="urn:schemas-microsoft-com:office:office" xmlns:oel="http://schemas.microsoft.com/office/2019/extlst" xmlns:r="http://schemas.openxmlformats.org/officeDocument/2006/relationships" xmlns:m="http://schemas.openxmlformats.org/officeDocument/2006/math" xmlns:v="urn:schemas-microsoft-com:vml" xmlns:wp14="http://schemas.microsoft.com/office/word/2010/wordprocessingDrawing" xmlns:wp="http://schemas.openxmlformats.org/drawingml/2006/wordprocessingDrawing" xmlns:w10="urn:schemas-microsoft-com:office:word" xmlns:w="http://schemas.openxmlformats.org/wordprocessingml/2006/main" xmlns:w14="http://schemas.microsoft.com/office/word/2010/wordml" xmlns:w15="http://schemas.microsoft.com/office/word/2012/wordml" xmlns:w16cex="http://schemas.microsoft.com/office/word/2018/wordml/cex" xmlns:w16cid="http://schemas.microsoft.com/office/word/2016/wordml/cid" xmlns:w16="http://schemas.microsoft.com/office/word/2018/wordml" xmlns:w16du="http://schemas.microsoft.com/office/word/2023/wordml/word16du" xmlns:w16sdtdh="http://schemas.microsoft.com/office/word/2020/wordml/sdtdatahash" xmlns:w16sdtfl="http://schemas.microsoft.com/office/word/2024/wordml/sdtformatlock" xmlns:w16se="http://schemas.microsoft.com/office/word/2015/wordml/symex" xmlns:wpg="http://schemas.microsoft.com/office/word/2010/wordprocessingGroup" xmlns:wpi="http://schemas.microsoft.com/office/word/2010/wordprocessingInk" xmlns:wne="http://schemas.microsoft.com/office/word/2006/wordml" xmlns:wps="http://schemas.microsoft.com/office/word/2010/wordprocessingShape" mc:Ignorable="w14 w15 w16se w16cid w16 w16cex w16sdtdh w16sdtfl w16du wp14">
   <w:body>
     <w:p>
       <w:pPr>
@@ -3022,32 +3022,11 @@
       <w:r>
         <w:rPr>
           <w:rFonts w:ascii="Lato" w:hAnsi="Lato"/>
-          <w:color w:val="FF0000"/>
-          <w:sz w:val="20"/>
-          <w:szCs w:val="20"/>
-          <w:lang w:val="en-US"/>
-        </w:rPr>
-        <w:t>G</w:t>
-      </w:r>
-      <w:r>
-        <w:rPr>
-          <w:rFonts w:ascii="Lato" w:hAnsi="Lato"/>
-          <w:color w:val="FF0000"/>
-          <w:sz w:val="20"/>
-          <w:szCs w:val="20"/>
-          <w:lang w:val="en-US"/>
-        </w:rPr>
-        <w:t xml:space="preserve">eneral membership meetings </w:t>
-      </w:r>
-      <w:r>
-        <w:rPr>
-          <w:rFonts w:ascii="Lato" w:hAnsi="Lato"/>
-          <w:color w:val="FF0000"/>
-          <w:sz w:val="20"/>
-          <w:szCs w:val="20"/>
-          <w:lang w:val="en-US"/>
-        </w:rPr>
-        <w:t xml:space="preserve">and </w:t>
+          <w:sz w:val="20"/>
+          <w:szCs w:val="20"/>
+          <w:lang w:val="en-US"/>
+        </w:rPr>
+        <w:t xml:space="preserve">General membership meetings and </w:t>
       </w:r>
       <w:r>
         <w:rPr>
@@ -5107,7 +5086,6 @@
           <w:szCs w:val="24"/>
           <w:lang w:val="en-US"/>
         </w:rPr>
-        <w:lastRenderedPageBreak/>
         <w:t>Article 13 - Membership Meetings and Quorums</w:t>
       </w:r>
     </w:p>
@@ -5501,6 +5479,7 @@
           <w:szCs w:val="24"/>
           <w:lang w:val="en-US"/>
         </w:rPr>
+        <w:lastRenderedPageBreak/>
         <w:t>Article 14 - Order of Business</w:t>
       </w:r>
     </w:p>
@@ -5771,7 +5750,6 @@
           <w:szCs w:val="24"/>
           <w:lang w:val="en-US"/>
         </w:rPr>
-        <w:lastRenderedPageBreak/>
         <w:t>Article 15</w:t>
       </w:r>
       <w:r>
@@ -6169,6 +6147,7 @@
           <w:szCs w:val="24"/>
           <w:lang w:val="en-US"/>
         </w:rPr>
+        <w:lastRenderedPageBreak/>
         <w:t>Article 17 - Sick and Visitation Committee</w:t>
       </w:r>
     </w:p>
@@ -6665,7 +6644,6 @@
           <w:szCs w:val="24"/>
           <w:lang w:val="en-US"/>
         </w:rPr>
-        <w:lastRenderedPageBreak/>
         <w:t>Article 18 - Bylaw Committee, Procedure and Amendments</w:t>
       </w:r>
     </w:p>
@@ -6852,7 +6830,27 @@
           <w:szCs w:val="20"/>
           <w:lang w:val="en-US"/>
         </w:rPr>
-        <w:t xml:space="preserve"> and it shall require a majority vote for adoption. </w:t>
+        <w:t xml:space="preserve"> and it </w:t>
+      </w:r>
+      <w:proofErr w:type="gramStart"/>
+      <w:r>
+        <w:rPr>
+          <w:rFonts w:ascii="Lato" w:hAnsi="Lato"/>
+          <w:sz w:val="20"/>
+          <w:szCs w:val="20"/>
+          <w:lang w:val="en-US"/>
+        </w:rPr>
+        <w:t>shall</w:t>
+      </w:r>
+      <w:proofErr w:type="gramEnd"/>
+      <w:r>
+        <w:rPr>
+          <w:rFonts w:ascii="Lato" w:hAnsi="Lato"/>
+          <w:sz w:val="20"/>
+          <w:szCs w:val="20"/>
+          <w:lang w:val="en-US"/>
+        </w:rPr>
+        <w:t xml:space="preserve"> require a majority vote for adoption. </w:t>
       </w:r>
     </w:p>
     <w:p>
@@ -6928,7 +6926,27 @@
           <w:szCs w:val="20"/>
           <w:lang w:val="en-US"/>
         </w:rPr>
-        <w:t xml:space="preserve"> may from time to time hereafter be altered or amended: and in the event of any conflict the constitution of the National Union Unifor-Canada shall govern.</w:t>
+        <w:t xml:space="preserve"> may from </w:t>
+      </w:r>
+      <w:proofErr w:type="gramStart"/>
+      <w:r>
+        <w:rPr>
+          <w:rFonts w:ascii="Lato" w:hAnsi="Lato"/>
+          <w:sz w:val="20"/>
+          <w:szCs w:val="20"/>
+          <w:lang w:val="en-US"/>
+        </w:rPr>
+        <w:t>time to time</w:t>
+      </w:r>
+      <w:proofErr w:type="gramEnd"/>
+      <w:r>
+        <w:rPr>
+          <w:rFonts w:ascii="Lato" w:hAnsi="Lato"/>
+          <w:sz w:val="20"/>
+          <w:szCs w:val="20"/>
+          <w:lang w:val="en-US"/>
+        </w:rPr>
+        <w:t xml:space="preserve"> hereafter be altered or amended: and in the event of any conflict the constitution of the National Union Unifor-Canada shall govern.</w:t>
       </w:r>
     </w:p>
     <w:p>
@@ -6971,6 +6989,7 @@
           <w:szCs w:val="24"/>
           <w:lang w:val="en-US"/>
         </w:rPr>
+        <w:lastRenderedPageBreak/>
         <w:t>Article 19 - Delegates from Local</w:t>
       </w:r>
     </w:p>
@@ -7111,7 +7130,6 @@
           <w:szCs w:val="24"/>
           <w:lang w:val="en-US"/>
         </w:rPr>
-        <w:lastRenderedPageBreak/>
         <w:t xml:space="preserve">Article 20 </w:t>
       </w:r>
       <w:r>
@@ -7920,6 +7938,7 @@
           <w:szCs w:val="24"/>
           <w:lang w:val="en-US"/>
         </w:rPr>
+        <w:lastRenderedPageBreak/>
         <w:t>Article 21 - Recall Procedure</w:t>
       </w:r>
     </w:p>
@@ -9313,7 +9332,7 @@
 </file>
 
 <file path=word/endnotes.xml><?xml version="1.0" encoding="utf-8"?>
-<w:endnotes xmlns:wpc="http://schemas.microsoft.com/office/word/2010/wordprocessingCanvas" xmlns:cx="http://schemas.microsoft.com/office/drawing/2014/chartex" xmlns:cx1="http://schemas.microsoft.com/office/drawing/2015/9/8/chartex" xmlns:cx2="http://schemas.microsoft.com/office/drawing/2015/10/21/chartex" xmlns:cx3="http://schemas.microsoft.com/office/drawing/2016/5/9/chartex" xmlns:cx4="http://schemas.microsoft.com/office/drawing/2016/5/10/chartex" xmlns:cx5="http://schemas.microsoft.com/office/drawing/2016/5/11/chartex" xmlns:cx6="http://schemas.microsoft.com/office/drawing/2016/5/12/chartex" xmlns:cx7="http://schemas.microsoft.com/office/drawing/2016/5/13/chartex" xmlns:cx8="http://schemas.microsoft.com/office/drawing/2016/5/14/chartex" xmlns:mc="http://schemas.openxmlformats.org/markup-compatibility/2006" xmlns:aink="http://schemas.microsoft.com/office/drawing/2016/ink" xmlns:am3d="http://schemas.microsoft.com/office/drawing/2017/model3d" xmlns:o="urn:schemas-microsoft-com:office:office" xmlns:oel="http://schemas.microsoft.com/office/2019/extlst" xmlns:r="http://schemas.openxmlformats.org/officeDocument/2006/relationships" xmlns:m="http://schemas.openxmlformats.org/officeDocument/2006/math" xmlns:v="urn:schemas-microsoft-com:vml" xmlns:wp14="http://schemas.microsoft.com/office/word/2010/wordprocessingDrawing" xmlns:wp="http://schemas.openxmlformats.org/drawingml/2006/wordprocessingDrawing" xmlns:w10="urn:schemas-microsoft-com:office:word" xmlns:w="http://schemas.openxmlformats.org/wordprocessingml/2006/main" xmlns:w14="http://schemas.microsoft.com/office/word/2010/wordml" xmlns:w15="http://schemas.microsoft.com/office/word/2012/wordml" xmlns:w16cex="http://schemas.microsoft.com/office/word/2018/wordml/cex" xmlns:w16cid="http://schemas.microsoft.com/office/word/2016/wordml/cid" xmlns:w16="http://schemas.microsoft.com/office/word/2018/wordml" xmlns:w16du="http://schemas.microsoft.com/office/word/2023/wordml/word16du" xmlns:w16sdtdh="http://schemas.microsoft.com/office/word/2020/wordml/sdtdatahash" xmlns:w16se="http://schemas.microsoft.com/office/word/2015/wordml/symex" xmlns:wpg="http://schemas.microsoft.com/office/word/2010/wordprocessingGroup" xmlns:wpi="http://schemas.microsoft.com/office/word/2010/wordprocessingInk" xmlns:wne="http://schemas.microsoft.com/office/word/2006/wordml" xmlns:wps="http://schemas.microsoft.com/office/word/2010/wordprocessingShape" mc:Ignorable="w14 w15 w16se w16cid w16 w16cex w16sdtdh w16du wp14">
+<w:endnotes xmlns:wpc="http://schemas.microsoft.com/office/word/2010/wordprocessingCanvas" xmlns:cx="http://schemas.microsoft.com/office/drawing/2014/chartex" xmlns:cx1="http://schemas.microsoft.com/office/drawing/2015/9/8/chartex" xmlns:cx2="http://schemas.microsoft.com/office/drawing/2015/10/21/chartex" xmlns:cx3="http://schemas.microsoft.com/office/drawing/2016/5/9/chartex" xmlns:cx4="http://schemas.microsoft.com/office/drawing/2016/5/10/chartex" xmlns:cx5="http://schemas.microsoft.com/office/drawing/2016/5/11/chartex" xmlns:cx6="http://schemas.microsoft.com/office/drawing/2016/5/12/chartex" xmlns:cx7="http://schemas.microsoft.com/office/drawing/2016/5/13/chartex" xmlns:cx8="http://schemas.microsoft.com/office/drawing/2016/5/14/chartex" xmlns:mc="http://schemas.openxmlformats.org/markup-compatibility/2006" xmlns:aink="http://schemas.microsoft.com/office/drawing/2016/ink" xmlns:am3d="http://schemas.microsoft.com/office/drawing/2017/model3d" xmlns:o="urn:schemas-microsoft-com:office:office" xmlns:oel="http://schemas.microsoft.com/office/2019/extlst" xmlns:r="http://schemas.openxmlformats.org/officeDocument/2006/relationships" xmlns:m="http://schemas.openxmlformats.org/officeDocument/2006/math" xmlns:v="urn:schemas-microsoft-com:vml" xmlns:wp14="http://schemas.microsoft.com/office/word/2010/wordprocessingDrawing" xmlns:wp="http://schemas.openxmlformats.org/drawingml/2006/wordprocessingDrawing" xmlns:w10="urn:schemas-microsoft-com:office:word" xmlns:w="http://schemas.openxmlformats.org/wordprocessingml/2006/main" xmlns:w14="http://schemas.microsoft.com/office/word/2010/wordml" xmlns:w15="http://schemas.microsoft.com/office/word/2012/wordml" xmlns:w16cex="http://schemas.microsoft.com/office/word/2018/wordml/cex" xmlns:w16cid="http://schemas.microsoft.com/office/word/2016/wordml/cid" xmlns:w16="http://schemas.microsoft.com/office/word/2018/wordml" xmlns:w16du="http://schemas.microsoft.com/office/word/2023/wordml/word16du" xmlns:w16sdtdh="http://schemas.microsoft.com/office/word/2020/wordml/sdtdatahash" xmlns:w16sdtfl="http://schemas.microsoft.com/office/word/2024/wordml/sdtformatlock" xmlns:w16se="http://schemas.microsoft.com/office/word/2015/wordml/symex" xmlns:wpg="http://schemas.microsoft.com/office/word/2010/wordprocessingGroup" xmlns:wpi="http://schemas.microsoft.com/office/word/2010/wordprocessingInk" xmlns:wne="http://schemas.microsoft.com/office/word/2006/wordml" xmlns:wps="http://schemas.microsoft.com/office/word/2010/wordprocessingShape" mc:Ignorable="w14 w15 w16se w16cid w16 w16cex w16sdtdh w16sdtfl w16du wp14">
   <w:endnote w:type="separator" w:id="-1">
     <w:p>
       <w:r>
@@ -9332,7 +9351,7 @@
 </file>
 
 <file path=word/footer1.xml><?xml version="1.0" encoding="utf-8"?>
-<w:ftr xmlns:wpc="http://schemas.microsoft.com/office/word/2010/wordprocessingCanvas" xmlns:cx="http://schemas.microsoft.com/office/drawing/2014/chartex" xmlns:cx1="http://schemas.microsoft.com/office/drawing/2015/9/8/chartex" xmlns:cx2="http://schemas.microsoft.com/office/drawing/2015/10/21/chartex" xmlns:cx3="http://schemas.microsoft.com/office/drawing/2016/5/9/chartex" xmlns:cx4="http://schemas.microsoft.com/office/drawing/2016/5/10/chartex" xmlns:cx5="http://schemas.microsoft.com/office/drawing/2016/5/11/chartex" xmlns:cx6="http://schemas.microsoft.com/office/drawing/2016/5/12/chartex" xmlns:cx7="http://schemas.microsoft.com/office/drawing/2016/5/13/chartex" xmlns:cx8="http://schemas.microsoft.com/office/drawing/2016/5/14/chartex" xmlns:mc="http://schemas.openxmlformats.org/markup-compatibility/2006" xmlns:aink="http://schemas.microsoft.com/office/drawing/2016/ink" xmlns:am3d="http://schemas.microsoft.com/office/drawing/2017/model3d" xmlns:o="urn:schemas-microsoft-com:office:office" xmlns:oel="http://schemas.microsoft.com/office/2019/extlst" xmlns:r="http://schemas.openxmlformats.org/officeDocument/2006/relationships" xmlns:m="http://schemas.openxmlformats.org/officeDocument/2006/math" xmlns:v="urn:schemas-microsoft-com:vml" xmlns:wp14="http://schemas.microsoft.com/office/word/2010/wordprocessingDrawing" xmlns:wp="http://schemas.openxmlformats.org/drawingml/2006/wordprocessingDrawing" xmlns:w10="urn:schemas-microsoft-com:office:word" xmlns:w="http://schemas.openxmlformats.org/wordprocessingml/2006/main" xmlns:w14="http://schemas.microsoft.com/office/word/2010/wordml" xmlns:w15="http://schemas.microsoft.com/office/word/2012/wordml" xmlns:w16cex="http://schemas.microsoft.com/office/word/2018/wordml/cex" xmlns:w16cid="http://schemas.microsoft.com/office/word/2016/wordml/cid" xmlns:w16="http://schemas.microsoft.com/office/word/2018/wordml" xmlns:w16du="http://schemas.microsoft.com/office/word/2023/wordml/word16du" xmlns:w16sdtdh="http://schemas.microsoft.com/office/word/2020/wordml/sdtdatahash" xmlns:w16se="http://schemas.microsoft.com/office/word/2015/wordml/symex" xmlns:wpg="http://schemas.microsoft.com/office/word/2010/wordprocessingGroup" xmlns:wpi="http://schemas.microsoft.com/office/word/2010/wordprocessingInk" xmlns:wne="http://schemas.microsoft.com/office/word/2006/wordml" xmlns:wps="http://schemas.microsoft.com/office/word/2010/wordprocessingShape" mc:Ignorable="w14 w15 w16se w16cid w16 w16cex w16sdtdh w16du wp14">
+<w:ftr xmlns:wpc="http://schemas.microsoft.com/office/word/2010/wordprocessingCanvas" xmlns:cx="http://schemas.microsoft.com/office/drawing/2014/chartex" xmlns:cx1="http://schemas.microsoft.com/office/drawing/2015/9/8/chartex" xmlns:cx2="http://schemas.microsoft.com/office/drawing/2015/10/21/chartex" xmlns:cx3="http://schemas.microsoft.com/office/drawing/2016/5/9/chartex" xmlns:cx4="http://schemas.microsoft.com/office/drawing/2016/5/10/chartex" xmlns:cx5="http://schemas.microsoft.com/office/drawing/2016/5/11/chartex" xmlns:cx6="http://schemas.microsoft.com/office/drawing/2016/5/12/chartex" xmlns:cx7="http://schemas.microsoft.com/office/drawing/2016/5/13/chartex" xmlns:cx8="http://schemas.microsoft.com/office/drawing/2016/5/14/chartex" xmlns:mc="http://schemas.openxmlformats.org/markup-compatibility/2006" xmlns:aink="http://schemas.microsoft.com/office/drawing/2016/ink" xmlns:am3d="http://schemas.microsoft.com/office/drawing/2017/model3d" xmlns:o="urn:schemas-microsoft-com:office:office" xmlns:oel="http://schemas.microsoft.com/office/2019/extlst" xmlns:r="http://schemas.openxmlformats.org/officeDocument/2006/relationships" xmlns:m="http://schemas.openxmlformats.org/officeDocument/2006/math" xmlns:v="urn:schemas-microsoft-com:vml" xmlns:wp14="http://schemas.microsoft.com/office/word/2010/wordprocessingDrawing" xmlns:wp="http://schemas.openxmlformats.org/drawingml/2006/wordprocessingDrawing" xmlns:w10="urn:schemas-microsoft-com:office:word" xmlns:w="http://schemas.openxmlformats.org/wordprocessingml/2006/main" xmlns:w14="http://schemas.microsoft.com/office/word/2010/wordml" xmlns:w15="http://schemas.microsoft.com/office/word/2012/wordml" xmlns:w16cex="http://schemas.microsoft.com/office/word/2018/wordml/cex" xmlns:w16cid="http://schemas.microsoft.com/office/word/2016/wordml/cid" xmlns:w16="http://schemas.microsoft.com/office/word/2018/wordml" xmlns:w16du="http://schemas.microsoft.com/office/word/2023/wordml/word16du" xmlns:w16sdtdh="http://schemas.microsoft.com/office/word/2020/wordml/sdtdatahash" xmlns:w16sdtfl="http://schemas.microsoft.com/office/word/2024/wordml/sdtformatlock" xmlns:w16se="http://schemas.microsoft.com/office/word/2015/wordml/symex" xmlns:wpg="http://schemas.microsoft.com/office/word/2010/wordprocessingGroup" xmlns:wpi="http://schemas.microsoft.com/office/word/2010/wordprocessingInk" xmlns:wne="http://schemas.microsoft.com/office/word/2006/wordml" xmlns:wps="http://schemas.microsoft.com/office/word/2010/wordprocessingShape" mc:Ignorable="w14 w15 w16se w16cid w16 w16cex w16sdtdh w16sdtfl w16du wp14">
   <w:sdt>
     <w:sdtPr>
       <w:id w:val="-2068255027"/>
@@ -9476,7 +9495,7 @@
 </file>
 
 <file path=word/footnotes.xml><?xml version="1.0" encoding="utf-8"?>
-<w:footnotes xmlns:wpc="http://schemas.microsoft.com/office/word/2010/wordprocessingCanvas" xmlns:cx="http://schemas.microsoft.com/office/drawing/2014/chartex" xmlns:cx1="http://schemas.microsoft.com/office/drawing/2015/9/8/chartex" xmlns:cx2="http://schemas.microsoft.com/office/drawing/2015/10/21/chartex" xmlns:cx3="http://schemas.microsoft.com/office/drawing/2016/5/9/chartex" xmlns:cx4="http://schemas.microsoft.com/office/drawing/2016/5/10/chartex" xmlns:cx5="http://schemas.microsoft.com/office/drawing/2016/5/11/chartex" xmlns:cx6="http://schemas.microsoft.com/office/drawing/2016/5/12/chartex" xmlns:cx7="http://schemas.microsoft.com/office/drawing/2016/5/13/chartex" xmlns:cx8="http://schemas.microsoft.com/office/drawing/2016/5/14/chartex" xmlns:mc="http://schemas.openxmlformats.org/markup-compatibility/2006" xmlns:aink="http://schemas.microsoft.com/office/drawing/2016/ink" xmlns:am3d="http://schemas.microsoft.com/office/drawing/2017/model3d" xmlns:o="urn:schemas-microsoft-com:office:office" xmlns:oel="http://schemas.microsoft.com/office/2019/extlst" xmlns:r="http://schemas.openxmlformats.org/officeDocument/2006/relationships" xmlns:m="http://schemas.openxmlformats.org/officeDocument/2006/math" xmlns:v="urn:schemas-microsoft-com:vml" xmlns:wp14="http://schemas.microsoft.com/office/word/2010/wordprocessingDrawing" xmlns:wp="http://schemas.openxmlformats.org/drawingml/2006/wordprocessingDrawing" xmlns:w10="urn:schemas-microsoft-com:office:word" xmlns:w="http://schemas.openxmlformats.org/wordprocessingml/2006/main" xmlns:w14="http://schemas.microsoft.com/office/word/2010/wordml" xmlns:w15="http://schemas.microsoft.com/office/word/2012/wordml" xmlns:w16cex="http://schemas.microsoft.com/office/word/2018/wordml/cex" xmlns:w16cid="http://schemas.microsoft.com/office/word/2016/wordml/cid" xmlns:w16="http://schemas.microsoft.com/office/word/2018/wordml" xmlns:w16du="http://schemas.microsoft.com/office/word/2023/wordml/word16du" xmlns:w16sdtdh="http://schemas.microsoft.com/office/word/2020/wordml/sdtdatahash" xmlns:w16se="http://schemas.microsoft.com/office/word/2015/wordml/symex" xmlns:wpg="http://schemas.microsoft.com/office/word/2010/wordprocessingGroup" xmlns:wpi="http://schemas.microsoft.com/office/word/2010/wordprocessingInk" xmlns:wne="http://schemas.microsoft.com/office/word/2006/wordml" xmlns:wps="http://schemas.microsoft.com/office/word/2010/wordprocessingShape" mc:Ignorable="w14 w15 w16se w16cid w16 w16cex w16sdtdh w16du wp14">
+<w:footnotes xmlns:wpc="http://schemas.microsoft.com/office/word/2010/wordprocessingCanvas" xmlns:cx="http://schemas.microsoft.com/office/drawing/2014/chartex" xmlns:cx1="http://schemas.microsoft.com/office/drawing/2015/9/8/chartex" xmlns:cx2="http://schemas.microsoft.com/office/drawing/2015/10/21/chartex" xmlns:cx3="http://schemas.microsoft.com/office/drawing/2016/5/9/chartex" xmlns:cx4="http://schemas.microsoft.com/office/drawing/2016/5/10/chartex" xmlns:cx5="http://schemas.microsoft.com/office/drawing/2016/5/11/chartex" xmlns:cx6="http://schemas.microsoft.com/office/drawing/2016/5/12/chartex" xmlns:cx7="http://schemas.microsoft.com/office/drawing/2016/5/13/chartex" xmlns:cx8="http://schemas.microsoft.com/office/drawing/2016/5/14/chartex" xmlns:mc="http://schemas.openxmlformats.org/markup-compatibility/2006" xmlns:aink="http://schemas.microsoft.com/office/drawing/2016/ink" xmlns:am3d="http://schemas.microsoft.com/office/drawing/2017/model3d" xmlns:o="urn:schemas-microsoft-com:office:office" xmlns:oel="http://schemas.microsoft.com/office/2019/extlst" xmlns:r="http://schemas.openxmlformats.org/officeDocument/2006/relationships" xmlns:m="http://schemas.openxmlformats.org/officeDocument/2006/math" xmlns:v="urn:schemas-microsoft-com:vml" xmlns:wp14="http://schemas.microsoft.com/office/word/2010/wordprocessingDrawing" xmlns:wp="http://schemas.openxmlformats.org/drawingml/2006/wordprocessingDrawing" xmlns:w10="urn:schemas-microsoft-com:office:word" xmlns:w="http://schemas.openxmlformats.org/wordprocessingml/2006/main" xmlns:w14="http://schemas.microsoft.com/office/word/2010/wordml" xmlns:w15="http://schemas.microsoft.com/office/word/2012/wordml" xmlns:w16cex="http://schemas.microsoft.com/office/word/2018/wordml/cex" xmlns:w16cid="http://schemas.microsoft.com/office/word/2016/wordml/cid" xmlns:w16="http://schemas.microsoft.com/office/word/2018/wordml" xmlns:w16du="http://schemas.microsoft.com/office/word/2023/wordml/word16du" xmlns:w16sdtdh="http://schemas.microsoft.com/office/word/2020/wordml/sdtdatahash" xmlns:w16sdtfl="http://schemas.microsoft.com/office/word/2024/wordml/sdtformatlock" xmlns:w16se="http://schemas.microsoft.com/office/word/2015/wordml/symex" xmlns:wpg="http://schemas.microsoft.com/office/word/2010/wordprocessingGroup" xmlns:wpi="http://schemas.microsoft.com/office/word/2010/wordprocessingInk" xmlns:wne="http://schemas.microsoft.com/office/word/2006/wordml" xmlns:wps="http://schemas.microsoft.com/office/word/2010/wordprocessingShape" mc:Ignorable="w14 w15 w16se w16cid w16 w16cex w16sdtdh w16sdtfl w16du wp14">
   <w:footnote w:type="separator" w:id="-1">
     <w:p>
       <w:r>
@@ -9495,7 +9514,7 @@
 </file>
 
 <file path=word/numbering.xml><?xml version="1.0" encoding="utf-8"?>
-<w:numbering xmlns:wpc="http://schemas.microsoft.com/office/word/2010/wordprocessingCanvas" xmlns:cx="http://schemas.microsoft.com/office/drawing/2014/chartex" xmlns:cx1="http://schemas.microsoft.com/office/drawing/2015/9/8/chartex" xmlns:cx2="http://schemas.microsoft.com/office/drawing/2015/10/21/chartex" xmlns:cx3="http://schemas.microsoft.com/office/drawing/2016/5/9/chartex" xmlns:cx4="http://schemas.microsoft.com/office/drawing/2016/5/10/chartex" xmlns:cx5="http://schemas.microsoft.com/office/drawing/2016/5/11/chartex" xmlns:cx6="http://schemas.microsoft.com/office/drawing/2016/5/12/chartex" xmlns:cx7="http://schemas.microsoft.com/office/drawing/2016/5/13/chartex" xmlns:cx8="http://schemas.microsoft.com/office/drawing/2016/5/14/chartex" xmlns:mc="http://schemas.openxmlformats.org/markup-compatibility/2006" xmlns:aink="http://schemas.microsoft.com/office/drawing/2016/ink" xmlns:am3d="http://schemas.microsoft.com/office/drawing/2017/model3d" xmlns:o="urn:schemas-microsoft-com:office:office" xmlns:oel="http://schemas.microsoft.com/office/2019/extlst" xmlns:r="http://schemas.openxmlformats.org/officeDocument/2006/relationships" xmlns:m="http://schemas.openxmlformats.org/officeDocument/2006/math" xmlns:v="urn:schemas-microsoft-com:vml" xmlns:wp14="http://schemas.microsoft.com/office/word/2010/wordprocessingDrawing" xmlns:wp="http://schemas.openxmlformats.org/drawingml/2006/wordprocessingDrawing" xmlns:w10="urn:schemas-microsoft-com:office:word" xmlns:w="http://schemas.openxmlformats.org/wordprocessingml/2006/main" xmlns:w14="http://schemas.microsoft.com/office/word/2010/wordml" xmlns:w15="http://schemas.microsoft.com/office/word/2012/wordml" xmlns:w16cex="http://schemas.microsoft.com/office/word/2018/wordml/cex" xmlns:w16cid="http://schemas.microsoft.com/office/word/2016/wordml/cid" xmlns:w16="http://schemas.microsoft.com/office/word/2018/wordml" xmlns:w16du="http://schemas.microsoft.com/office/word/2023/wordml/word16du" xmlns:w16sdtdh="http://schemas.microsoft.com/office/word/2020/wordml/sdtdatahash" xmlns:w16se="http://schemas.microsoft.com/office/word/2015/wordml/symex" xmlns:wpg="http://schemas.microsoft.com/office/word/2010/wordprocessingGroup" xmlns:wpi="http://schemas.microsoft.com/office/word/2010/wordprocessingInk" xmlns:wne="http://schemas.microsoft.com/office/word/2006/wordml" xmlns:wps="http://schemas.microsoft.com/office/word/2010/wordprocessingShape" mc:Ignorable="w14 w15 w16se w16cid w16 w16cex w16sdtdh w16du wp14">
+<w:numbering xmlns:wpc="http://schemas.microsoft.com/office/word/2010/wordprocessingCanvas" xmlns:cx="http://schemas.microsoft.com/office/drawing/2014/chartex" xmlns:cx1="http://schemas.microsoft.com/office/drawing/2015/9/8/chartex" xmlns:cx2="http://schemas.microsoft.com/office/drawing/2015/10/21/chartex" xmlns:cx3="http://schemas.microsoft.com/office/drawing/2016/5/9/chartex" xmlns:cx4="http://schemas.microsoft.com/office/drawing/2016/5/10/chartex" xmlns:cx5="http://schemas.microsoft.com/office/drawing/2016/5/11/chartex" xmlns:cx6="http://schemas.microsoft.com/office/drawing/2016/5/12/chartex" xmlns:cx7="http://schemas.microsoft.com/office/drawing/2016/5/13/chartex" xmlns:cx8="http://schemas.microsoft.com/office/drawing/2016/5/14/chartex" xmlns:mc="http://schemas.openxmlformats.org/markup-compatibility/2006" xmlns:aink="http://schemas.microsoft.com/office/drawing/2016/ink" xmlns:am3d="http://schemas.microsoft.com/office/drawing/2017/model3d" xmlns:o="urn:schemas-microsoft-com:office:office" xmlns:oel="http://schemas.microsoft.com/office/2019/extlst" xmlns:r="http://schemas.openxmlformats.org/officeDocument/2006/relationships" xmlns:m="http://schemas.openxmlformats.org/officeDocument/2006/math" xmlns:v="urn:schemas-microsoft-com:vml" xmlns:wp14="http://schemas.microsoft.com/office/word/2010/wordprocessingDrawing" xmlns:wp="http://schemas.openxmlformats.org/drawingml/2006/wordprocessingDrawing" xmlns:w10="urn:schemas-microsoft-com:office:word" xmlns:w="http://schemas.openxmlformats.org/wordprocessingml/2006/main" xmlns:w14="http://schemas.microsoft.com/office/word/2010/wordml" xmlns:w15="http://schemas.microsoft.com/office/word/2012/wordml" xmlns:w16cex="http://schemas.microsoft.com/office/word/2018/wordml/cex" xmlns:w16cid="http://schemas.microsoft.com/office/word/2016/wordml/cid" xmlns:w16="http://schemas.microsoft.com/office/word/2018/wordml" xmlns:w16du="http://schemas.microsoft.com/office/word/2023/wordml/word16du" xmlns:w16sdtdh="http://schemas.microsoft.com/office/word/2020/wordml/sdtdatahash" xmlns:w16sdtfl="http://schemas.microsoft.com/office/word/2024/wordml/sdtformatlock" xmlns:w16se="http://schemas.microsoft.com/office/word/2015/wordml/symex" xmlns:wpg="http://schemas.microsoft.com/office/word/2010/wordprocessingGroup" xmlns:wpi="http://schemas.microsoft.com/office/word/2010/wordprocessingInk" xmlns:wne="http://schemas.microsoft.com/office/word/2006/wordml" xmlns:wps="http://schemas.microsoft.com/office/word/2010/wordprocessingShape" mc:Ignorable="w14 w15 w16se w16cid w16 w16cex w16sdtdh w16sdtfl w16du wp14">
   <w:abstractNum w:abstractNumId="0" w15:restartNumberingAfterBreak="0">
     <w:nsid w:val="04320FC4"/>
     <w:multiLevelType w:val="hybridMultilevel"/>
@@ -11385,7 +11404,7 @@
 </file>
 
 <file path=word/styles.xml><?xml version="1.0" encoding="utf-8"?>
-<w:styles xmlns:mc="http://schemas.openxmlformats.org/markup-compatibility/2006" xmlns:r="http://schemas.openxmlformats.org/officeDocument/2006/relationships" xmlns:w="http://schemas.openxmlformats.org/wordprocessingml/2006/main" xmlns:w14="http://schemas.microsoft.com/office/word/2010/wordml" xmlns:w15="http://schemas.microsoft.com/office/word/2012/wordml" xmlns:w16cex="http://schemas.microsoft.com/office/word/2018/wordml/cex" xmlns:w16cid="http://schemas.microsoft.com/office/word/2016/wordml/cid" xmlns:w16="http://schemas.microsoft.com/office/word/2018/wordml" xmlns:w16du="http://schemas.microsoft.com/office/word/2023/wordml/word16du" xmlns:w16sdtdh="http://schemas.microsoft.com/office/word/2020/wordml/sdtdatahash" xmlns:w16se="http://schemas.microsoft.com/office/word/2015/wordml/symex" mc:Ignorable="w14 w15 w16se w16cid w16 w16cex w16sdtdh w16du">
+<w:styles xmlns:mc="http://schemas.openxmlformats.org/markup-compatibility/2006" xmlns:r="http://schemas.openxmlformats.org/officeDocument/2006/relationships" xmlns:w="http://schemas.openxmlformats.org/wordprocessingml/2006/main" xmlns:w14="http://schemas.microsoft.com/office/word/2010/wordml" xmlns:w15="http://schemas.microsoft.com/office/word/2012/wordml" xmlns:w16cex="http://schemas.microsoft.com/office/word/2018/wordml/cex" xmlns:w16cid="http://schemas.microsoft.com/office/word/2016/wordml/cid" xmlns:w16="http://schemas.microsoft.com/office/word/2018/wordml" xmlns:w16du="http://schemas.microsoft.com/office/word/2023/wordml/word16du" xmlns:w16sdtdh="http://schemas.microsoft.com/office/word/2020/wordml/sdtdatahash" xmlns:w16sdtfl="http://schemas.microsoft.com/office/word/2024/wordml/sdtformatlock" xmlns:w16se="http://schemas.microsoft.com/office/word/2015/wordml/symex" mc:Ignorable="w14 w15 w16se w16cid w16 w16cex w16sdtdh w16sdtfl w16du">
   <w:docDefaults>
     <w:rPrDefault>
       <w:rPr>

</xml_diff>

<commit_message>
Changed Article 8 Section 3 to convert red text to automatic since it was approved in the review
Signed-off-by: frothbeast <frothbeast@gmail.com>
</commit_message>
<xml_diff>
--- a/Union bylaws.docx
+++ b/Union bylaws.docx
@@ -3727,16 +3727,14 @@
         <w:ind w:left="1134" w:hanging="1134"/>
         <w:rPr>
           <w:rFonts w:ascii="Lato" w:hAnsi="Lato"/>
-          <w:color w:val="FF0000"/>
-          <w:sz w:val="20"/>
-          <w:szCs w:val="20"/>
-          <w:lang w:val="en-US"/>
-        </w:rPr>
-      </w:pPr>
-      <w:r>
-        <w:rPr>
-          <w:rFonts w:ascii="Lato" w:hAnsi="Lato"/>
-          <w:color w:val="FF0000"/>
+          <w:sz w:val="20"/>
+          <w:szCs w:val="20"/>
+          <w:lang w:val="en-US"/>
+        </w:rPr>
+      </w:pPr>
+      <w:r>
+        <w:rPr>
+          <w:rFonts w:ascii="Lato" w:hAnsi="Lato"/>
           <w:sz w:val="20"/>
           <w:szCs w:val="20"/>
           <w:lang w:val="en-US"/>
@@ -3746,7 +3744,6 @@
       <w:r>
         <w:rPr>
           <w:rFonts w:ascii="Lato" w:hAnsi="Lato"/>
-          <w:color w:val="FF0000"/>
           <w:sz w:val="20"/>
           <w:szCs w:val="20"/>
           <w:lang w:val="en-US"/>
@@ -3757,7 +3754,6 @@
       <w:r>
         <w:rPr>
           <w:rFonts w:ascii="Lato" w:hAnsi="Lato"/>
-          <w:color w:val="FF0000"/>
           <w:sz w:val="20"/>
           <w:szCs w:val="20"/>
           <w:lang w:val="en-US"/>
@@ -3767,7 +3763,6 @@
       <w:r>
         <w:rPr>
           <w:rFonts w:ascii="Lato" w:hAnsi="Lato"/>
-          <w:color w:val="FF0000"/>
           <w:sz w:val="20"/>
           <w:szCs w:val="20"/>
           <w:lang w:val="en-US"/>
@@ -3777,7 +3772,6 @@
       <w:r>
         <w:rPr>
           <w:rFonts w:ascii="Lato" w:hAnsi="Lato"/>
-          <w:color w:val="FF0000"/>
           <w:sz w:val="20"/>
           <w:szCs w:val="20"/>
           <w:lang w:val="en-US"/>
@@ -3788,7 +3782,6 @@
       <w:r>
         <w:rPr>
           <w:rFonts w:ascii="Lato" w:hAnsi="Lato"/>
-          <w:color w:val="FF0000"/>
           <w:sz w:val="20"/>
           <w:szCs w:val="20"/>
           <w:lang w:val="en-US"/>
@@ -3798,7 +3791,6 @@
       <w:r>
         <w:rPr>
           <w:rFonts w:ascii="Lato" w:hAnsi="Lato"/>
-          <w:color w:val="FF0000"/>
           <w:sz w:val="20"/>
           <w:szCs w:val="20"/>
           <w:lang w:val="en-US"/>

</xml_diff>

<commit_message>
Changed Article 9 Section 1 and 2C to convert red text to automatic since it was approved in the review
added strike through to this sentence in section 1 because the review said needs to be in good standing (only):

(currently active, or a member who has been laid off for more than seven (7) months and has notified the Financial Secretary of their intention to remain in good standing, no less than one (1) month prior to the call of this meeting)

Signed-off-by: frothbeast <frothbeast@gmail.com>
</commit_message>
<xml_diff>
--- a/Union bylaws.docx
+++ b/Union bylaws.docx
@@ -3888,23 +3888,22 @@
           <w:szCs w:val="20"/>
           <w:lang w:val="en-US"/>
         </w:rPr>
-        <w:t xml:space="preserve">Section 1: An Election Committee of three (3) members in good standing, (currently active, or a member who has been laid off for more than seven (7) months and has notified the Financial Secretary of their intention to remain in good standing, no less than one (1) month prior to the call of this meeting) </w:t>
-      </w:r>
-      <w:r>
-        <w:rPr>
-          <w:rFonts w:ascii="Lato" w:hAnsi="Lato"/>
-          <w:strike/>
+        <w:t xml:space="preserve">Section 1: An Election Committee of three (3) members in good standing, </w:t>
+      </w:r>
+      <w:r>
+        <w:rPr>
+          <w:rFonts w:ascii="Lato" w:hAnsi="Lato"/>
+          <w:dstrike/>
           <w:color w:val="FF0000"/>
           <w:sz w:val="20"/>
           <w:szCs w:val="20"/>
           <w:lang w:val="en-US"/>
         </w:rPr>
-        <w:t>shall be elected by a show of hands at a regular or special membership meeting held at least one (1) month prior to the nominations</w:t>
-      </w:r>
-      <w:r>
-        <w:rPr>
-          <w:rFonts w:ascii="Lato" w:hAnsi="Lato"/>
-          <w:strike/>
+        <w:t>(currently active, or a member who has been laid off for more than seven (7) months and has notified the Financial Secretary of their intention to remain in good standing, no less than one (1) month prior to the call of this meeting)</w:t>
+      </w:r>
+      <w:r>
+        <w:rPr>
+          <w:rFonts w:ascii="Lato" w:hAnsi="Lato"/>
           <w:color w:val="FF0000"/>
           <w:sz w:val="20"/>
           <w:szCs w:val="20"/>
@@ -3915,12 +3914,11 @@
       <w:r>
         <w:rPr>
           <w:rFonts w:ascii="Lato" w:hAnsi="Lato"/>
-          <w:color w:val="FF0000"/>
-          <w:sz w:val="20"/>
-          <w:szCs w:val="20"/>
-          <w:lang w:val="en-US"/>
-        </w:rPr>
-        <w:t xml:space="preserve"> shall be elected either by a show of hands at a regular or special membership meeting held at least one (1) month prior to the nominations or through an electronic voting process approved by the executive board</w:t>
+          <w:sz w:val="20"/>
+          <w:szCs w:val="20"/>
+          <w:lang w:val="en-US"/>
+        </w:rPr>
+        <w:t>shall be elected either by a show of hands at a regular or special membership meeting held at least one (1) month prior to the nominations or through an electronic voting process approved by the executive board</w:t>
       </w:r>
       <w:r>
         <w:rPr>
@@ -4041,38 +4039,14 @@
         <w:rPr>
           <w:rFonts w:ascii="Lato" w:hAnsi="Lato"/>
           <w:strike/>
-          <w:color w:val="FF0000"/>
-          <w:sz w:val="20"/>
-          <w:szCs w:val="20"/>
-          <w:lang w:val="en-US"/>
-        </w:rPr>
-      </w:pPr>
-      <w:r>
-        <w:rPr>
-          <w:rFonts w:ascii="Lato" w:hAnsi="Lato"/>
-          <w:strike/>
-          <w:color w:val="FF0000"/>
-          <w:sz w:val="20"/>
-          <w:szCs w:val="20"/>
-          <w:lang w:val="en-US"/>
-        </w:rPr>
-        <w:t>Setting up a booth in the union hall or other appropriate locations, see to the printing of the ballots and the conduction of the election in a democratic way.</w:t>
-      </w:r>
-      <w:r>
-        <w:rPr>
-          <w:rFonts w:ascii="Lato" w:hAnsi="Lato"/>
-          <w:strike/>
-          <w:color w:val="FF0000"/>
-          <w:sz w:val="20"/>
-          <w:szCs w:val="20"/>
-          <w:lang w:val="en-US"/>
-        </w:rPr>
-        <w:t xml:space="preserve">   </w:t>
-      </w:r>
-      <w:r>
-        <w:rPr>
-          <w:rFonts w:ascii="Lato" w:hAnsi="Lato"/>
-          <w:color w:val="FF0000"/>
+          <w:sz w:val="20"/>
+          <w:szCs w:val="20"/>
+          <w:lang w:val="en-US"/>
+        </w:rPr>
+      </w:pPr>
+      <w:r>
+        <w:rPr>
+          <w:rFonts w:ascii="Lato" w:hAnsi="Lato"/>
           <w:sz w:val="20"/>
           <w:szCs w:val="20"/>
           <w:lang w:val="en-US"/>

</xml_diff>

<commit_message>
Changed Article 21 Section 1 and 2 and 5 to convert red text to automatic since it was approved in the review and added 11 and 12 as requested
Signed-off-by: frothbeast <frothbeast@gmail.com>
</commit_message>
<xml_diff>
--- a/Union bylaws.docx
+++ b/Union bylaws.docx
@@ -8055,33 +8055,11 @@
       <w:r>
         <w:rPr>
           <w:rFonts w:ascii="Lato" w:hAnsi="Lato"/>
-          <w:color w:val="FF0000"/>
           <w:sz w:val="20"/>
           <w:szCs w:val="20"/>
           <w:lang w:val="en-US"/>
         </w:rPr>
         <w:t xml:space="preserve">Any elected official </w:t>
-      </w:r>
-      <w:r>
-        <w:rPr>
-          <w:rFonts w:ascii="Lato" w:hAnsi="Lato"/>
-          <w:strike/>
-          <w:color w:val="FF0000"/>
-          <w:sz w:val="20"/>
-          <w:szCs w:val="20"/>
-          <w:lang w:val="en-US"/>
-        </w:rPr>
-        <w:t>A shop steward or committeeperson</w:t>
-      </w:r>
-      <w:r>
-        <w:rPr>
-          <w:rFonts w:ascii="Lato" w:hAnsi="Lato"/>
-          <w:color w:val="FF0000"/>
-          <w:sz w:val="20"/>
-          <w:szCs w:val="20"/>
-          <w:lang w:val="en-US"/>
-        </w:rPr>
-        <w:t xml:space="preserve"> </w:t>
       </w:r>
       <w:r>
         <w:rPr>
@@ -8123,41 +8101,11 @@
       <w:r>
         <w:rPr>
           <w:rFonts w:ascii="Lato" w:hAnsi="Lato"/>
-          <w:color w:val="FF0000"/>
-          <w:sz w:val="20"/>
-          <w:szCs w:val="20"/>
-          <w:lang w:val="en-US"/>
-        </w:rPr>
-        <w:t>any elected official</w:t>
-      </w:r>
-      <w:r>
-        <w:rPr>
-          <w:rFonts w:ascii="Lato" w:hAnsi="Lato"/>
-          <w:sz w:val="20"/>
-          <w:szCs w:val="20"/>
-          <w:lang w:val="en-US"/>
-        </w:rPr>
-        <w:t xml:space="preserve"> </w:t>
-      </w:r>
-      <w:r>
-        <w:rPr>
-          <w:rFonts w:ascii="Lato" w:hAnsi="Lato"/>
-          <w:strike/>
-          <w:color w:val="FF0000"/>
-          <w:sz w:val="20"/>
-          <w:szCs w:val="20"/>
-          <w:lang w:val="en-US"/>
-        </w:rPr>
-        <w:t>a shop steward or committeeperson</w:t>
-      </w:r>
-      <w:r>
-        <w:rPr>
-          <w:rFonts w:ascii="Lato" w:hAnsi="Lato"/>
-          <w:sz w:val="20"/>
-          <w:szCs w:val="20"/>
-          <w:lang w:val="en-US"/>
-        </w:rPr>
-        <w:t xml:space="preserve"> </w:t>
+          <w:sz w:val="20"/>
+          <w:szCs w:val="20"/>
+          <w:lang w:val="en-US"/>
+        </w:rPr>
+        <w:t xml:space="preserve">any elected official </w:t>
       </w:r>
       <w:r>
         <w:rPr>
@@ -8256,18 +8204,35 @@
         <w:jc w:val="both"/>
         <w:rPr>
           <w:rFonts w:ascii="Lato" w:hAnsi="Lato"/>
-          <w:color w:val="FF0000"/>
-          <w:sz w:val="20"/>
-          <w:szCs w:val="20"/>
-          <w:lang w:val="en-US"/>
-        </w:rPr>
-      </w:pPr>
-      <w:r>
-        <w:rPr>
-          <w:rFonts w:ascii="Lato" w:hAnsi="Lato"/>
-          <w:color w:val="FF0000"/>
-        </w:rPr>
-        <w:t>An elected Local Union Executive Board member may be recalled by the members for failing to perform the duties of their office.   Pursuant to article 15, section B, paragraph 10 of the Unifor Constitution.</w:t>
+          <w:sz w:val="20"/>
+          <w:szCs w:val="20"/>
+          <w:lang w:val="en-US"/>
+        </w:rPr>
+      </w:pPr>
+      <w:r>
+        <w:rPr>
+          <w:rFonts w:ascii="Lato" w:hAnsi="Lato"/>
+        </w:rPr>
+        <w:t>An elected Local Union Executive Board member may be recalled by the members for failing to perform the duties of their office.   Pursuant to article 15, section B, paragraph 10</w:t>
+      </w:r>
+      <w:r>
+        <w:rPr>
+          <w:rFonts w:ascii="Lato" w:hAnsi="Lato"/>
+        </w:rPr>
+        <w:t xml:space="preserve">, </w:t>
+      </w:r>
+      <w:r>
+        <w:rPr>
+          <w:rFonts w:ascii="Lato" w:hAnsi="Lato"/>
+          <w:color w:val="00B050"/>
+        </w:rPr>
+        <w:t xml:space="preserve">11 and 12 </w:t>
+      </w:r>
+      <w:r>
+        <w:rPr>
+          <w:rFonts w:ascii="Lato" w:hAnsi="Lato"/>
+        </w:rPr>
+        <w:t>of the Unifor Constitution.</w:t>
       </w:r>
     </w:p>
     <w:p>

</xml_diff>

<commit_message>
added the following to Article 3
The regulation of labour relations and collective bargaining between employers and
employees.

Signed-off-by: frothbeast <frothbeast@gmail.com>
</commit_message>
<xml_diff>
--- a/Union bylaws.docx
+++ b/Union bylaws.docx
@@ -419,19 +419,7 @@
           <w:sz w:val="28"/>
           <w:szCs w:val="28"/>
         </w:rPr>
-        <w:t xml:space="preserve"> Dec 06, </w:t>
-      </w:r>
-      <w:proofErr w:type="gramStart"/>
-      <w:r>
-        <w:rPr>
-          <w:rFonts w:ascii="Lato" w:hAnsi="Lato"/>
-          <w:b/>
-          <w:bCs/>
-          <w:color w:val="FF0000"/>
-          <w:sz w:val="28"/>
-          <w:szCs w:val="28"/>
-        </w:rPr>
-        <w:t xml:space="preserve">2024 </w:t>
+        <w:t xml:space="preserve"> Dec 06, 2024 </w:t>
       </w:r>
       <w:r>
         <w:rPr>
@@ -443,20 +431,7 @@
           <w:sz w:val="28"/>
           <w:szCs w:val="28"/>
         </w:rPr>
-        <w:t xml:space="preserve"> Dec</w:t>
-      </w:r>
-      <w:proofErr w:type="gramEnd"/>
-      <w:r>
-        <w:rPr>
-          <w:rFonts w:ascii="Lato" w:hAnsi="Lato"/>
-          <w:b/>
-          <w:bCs/>
-          <w:strike/>
-          <w:color w:val="FF0000"/>
-          <w:sz w:val="28"/>
-          <w:szCs w:val="28"/>
-        </w:rPr>
-        <w:t xml:space="preserve"> 12, 2017</w:t>
+        <w:t xml:space="preserve"> Dec 12, 2017</w:t>
       </w:r>
     </w:p>
     <w:p>
@@ -640,13 +615,26 @@
         <w:spacing w:before="240" w:after="240" w:line="276" w:lineRule="auto"/>
         <w:rPr>
           <w:rFonts w:ascii="Lato" w:hAnsi="Lato"/>
-        </w:rPr>
-      </w:pPr>
-      <w:r>
-        <w:rPr>
-          <w:rFonts w:ascii="Lato" w:hAnsi="Lato"/>
-        </w:rPr>
-        <w:t>The objectives of this organization shall be to improve the working conditions to establish wages in accordance with the existing economic conditions, to protect our rights to bargain collectively</w:t>
+          <w:color w:val="00B050"/>
+        </w:rPr>
+      </w:pPr>
+      <w:r>
+        <w:rPr>
+          <w:rFonts w:ascii="Lato" w:hAnsi="Lato"/>
+        </w:rPr>
+        <w:t xml:space="preserve">The objectives of this organization shall be to improve the working </w:t>
+      </w:r>
+      <w:r>
+        <w:rPr>
+          <w:rFonts w:ascii="Lato" w:hAnsi="Lato"/>
+        </w:rPr>
+        <w:t>conditions,</w:t>
+      </w:r>
+      <w:r>
+        <w:rPr>
+          <w:rFonts w:ascii="Lato" w:hAnsi="Lato"/>
+        </w:rPr>
+        <w:t xml:space="preserve"> to establish wages in accordance with the existing economic conditions, to protect our rights to bargain collectively</w:t>
       </w:r>
       <w:r>
         <w:rPr>
@@ -658,7 +646,42 @@
         <w:rPr>
           <w:rFonts w:ascii="Lato" w:hAnsi="Lato"/>
         </w:rPr>
-        <w:t xml:space="preserve"> with our employers at all times and promote a better way of life.</w:t>
+        <w:t xml:space="preserve"> with our employers at all times and promote a better way of life</w:t>
+      </w:r>
+      <w:r>
+        <w:rPr>
+          <w:rFonts w:ascii="Lato" w:hAnsi="Lato"/>
+          <w:color w:val="00B050"/>
+        </w:rPr>
+        <w:t>.</w:t>
+      </w:r>
+      <w:r>
+        <w:rPr>
+          <w:rFonts w:ascii="Lato" w:hAnsi="Lato"/>
+          <w:color w:val="00B050"/>
+        </w:rPr>
+        <w:t xml:space="preserve"> T</w:t>
+      </w:r>
+      <w:r>
+        <w:rPr>
+          <w:rFonts w:ascii="Lato" w:hAnsi="Lato"/>
+          <w:color w:val="00B050"/>
+        </w:rPr>
+        <w:t>he regulation of labour relations and collective bargaining between employers and</w:t>
+      </w:r>
+      <w:r>
+        <w:rPr>
+          <w:rFonts w:ascii="Lato" w:hAnsi="Lato"/>
+          <w:color w:val="00B050"/>
+        </w:rPr>
+        <w:t xml:space="preserve"> </w:t>
+      </w:r>
+      <w:r>
+        <w:rPr>
+          <w:rFonts w:ascii="Lato" w:hAnsi="Lato"/>
+          <w:color w:val="00B050"/>
+        </w:rPr>
+        <w:t>employees.</w:t>
       </w:r>
     </w:p>
     <w:p>
@@ -6660,47 +6683,7 @@
           <w:szCs w:val="20"/>
           <w:lang w:val="en-US"/>
         </w:rPr>
-        <w:t xml:space="preserve">A vote shall be taken on the recommendations of the bylaw </w:t>
-      </w:r>
-      <w:proofErr w:type="gramStart"/>
-      <w:r>
-        <w:rPr>
-          <w:rFonts w:ascii="Lato" w:hAnsi="Lato"/>
-          <w:sz w:val="20"/>
-          <w:szCs w:val="20"/>
-          <w:lang w:val="en-US"/>
-        </w:rPr>
-        <w:t>committee</w:t>
-      </w:r>
-      <w:proofErr w:type="gramEnd"/>
-      <w:r>
-        <w:rPr>
-          <w:rFonts w:ascii="Lato" w:hAnsi="Lato"/>
-          <w:sz w:val="20"/>
-          <w:szCs w:val="20"/>
-          <w:lang w:val="en-US"/>
-        </w:rPr>
-        <w:t xml:space="preserve"> and it </w:t>
-      </w:r>
-      <w:proofErr w:type="gramStart"/>
-      <w:r>
-        <w:rPr>
-          <w:rFonts w:ascii="Lato" w:hAnsi="Lato"/>
-          <w:sz w:val="20"/>
-          <w:szCs w:val="20"/>
-          <w:lang w:val="en-US"/>
-        </w:rPr>
-        <w:t>shall</w:t>
-      </w:r>
-      <w:proofErr w:type="gramEnd"/>
-      <w:r>
-        <w:rPr>
-          <w:rFonts w:ascii="Lato" w:hAnsi="Lato"/>
-          <w:sz w:val="20"/>
-          <w:szCs w:val="20"/>
-          <w:lang w:val="en-US"/>
-        </w:rPr>
-        <w:t xml:space="preserve"> require a majority vote for adoption. </w:t>
+        <w:t xml:space="preserve">A vote shall be taken on the recommendations of the bylaw committee and it shall require a majority vote for adoption. </w:t>
       </w:r>
     </w:p>
     <w:p>
@@ -6756,47 +6739,7 @@
           <w:szCs w:val="20"/>
           <w:lang w:val="en-US"/>
         </w:rPr>
-        <w:t xml:space="preserve">The bylaws of the local union shall at all times be subordinate and subject to the provisions of the constitution of the National Union Unifor-Canada as such a constitution now </w:t>
-      </w:r>
-      <w:proofErr w:type="gramStart"/>
-      <w:r>
-        <w:rPr>
-          <w:rFonts w:ascii="Lato" w:hAnsi="Lato"/>
-          <w:sz w:val="20"/>
-          <w:szCs w:val="20"/>
-          <w:lang w:val="en-US"/>
-        </w:rPr>
-        <w:t>exists, or</w:t>
-      </w:r>
-      <w:proofErr w:type="gramEnd"/>
-      <w:r>
-        <w:rPr>
-          <w:rFonts w:ascii="Lato" w:hAnsi="Lato"/>
-          <w:sz w:val="20"/>
-          <w:szCs w:val="20"/>
-          <w:lang w:val="en-US"/>
-        </w:rPr>
-        <w:t xml:space="preserve"> may from </w:t>
-      </w:r>
-      <w:proofErr w:type="gramStart"/>
-      <w:r>
-        <w:rPr>
-          <w:rFonts w:ascii="Lato" w:hAnsi="Lato"/>
-          <w:sz w:val="20"/>
-          <w:szCs w:val="20"/>
-          <w:lang w:val="en-US"/>
-        </w:rPr>
-        <w:t>time to time</w:t>
-      </w:r>
-      <w:proofErr w:type="gramEnd"/>
-      <w:r>
-        <w:rPr>
-          <w:rFonts w:ascii="Lato" w:hAnsi="Lato"/>
-          <w:sz w:val="20"/>
-          <w:szCs w:val="20"/>
-          <w:lang w:val="en-US"/>
-        </w:rPr>
-        <w:t xml:space="preserve"> hereafter be altered or amended: and in the event of any conflict the constitution of the National Union Unifor-Canada shall govern.</w:t>
+        <w:t>The bylaws of the local union shall at all times be subordinate and subject to the provisions of the constitution of the National Union Unifor-Canada as such a constitution now exists, or may from time to time hereafter be altered or amended: and in the event of any conflict the constitution of the National Union Unifor-Canada shall govern.</w:t>
       </w:r>
     </w:p>
     <w:p>

</xml_diff>

<commit_message>
Article 8 section 1 A - Added a question in green for John and Garry Can we just reference ‘policy regarding local union elections?
Section 2

removed - Section 2:	Every member in good standing, (currently active, or a member who has been laid off for more than seven (7) months and has notified the Financial Secretary of their intention to remain in good standing, no less than one (1) month prior to the date of the election) shall be entitled to vote at all local union election.

added - Every member of a Local Union who is in good standing is eligible to vote in all Local Union elections, unless disqualified from voting by a provision of the Unifor Constitution. Each member who votes must vote personally. For clarity, proxy votes are not permitted.

Signed-off-by: frothbeast <frothbeast@gmail.com>
</commit_message>
<xml_diff>
--- a/Union bylaws.docx
+++ b/Union bylaws.docx
@@ -419,7 +419,19 @@
           <w:sz w:val="28"/>
           <w:szCs w:val="28"/>
         </w:rPr>
-        <w:t xml:space="preserve"> Dec 06, 2024 </w:t>
+        <w:t xml:space="preserve"> Dec 06, </w:t>
+      </w:r>
+      <w:proofErr w:type="gramStart"/>
+      <w:r>
+        <w:rPr>
+          <w:rFonts w:ascii="Lato" w:hAnsi="Lato"/>
+          <w:b/>
+          <w:bCs/>
+          <w:color w:val="FF0000"/>
+          <w:sz w:val="28"/>
+          <w:szCs w:val="28"/>
+        </w:rPr>
+        <w:t xml:space="preserve">2024 </w:t>
       </w:r>
       <w:r>
         <w:rPr>
@@ -431,7 +443,20 @@
           <w:sz w:val="28"/>
           <w:szCs w:val="28"/>
         </w:rPr>
-        <w:t xml:space="preserve"> Dec 12, 2017</w:t>
+        <w:t xml:space="preserve"> Dec</w:t>
+      </w:r>
+      <w:proofErr w:type="gramEnd"/>
+      <w:r>
+        <w:rPr>
+          <w:rFonts w:ascii="Lato" w:hAnsi="Lato"/>
+          <w:b/>
+          <w:bCs/>
+          <w:strike/>
+          <w:color w:val="FF0000"/>
+          <w:sz w:val="28"/>
+          <w:szCs w:val="28"/>
+        </w:rPr>
+        <w:t xml:space="preserve"> 12, 2017</w:t>
       </w:r>
     </w:p>
     <w:p>
@@ -622,7 +647,21 @@
         <w:rPr>
           <w:rFonts w:ascii="Lato" w:hAnsi="Lato"/>
         </w:rPr>
-        <w:t xml:space="preserve">The objectives of this organization shall be to improve the working </w:t>
+        <w:t xml:space="preserve">The objectives of this organization </w:t>
+      </w:r>
+      <w:proofErr w:type="gramStart"/>
+      <w:r>
+        <w:rPr>
+          <w:rFonts w:ascii="Lato" w:hAnsi="Lato"/>
+        </w:rPr>
+        <w:t>shall</w:t>
+      </w:r>
+      <w:proofErr w:type="gramEnd"/>
+      <w:r>
+        <w:rPr>
+          <w:rFonts w:ascii="Lato" w:hAnsi="Lato"/>
+        </w:rPr>
+        <w:t xml:space="preserve"> be to improve the working </w:t>
       </w:r>
       <w:r>
         <w:rPr>
@@ -3726,6 +3765,46 @@
         <w:ind w:left="1134"/>
         <w:rPr>
           <w:rFonts w:ascii="Lato" w:hAnsi="Lato"/>
+          <w:color w:val="FF0000"/>
+          <w:sz w:val="20"/>
+          <w:szCs w:val="20"/>
+          <w:lang w:val="en-US"/>
+        </w:rPr>
+      </w:pPr>
+    </w:p>
+    <w:p>
+      <w:pPr>
+        <w:pStyle w:val="ListParagraph"/>
+        <w:keepNext/>
+        <w:keepLines/>
+        <w:ind w:left="1134"/>
+        <w:rPr>
+          <w:rFonts w:ascii="Lato" w:hAnsi="Lato"/>
+          <w:color w:val="00B050"/>
+          <w:sz w:val="20"/>
+          <w:szCs w:val="20"/>
+          <w:lang w:val="en-US"/>
+        </w:rPr>
+      </w:pPr>
+      <w:r>
+        <w:rPr>
+          <w:rFonts w:ascii="Lato" w:hAnsi="Lato"/>
+          <w:color w:val="00B050"/>
+          <w:sz w:val="20"/>
+          <w:szCs w:val="20"/>
+          <w:lang w:val="en-US"/>
+        </w:rPr>
+        <w:t>Can we just reference ‘policy regarding local union elections?</w:t>
+      </w:r>
+    </w:p>
+    <w:p>
+      <w:pPr>
+        <w:pStyle w:val="ListParagraph"/>
+        <w:keepNext/>
+        <w:keepLines/>
+        <w:ind w:left="1134"/>
+        <w:rPr>
+          <w:rFonts w:ascii="Lato" w:hAnsi="Lato"/>
           <w:sz w:val="20"/>
           <w:szCs w:val="20"/>
           <w:lang w:val="en-US"/>
@@ -3857,19 +3936,112 @@
         <w:ind w:left="1134" w:hanging="1133"/>
         <w:rPr>
           <w:rFonts w:ascii="Lato" w:hAnsi="Lato"/>
-          <w:sz w:val="20"/>
-          <w:szCs w:val="20"/>
-          <w:lang w:val="en-US"/>
-        </w:rPr>
-      </w:pPr>
-      <w:r>
-        <w:rPr>
-          <w:rFonts w:ascii="Lato" w:hAnsi="Lato"/>
-          <w:sz w:val="20"/>
-          <w:szCs w:val="20"/>
-          <w:lang w:val="en-US"/>
-        </w:rPr>
-        <w:t>Every member in good standing, (currently active, or a member who has been laid off for more than seven (7) months and has notified the Financial Secretary of their intention to remain in good standing, no less than one (1) month prior to the date of the election) shall be entitled to vote at all local union election.</w:t>
+          <w:strike/>
+          <w:color w:val="00B050"/>
+          <w:sz w:val="20"/>
+          <w:szCs w:val="20"/>
+          <w:lang w:val="en-US"/>
+        </w:rPr>
+      </w:pPr>
+      <w:r>
+        <w:rPr>
+          <w:rFonts w:ascii="Lato" w:hAnsi="Lato"/>
+          <w:strike/>
+          <w:color w:val="00B050"/>
+          <w:sz w:val="20"/>
+          <w:szCs w:val="20"/>
+          <w:lang w:val="en-US"/>
+        </w:rPr>
+        <w:t xml:space="preserve">Every member in good standing, (currently active, or a member who has been laid off for more than seven (7) months and has notified the Financial Secretary of their intention to remain in good standing, no less than one (1) month prior to the date of the election) shall be entitled to vote at all local union </w:t>
+      </w:r>
+      <w:proofErr w:type="gramStart"/>
+      <w:r>
+        <w:rPr>
+          <w:rFonts w:ascii="Lato" w:hAnsi="Lato"/>
+          <w:strike/>
+          <w:color w:val="00B050"/>
+          <w:sz w:val="20"/>
+          <w:szCs w:val="20"/>
+          <w:lang w:val="en-US"/>
+        </w:rPr>
+        <w:t>election</w:t>
+      </w:r>
+      <w:proofErr w:type="gramEnd"/>
+      <w:r>
+        <w:rPr>
+          <w:rFonts w:ascii="Lato" w:hAnsi="Lato"/>
+          <w:strike/>
+          <w:color w:val="00B050"/>
+          <w:sz w:val="20"/>
+          <w:szCs w:val="20"/>
+          <w:lang w:val="en-US"/>
+        </w:rPr>
+        <w:t>.</w:t>
+      </w:r>
+    </w:p>
+    <w:p>
+      <w:pPr>
+        <w:pStyle w:val="ListParagraph"/>
+        <w:keepNext/>
+        <w:keepLines/>
+        <w:ind w:left="1134"/>
+        <w:rPr>
+          <w:rFonts w:ascii="Lato" w:hAnsi="Lato"/>
+          <w:color w:val="00B050"/>
+          <w:sz w:val="20"/>
+          <w:szCs w:val="20"/>
+          <w:lang w:val="en-US"/>
+        </w:rPr>
+      </w:pPr>
+      <w:r>
+        <w:rPr>
+          <w:rFonts w:ascii="Lato" w:hAnsi="Lato"/>
+          <w:color w:val="00B050"/>
+          <w:sz w:val="20"/>
+          <w:szCs w:val="20"/>
+          <w:lang w:val="en-US"/>
+        </w:rPr>
+        <w:t>Every member of a Local Union who is in good standing is eligible to vote in all Local Union</w:t>
+      </w:r>
+      <w:r>
+        <w:rPr>
+          <w:rFonts w:ascii="Lato" w:hAnsi="Lato"/>
+          <w:color w:val="00B050"/>
+          <w:sz w:val="20"/>
+          <w:szCs w:val="20"/>
+          <w:lang w:val="en-US"/>
+        </w:rPr>
+        <w:t xml:space="preserve"> </w:t>
+      </w:r>
+      <w:r>
+        <w:rPr>
+          <w:rFonts w:ascii="Lato" w:hAnsi="Lato"/>
+          <w:color w:val="00B050"/>
+          <w:sz w:val="20"/>
+          <w:szCs w:val="20"/>
+          <w:lang w:val="en-US"/>
+        </w:rPr>
+        <w:t>elections, unless disqualified from voting by a provision of the Unifor Constitution. Each</w:t>
+      </w:r>
+      <w:r>
+        <w:rPr>
+          <w:rFonts w:ascii="Lato" w:hAnsi="Lato"/>
+          <w:color w:val="00B050"/>
+          <w:sz w:val="20"/>
+          <w:szCs w:val="20"/>
+          <w:lang w:val="en-US"/>
+        </w:rPr>
+        <w:t xml:space="preserve"> </w:t>
+      </w:r>
+      <w:r>
+        <w:rPr>
+          <w:rFonts w:ascii="Lato" w:hAnsi="Lato"/>
+          <w:color w:val="00B050"/>
+          <w:sz w:val="20"/>
+          <w:szCs w:val="20"/>
+          <w:lang w:val="en-US"/>
+        </w:rPr>
+        <w:t>member who votes must vote personally. For clarity, proxy votes are not permitted.</w:t>
       </w:r>
     </w:p>
     <w:p>
@@ -3910,6 +4082,7 @@
           <w:szCs w:val="20"/>
           <w:lang w:val="en-US"/>
         </w:rPr>
+        <w:lastRenderedPageBreak/>
         <w:t>All vacancies in the Local Union, except the President shall be promptly filled by election. The Executive Board will temporarily appoint a member to fill the vacancy or vacancies until the election takes place.</w:t>
       </w:r>
       <w:r>
@@ -6831,7 +7004,47 @@
           <w:szCs w:val="20"/>
           <w:lang w:val="en-US"/>
         </w:rPr>
-        <w:t xml:space="preserve">A vote shall be taken on the recommendations of the bylaw committee and it shall require a majority vote for adoption. </w:t>
+        <w:t xml:space="preserve">A vote shall be taken on the recommendations of the bylaw </w:t>
+      </w:r>
+      <w:proofErr w:type="gramStart"/>
+      <w:r>
+        <w:rPr>
+          <w:rFonts w:ascii="Lato" w:hAnsi="Lato"/>
+          <w:sz w:val="20"/>
+          <w:szCs w:val="20"/>
+          <w:lang w:val="en-US"/>
+        </w:rPr>
+        <w:t>committee</w:t>
+      </w:r>
+      <w:proofErr w:type="gramEnd"/>
+      <w:r>
+        <w:rPr>
+          <w:rFonts w:ascii="Lato" w:hAnsi="Lato"/>
+          <w:sz w:val="20"/>
+          <w:szCs w:val="20"/>
+          <w:lang w:val="en-US"/>
+        </w:rPr>
+        <w:t xml:space="preserve"> and it </w:t>
+      </w:r>
+      <w:proofErr w:type="gramStart"/>
+      <w:r>
+        <w:rPr>
+          <w:rFonts w:ascii="Lato" w:hAnsi="Lato"/>
+          <w:sz w:val="20"/>
+          <w:szCs w:val="20"/>
+          <w:lang w:val="en-US"/>
+        </w:rPr>
+        <w:t>shall</w:t>
+      </w:r>
+      <w:proofErr w:type="gramEnd"/>
+      <w:r>
+        <w:rPr>
+          <w:rFonts w:ascii="Lato" w:hAnsi="Lato"/>
+          <w:sz w:val="20"/>
+          <w:szCs w:val="20"/>
+          <w:lang w:val="en-US"/>
+        </w:rPr>
+        <w:t xml:space="preserve"> require a majority vote for adoption. </w:t>
       </w:r>
     </w:p>
     <w:p>
@@ -6887,7 +7100,47 @@
           <w:szCs w:val="20"/>
           <w:lang w:val="en-US"/>
         </w:rPr>
-        <w:t>The bylaws of the local union shall at all times be subordinate and subject to the provisions of the constitution of the National Union Unifor-Canada as such a constitution now exists, or may from time to time hereafter be altered or amended: and in the event of any conflict the constitution of the National Union Unifor-Canada shall govern.</w:t>
+        <w:t xml:space="preserve">The bylaws of the local union shall at all times be subordinate and subject to the provisions of the constitution of the National Union Unifor-Canada as such a constitution now </w:t>
+      </w:r>
+      <w:proofErr w:type="gramStart"/>
+      <w:r>
+        <w:rPr>
+          <w:rFonts w:ascii="Lato" w:hAnsi="Lato"/>
+          <w:sz w:val="20"/>
+          <w:szCs w:val="20"/>
+          <w:lang w:val="en-US"/>
+        </w:rPr>
+        <w:t>exists, or</w:t>
+      </w:r>
+      <w:proofErr w:type="gramEnd"/>
+      <w:r>
+        <w:rPr>
+          <w:rFonts w:ascii="Lato" w:hAnsi="Lato"/>
+          <w:sz w:val="20"/>
+          <w:szCs w:val="20"/>
+          <w:lang w:val="en-US"/>
+        </w:rPr>
+        <w:t xml:space="preserve"> may from </w:t>
+      </w:r>
+      <w:proofErr w:type="gramStart"/>
+      <w:r>
+        <w:rPr>
+          <w:rFonts w:ascii="Lato" w:hAnsi="Lato"/>
+          <w:sz w:val="20"/>
+          <w:szCs w:val="20"/>
+          <w:lang w:val="en-US"/>
+        </w:rPr>
+        <w:t>time to time</w:t>
+      </w:r>
+      <w:proofErr w:type="gramEnd"/>
+      <w:r>
+        <w:rPr>
+          <w:rFonts w:ascii="Lato" w:hAnsi="Lato"/>
+          <w:sz w:val="20"/>
+          <w:szCs w:val="20"/>
+          <w:lang w:val="en-US"/>
+        </w:rPr>
+        <w:t xml:space="preserve"> hereafter be altered or amended: and in the event of any conflict the constitution of the National Union Unifor-Canada shall govern.</w:t>
       </w:r>
     </w:p>
     <w:p>

</xml_diff>

<commit_message>
Article 9 section 1
removed - (currently active, or a member who has been laid off for more than seven (7) months and has notified the Financial Secretary of their intention to remain in good standing, no less than one (1) month prior to the call of this meeting)

Section 6

Added - Section 6:	Appeals are submitted in accordance with Article 18, B of the Constitution and the Procedure Policy on Constitutional Matters.

removed - In case of an appeal to the election results Article 15 Section B Paragraph S of the National Union Unifor-Canada Constitution will prevail.

Signed-off-by: frothbeast <frothbeast@gmail.com>
</commit_message>
<xml_diff>
--- a/Union bylaws.docx
+++ b/Union bylaws.docx
@@ -4238,7 +4238,7 @@
         <w:rPr>
           <w:rFonts w:ascii="Lato" w:hAnsi="Lato"/>
           <w:dstrike/>
-          <w:color w:val="FF0000"/>
+          <w:color w:val="00B050"/>
           <w:sz w:val="20"/>
           <w:szCs w:val="20"/>
           <w:lang w:val="en-US"/>
@@ -4627,18 +4627,74 @@
         <w:ind w:left="1134" w:hanging="1134"/>
         <w:rPr>
           <w:rFonts w:ascii="Lato" w:hAnsi="Lato"/>
-          <w:sz w:val="20"/>
-          <w:szCs w:val="20"/>
-          <w:lang w:val="en-US"/>
-        </w:rPr>
-      </w:pPr>
-      <w:r>
-        <w:rPr>
-          <w:rFonts w:ascii="Lato" w:hAnsi="Lato"/>
-          <w:sz w:val="20"/>
-          <w:szCs w:val="20"/>
-          <w:lang w:val="en-US"/>
-        </w:rPr>
+          <w:color w:val="00B050"/>
+          <w:sz w:val="20"/>
+          <w:szCs w:val="20"/>
+          <w:lang w:val="en-US"/>
+        </w:rPr>
+      </w:pPr>
+      <w:r>
+        <w:rPr>
+          <w:rFonts w:ascii="Lato" w:hAnsi="Lato"/>
+          <w:color w:val="00B050"/>
+          <w:sz w:val="20"/>
+          <w:szCs w:val="20"/>
+          <w:lang w:val="en-US"/>
+        </w:rPr>
+        <w:t>Appeals are submitted in accordance with Article 18, B of the Constitution and the</w:t>
+      </w:r>
+      <w:r>
+        <w:rPr>
+          <w:color w:val="00B050"/>
+        </w:rPr>
+        <w:t xml:space="preserve"> </w:t>
+      </w:r>
+      <w:r>
+        <w:rPr>
+          <w:rFonts w:ascii="Lato" w:hAnsi="Lato"/>
+          <w:color w:val="00B050"/>
+          <w:sz w:val="20"/>
+          <w:szCs w:val="20"/>
+          <w:lang w:val="en-US"/>
+        </w:rPr>
+        <w:t>Procedure Policy on Constitutional Matters</w:t>
+      </w:r>
+      <w:r>
+        <w:rPr>
+          <w:rFonts w:ascii="Lato" w:hAnsi="Lato"/>
+          <w:color w:val="00B050"/>
+          <w:sz w:val="20"/>
+          <w:szCs w:val="20"/>
+          <w:lang w:val="en-US"/>
+        </w:rPr>
+        <w:t>.</w:t>
+      </w:r>
+    </w:p>
+    <w:p>
+      <w:pPr>
+        <w:pStyle w:val="ListParagraph"/>
+        <w:keepNext/>
+        <w:keepLines/>
+        <w:ind w:left="1134"/>
+        <w:rPr>
+          <w:rFonts w:ascii="Lato" w:hAnsi="Lato"/>
+          <w:strike/>
+          <w:color w:val="00B050"/>
+          <w:sz w:val="20"/>
+          <w:szCs w:val="20"/>
+          <w:lang w:val="en-US"/>
+        </w:rPr>
+      </w:pPr>
+      <w:r>
+        <w:rPr>
+          <w:rFonts w:ascii="Lato" w:hAnsi="Lato"/>
+          <w:strike/>
+          <w:color w:val="00B050"/>
+          <w:sz w:val="20"/>
+          <w:szCs w:val="20"/>
+          <w:lang w:val="en-US"/>
+        </w:rPr>
+        <w:lastRenderedPageBreak/>
         <w:t>In case of an appeal to the election results Article 15 Section B Paragraph S of the National Union Unifor-Canada Constitution will prevail.</w:t>
       </w:r>
     </w:p>
@@ -4679,7 +4735,6 @@
           <w:szCs w:val="24"/>
           <w:lang w:val="en-US"/>
         </w:rPr>
-        <w:lastRenderedPageBreak/>
         <w:t>Article 10 - Expenses of Officers</w:t>
       </w:r>
     </w:p>

</xml_diff>

<commit_message>
Article 12 section 4 deleted
Section 4:	The reimbursement fee established by a Local Union shall not be less than the regular initiation fee charged by the Local Union, plus the dues for each month delinquency in dues up to either the date of his/her automatic suspension or the date of his/her reinstatement, as the Local in its discretion may determine plus the month's dues pursuant to Article 15 Section G of the National Union Unifor-Canada constitution.

Signed-off-by: frothbeast <frothbeast@gmail.com>
</commit_message>
<xml_diff>
--- a/Union bylaws.docx
+++ b/Union bylaws.docx
@@ -5035,7 +5035,16 @@
           <w:szCs w:val="20"/>
           <w:lang w:val="en-US"/>
         </w:rPr>
-        <w:t xml:space="preserve">The Executive Board shall have the authority to make disbursements of local union funds, but not to exceed twenty-five hundred ($2500.00) dollars in any single disbursement or transaction. It shall have the power to direct payment of all ordinary bills and expenses of the local union, including expenses of accredited delegates or committees, which shall not exceed the following: </w:t>
+        <w:t xml:space="preserve">The Executive Board shall have the authority to make disbursements of local union funds, but not to exceed twenty-five hundred ($2500.00) dollars in any single disbursement or transaction. It shall have the power to direct payment of all ordinary bills and expenses of the local union, including expenses of accredited delegates or committees, which shall not exceed </w:t>
+      </w:r>
+      <w:r>
+        <w:rPr>
+          <w:rFonts w:ascii="Lato" w:hAnsi="Lato"/>
+          <w:sz w:val="20"/>
+          <w:szCs w:val="20"/>
+          <w:lang w:val="en-US"/>
+        </w:rPr>
+        <w:t xml:space="preserve">the following: </w:t>
       </w:r>
     </w:p>
     <w:p>
@@ -5123,7 +5132,6 @@
       <w:r>
         <w:rPr>
           <w:rFonts w:ascii="Lato" w:hAnsi="Lato"/>
-          <w:color w:val="FF0000"/>
           <w:sz w:val="20"/>
           <w:szCs w:val="20"/>
           <w:lang w:val="en-US"/>
@@ -5133,7 +5141,6 @@
       <w:r>
         <w:rPr>
           <w:rFonts w:ascii="Lato" w:hAnsi="Lato"/>
-          <w:color w:val="FF0000"/>
           <w:sz w:val="20"/>
           <w:szCs w:val="20"/>
           <w:lang w:val="en-US"/>
@@ -5170,7 +5177,6 @@
       <w:r>
         <w:rPr>
           <w:rFonts w:ascii="Lato" w:hAnsi="Lato"/>
-          <w:color w:val="FF0000"/>
           <w:sz w:val="20"/>
           <w:szCs w:val="20"/>
           <w:lang w:val="en-US"/>
@@ -5216,7 +5222,6 @@
       <w:r>
         <w:rPr>
           <w:rFonts w:ascii="Lato" w:hAnsi="Lato"/>
-          <w:color w:val="FF0000"/>
           <w:sz w:val="20"/>
           <w:szCs w:val="20"/>
           <w:lang w:val="en-US"/>
@@ -5266,17 +5271,7 @@
           <w:szCs w:val="20"/>
           <w:lang w:val="en-US"/>
         </w:rPr>
-        <w:t xml:space="preserve"> </w:t>
-      </w:r>
-      <w:r>
-        <w:rPr>
-          <w:rFonts w:ascii="Lato" w:hAnsi="Lato"/>
-          <w:color w:val="FF0000"/>
-          <w:sz w:val="20"/>
-          <w:szCs w:val="20"/>
-          <w:lang w:val="en-US"/>
-        </w:rPr>
-        <w:t>executive</w:t>
+        <w:t xml:space="preserve"> executive</w:t>
       </w:r>
       <w:r>
         <w:rPr>
@@ -5339,7 +5334,16 @@
           <w:szCs w:val="20"/>
           <w:lang w:val="en-US"/>
         </w:rPr>
-        <w:t>The executive may make donations to the United Way, or other registered charities, not exceed three thousand ($3,000.00) dollars.</w:t>
+        <w:t>The executive may make donations to the United Way, or other registered charities, not exceed three thousand ($3,000.00) dollars</w:t>
+      </w:r>
+      <w:r>
+        <w:rPr>
+          <w:rFonts w:ascii="Lato" w:hAnsi="Lato"/>
+          <w:sz w:val="20"/>
+          <w:szCs w:val="20"/>
+          <w:lang w:val="en-US"/>
+        </w:rPr>
+        <w:t>.</w:t>
       </w:r>
     </w:p>
     <w:p>
@@ -5441,62 +5445,56 @@
       <w:r>
         <w:rPr>
           <w:rFonts w:ascii="Lato" w:hAnsi="Lato"/>
+          <w:sz w:val="20"/>
+          <w:szCs w:val="20"/>
+          <w:lang w:val="en-US"/>
         </w:rPr>
         <w:t>All dues are payable during the current month to the Financial Secretary of the local union. Minimum dues shall be</w:t>
       </w:r>
       <w:r>
         <w:rPr>
           <w:rFonts w:ascii="Lato" w:hAnsi="Lato"/>
-        </w:rPr>
-        <w:t xml:space="preserve"> </w:t>
-      </w:r>
-      <w:r>
-        <w:rPr>
-          <w:rFonts w:ascii="Lato" w:hAnsi="Lato"/>
-          <w:color w:val="FF0000"/>
-        </w:rPr>
-        <w:t xml:space="preserve"> 0.735% - National plus 0.6015% - Local (Total 1.3365%)</w:t>
-      </w:r>
-      <w:r>
-        <w:rPr>
-          <w:rFonts w:ascii="Lato" w:hAnsi="Lato"/>
-          <w:color w:val="FF0000"/>
-        </w:rPr>
-        <w:t xml:space="preserve"> (or a sum </w:t>
-      </w:r>
-      <w:r>
-        <w:rPr>
-          <w:rFonts w:ascii="Lato" w:hAnsi="Lato"/>
-          <w:color w:val="FF0000"/>
+          <w:sz w:val="20"/>
+          <w:szCs w:val="20"/>
+          <w:lang w:val="en-US"/>
+        </w:rPr>
+        <w:t xml:space="preserve">  0.735% - National plus 0.6015% - Local (Total 1.3365%) (or a sum </w:t>
+      </w:r>
+      <w:r>
+        <w:rPr>
+          <w:rFonts w:ascii="Lato" w:hAnsi="Lato"/>
+          <w:sz w:val="20"/>
+          <w:szCs w:val="20"/>
+          <w:lang w:val="en-US"/>
         </w:rPr>
         <w:t>equivalent two (2) hours and twenty (20) minutes straight time pay per month</w:t>
       </w:r>
       <w:r>
         <w:rPr>
           <w:rFonts w:ascii="Lato" w:hAnsi="Lato"/>
-          <w:color w:val="FF0000"/>
+          <w:sz w:val="20"/>
+          <w:szCs w:val="20"/>
+          <w:lang w:val="en-US"/>
         </w:rPr>
         <w:t xml:space="preserve"> based on a 40 hr work week</w:t>
       </w:r>
       <w:r>
         <w:rPr>
           <w:rFonts w:ascii="Lato" w:hAnsi="Lato"/>
-          <w:color w:val="FF0000"/>
+          <w:sz w:val="20"/>
+          <w:szCs w:val="20"/>
+          <w:lang w:val="en-US"/>
         </w:rPr>
         <w:t>)</w:t>
       </w:r>
       <w:r>
         <w:rPr>
           <w:rFonts w:ascii="Lato" w:hAnsi="Lato"/>
-          <w:color w:val="FF0000"/>
-        </w:rPr>
-        <w:t xml:space="preserve">, </w:t>
-      </w:r>
-      <w:r>
-        <w:rPr>
-          <w:rFonts w:ascii="Lato" w:hAnsi="Lato"/>
-        </w:rPr>
-        <w:t xml:space="preserve">including cost-of-living allowance and any other amounts normally considered as part of a regular pay, but not including shift premium pursuant to Article 15 Section G of the constitution of the National Union Unifor-Canada. </w:t>
+          <w:sz w:val="20"/>
+          <w:szCs w:val="20"/>
+          <w:lang w:val="en-US"/>
+        </w:rPr>
+        <w:t xml:space="preserve">, including cost-of-living allowance and any other amounts normally considered as part of a regular pay, but not including shift premium pursuant to Article 15 Section G of the constitution of the National Union Unifor-Canada. </w:t>
       </w:r>
     </w:p>
     <w:p>
@@ -5538,14 +5536,18 @@
         <w:ind w:left="1134" w:hanging="1134"/>
         <w:rPr>
           <w:rFonts w:ascii="Lato" w:hAnsi="Lato"/>
-          <w:sz w:val="20"/>
-          <w:szCs w:val="20"/>
-          <w:lang w:val="en-US"/>
-        </w:rPr>
-      </w:pPr>
-      <w:r>
-        <w:rPr>
-          <w:rFonts w:ascii="Lato" w:hAnsi="Lato"/>
+          <w:strike/>
+          <w:color w:val="00B050"/>
+          <w:sz w:val="20"/>
+          <w:szCs w:val="20"/>
+          <w:lang w:val="en-US"/>
+        </w:rPr>
+      </w:pPr>
+      <w:r>
+        <w:rPr>
+          <w:rFonts w:ascii="Lato" w:hAnsi="Lato"/>
+          <w:strike/>
+          <w:color w:val="00B050"/>
           <w:sz w:val="20"/>
           <w:szCs w:val="20"/>
           <w:lang w:val="en-US"/>

</xml_diff>

<commit_message>
Article 13 section 1A
Removed - At least 10% of membership or a minimum of 8 (whichever is greater)

added - A minimum of eight (8) members present

Section 3

Added - A quorum of the Executive Board is a simple majority of the members.

removed - Fifty (50%) percent of the Executive Officers shall be considered a quorum for an executive meeting.

Section 4

removed - at least ten (10%) percent of the unit membership or a minimum of 8 (whichever is greater)

added -  a minimum of eight (8)

Signed-off-by: frothbeast <frothbeast@gmail.com>
</commit_message>
<xml_diff>
--- a/Union bylaws.docx
+++ b/Union bylaws.docx
@@ -419,19 +419,7 @@
           <w:sz w:val="28"/>
           <w:szCs w:val="28"/>
         </w:rPr>
-        <w:t xml:space="preserve"> Dec 06, </w:t>
-      </w:r>
-      <w:proofErr w:type="gramStart"/>
-      <w:r>
-        <w:rPr>
-          <w:rFonts w:ascii="Lato" w:hAnsi="Lato"/>
-          <w:b/>
-          <w:bCs/>
-          <w:color w:val="FF0000"/>
-          <w:sz w:val="28"/>
-          <w:szCs w:val="28"/>
-        </w:rPr>
-        <w:t xml:space="preserve">2024 </w:t>
+        <w:t xml:space="preserve"> Dec 06, 2024 </w:t>
       </w:r>
       <w:r>
         <w:rPr>
@@ -443,20 +431,7 @@
           <w:sz w:val="28"/>
           <w:szCs w:val="28"/>
         </w:rPr>
-        <w:t xml:space="preserve"> Dec</w:t>
-      </w:r>
-      <w:proofErr w:type="gramEnd"/>
-      <w:r>
-        <w:rPr>
-          <w:rFonts w:ascii="Lato" w:hAnsi="Lato"/>
-          <w:b/>
-          <w:bCs/>
-          <w:strike/>
-          <w:color w:val="FF0000"/>
-          <w:sz w:val="28"/>
-          <w:szCs w:val="28"/>
-        </w:rPr>
-        <w:t xml:space="preserve"> 12, 2017</w:t>
+        <w:t xml:space="preserve"> Dec 12, 2017</w:t>
       </w:r>
     </w:p>
     <w:p>
@@ -647,21 +622,7 @@
         <w:rPr>
           <w:rFonts w:ascii="Lato" w:hAnsi="Lato"/>
         </w:rPr>
-        <w:t xml:space="preserve">The objectives of this organization </w:t>
-      </w:r>
-      <w:proofErr w:type="gramStart"/>
-      <w:r>
-        <w:rPr>
-          <w:rFonts w:ascii="Lato" w:hAnsi="Lato"/>
-        </w:rPr>
-        <w:t>shall</w:t>
-      </w:r>
-      <w:proofErr w:type="gramEnd"/>
-      <w:r>
-        <w:rPr>
-          <w:rFonts w:ascii="Lato" w:hAnsi="Lato"/>
-        </w:rPr>
-        <w:t xml:space="preserve"> be to improve the working </w:t>
+        <w:t xml:space="preserve">The objectives of this organization shall be to improve the working </w:t>
       </w:r>
       <w:r>
         <w:rPr>
@@ -3952,31 +3913,7 @@
           <w:szCs w:val="20"/>
           <w:lang w:val="en-US"/>
         </w:rPr>
-        <w:t xml:space="preserve">Every member in good standing, (currently active, or a member who has been laid off for more than seven (7) months and has notified the Financial Secretary of their intention to remain in good standing, no less than one (1) month prior to the date of the election) shall be entitled to vote at all local union </w:t>
-      </w:r>
-      <w:proofErr w:type="gramStart"/>
-      <w:r>
-        <w:rPr>
-          <w:rFonts w:ascii="Lato" w:hAnsi="Lato"/>
-          <w:strike/>
-          <w:color w:val="00B050"/>
-          <w:sz w:val="20"/>
-          <w:szCs w:val="20"/>
-          <w:lang w:val="en-US"/>
-        </w:rPr>
-        <w:t>election</w:t>
-      </w:r>
-      <w:proofErr w:type="gramEnd"/>
-      <w:r>
-        <w:rPr>
-          <w:rFonts w:ascii="Lato" w:hAnsi="Lato"/>
-          <w:strike/>
-          <w:color w:val="00B050"/>
-          <w:sz w:val="20"/>
-          <w:szCs w:val="20"/>
-          <w:lang w:val="en-US"/>
-        </w:rPr>
-        <w:t>.</w:t>
+        <w:t>Every member in good standing, (currently active, or a member who has been laid off for more than seven (7) months and has notified the Financial Secretary of their intention to remain in good standing, no less than one (1) month prior to the date of the election) shall be entitled to vote at all local union election.</w:t>
       </w:r>
     </w:p>
     <w:p>
@@ -5592,16 +5529,89 @@
           <w:szCs w:val="24"/>
           <w:lang w:val="en-US"/>
         </w:rPr>
+        <w:lastRenderedPageBreak/>
         <w:t>Article 13 - Membership Meetings and Quorums</w:t>
       </w:r>
     </w:p>
     <w:p>
       <w:pPr>
+        <w:keepNext/>
+        <w:keepLines/>
+        <w:ind w:left="1134" w:hanging="1134"/>
+        <w:rPr>
+          <w:rFonts w:ascii="Lato" w:hAnsi="Lato"/>
+          <w:b/>
+          <w:bCs/>
+          <w:color w:val="00B050"/>
+        </w:rPr>
+      </w:pPr>
+      <w:r>
+        <w:rPr>
+          <w:rFonts w:ascii="Lato" w:hAnsi="Lato"/>
+          <w:b/>
+          <w:bCs/>
+          <w:color w:val="00B050"/>
+        </w:rPr>
+        <w:t>General:</w:t>
+      </w:r>
+      <w:r>
+        <w:rPr>
+          <w:rFonts w:ascii="Lato" w:hAnsi="Lato"/>
+          <w:b/>
+          <w:bCs/>
+          <w:color w:val="00B050"/>
+        </w:rPr>
+        <w:tab/>
+      </w:r>
+      <w:r>
+        <w:rPr>
+          <w:rFonts w:ascii="Lato" w:hAnsi="Lato"/>
+          <w:color w:val="00B050"/>
+        </w:rPr>
+        <w:t>General Membership Meetings and each Unit’s Meetings must be held at least every three</w:t>
+      </w:r>
+      <w:r>
+        <w:rPr>
+          <w:color w:val="00B050"/>
+        </w:rPr>
+        <w:t xml:space="preserve"> </w:t>
+      </w:r>
+      <w:r>
+        <w:rPr>
+          <w:rFonts w:ascii="Lato" w:hAnsi="Lato"/>
+          <w:color w:val="00B050"/>
+        </w:rPr>
+        <w:t>months. Please amend the current language. (Article 15, F, Section 1 of the Unifor</w:t>
+      </w:r>
+      <w:r>
+        <w:rPr>
+          <w:color w:val="00B050"/>
+        </w:rPr>
+        <w:t xml:space="preserve"> </w:t>
+      </w:r>
+      <w:r>
+        <w:rPr>
+          <w:rFonts w:ascii="Lato" w:hAnsi="Lato"/>
+          <w:color w:val="00B050"/>
+        </w:rPr>
+        <w:t>Constitution</w:t>
+      </w:r>
+      <w:r>
+        <w:rPr>
+          <w:rFonts w:ascii="Lato" w:hAnsi="Lato"/>
+          <w:b/>
+          <w:bCs/>
+          <w:color w:val="00B050"/>
+        </w:rPr>
+        <w:t>)</w:t>
+      </w:r>
+    </w:p>
+    <w:p>
+      <w:pPr>
         <w:pStyle w:val="ListParagraph"/>
         <w:keepNext/>
         <w:keepLines/>
         <w:ind w:left="1500"/>
-        <w:jc w:val="center"/>
         <w:rPr>
           <w:rFonts w:ascii="Lato" w:hAnsi="Lato"/>
           <w:b/>
@@ -5641,7 +5651,8 @@
       <w:r>
         <w:rPr>
           <w:rFonts w:ascii="Lato" w:hAnsi="Lato"/>
-          <w:color w:val="FF0000"/>
+          <w:strike/>
+          <w:color w:val="00B050"/>
           <w:sz w:val="20"/>
           <w:szCs w:val="20"/>
           <w:lang w:val="en-US"/>
@@ -5651,45 +5662,72 @@
       <w:r>
         <w:rPr>
           <w:rFonts w:ascii="Lato" w:hAnsi="Lato"/>
-          <w:strike/>
-          <w:color w:val="FF0000"/>
-          <w:sz w:val="20"/>
-          <w:szCs w:val="20"/>
-          <w:lang w:val="en-US"/>
-        </w:rPr>
-        <w:t>A total of twenty</w:t>
-      </w:r>
-      <w:r>
-        <w:rPr>
-          <w:rFonts w:ascii="Lato" w:hAnsi="Lato"/>
-          <w:strike/>
-          <w:color w:val="FF0000"/>
-          <w:sz w:val="20"/>
-          <w:szCs w:val="20"/>
-          <w:lang w:val="en-US"/>
-        </w:rPr>
-        <w:t>-</w:t>
-      </w:r>
-      <w:r>
-        <w:rPr>
-          <w:rFonts w:ascii="Lato" w:hAnsi="Lato"/>
-          <w:strike/>
-          <w:color w:val="FF0000"/>
-          <w:sz w:val="20"/>
-          <w:szCs w:val="20"/>
-          <w:lang w:val="en-US"/>
-        </w:rPr>
-        <w:t>five (25) members present</w:t>
-      </w:r>
-      <w:r>
-        <w:rPr>
-          <w:rFonts w:ascii="Lato" w:hAnsi="Lato"/>
-          <w:color w:val="FF0000"/>
-          <w:sz w:val="20"/>
-          <w:szCs w:val="20"/>
-          <w:lang w:val="en-US"/>
-        </w:rPr>
-        <w:t xml:space="preserve"> </w:t>
+          <w:color w:val="00B050"/>
+          <w:sz w:val="20"/>
+          <w:szCs w:val="20"/>
+          <w:lang w:val="en-US"/>
+        </w:rPr>
+        <w:t xml:space="preserve">A </w:t>
+      </w:r>
+      <w:r>
+        <w:rPr>
+          <w:rFonts w:ascii="Lato" w:hAnsi="Lato"/>
+          <w:color w:val="00B050"/>
+          <w:sz w:val="20"/>
+          <w:szCs w:val="20"/>
+          <w:lang w:val="en-US"/>
+        </w:rPr>
+        <w:t xml:space="preserve">minimum </w:t>
+      </w:r>
+      <w:r>
+        <w:rPr>
+          <w:rFonts w:ascii="Lato" w:hAnsi="Lato"/>
+          <w:color w:val="00B050"/>
+          <w:sz w:val="20"/>
+          <w:szCs w:val="20"/>
+          <w:lang w:val="en-US"/>
+        </w:rPr>
+        <w:t xml:space="preserve">of </w:t>
+      </w:r>
+      <w:r>
+        <w:rPr>
+          <w:rFonts w:ascii="Lato" w:hAnsi="Lato"/>
+          <w:color w:val="00B050"/>
+          <w:sz w:val="20"/>
+          <w:szCs w:val="20"/>
+          <w:lang w:val="en-US"/>
+        </w:rPr>
+        <w:t>eight</w:t>
+      </w:r>
+      <w:r>
+        <w:rPr>
+          <w:rFonts w:ascii="Lato" w:hAnsi="Lato"/>
+          <w:color w:val="00B050"/>
+          <w:sz w:val="20"/>
+          <w:szCs w:val="20"/>
+          <w:lang w:val="en-US"/>
+        </w:rPr>
+        <w:t xml:space="preserve"> (</w:t>
+      </w:r>
+      <w:r>
+        <w:rPr>
+          <w:rFonts w:ascii="Lato" w:hAnsi="Lato"/>
+          <w:color w:val="00B050"/>
+          <w:sz w:val="20"/>
+          <w:szCs w:val="20"/>
+          <w:lang w:val="en-US"/>
+        </w:rPr>
+        <w:t>8</w:t>
+      </w:r>
+      <w:r>
+        <w:rPr>
+          <w:rFonts w:ascii="Lato" w:hAnsi="Lato"/>
+          <w:color w:val="00B050"/>
+          <w:sz w:val="20"/>
+          <w:szCs w:val="20"/>
+          <w:lang w:val="en-US"/>
+        </w:rPr>
+        <w:t xml:space="preserve">) members present </w:t>
       </w:r>
       <w:r>
         <w:rPr>
@@ -5794,19 +5832,52 @@
         <w:ind w:left="1134" w:hanging="1134"/>
         <w:rPr>
           <w:rFonts w:ascii="Lato" w:hAnsi="Lato"/>
-          <w:sz w:val="20"/>
-          <w:szCs w:val="20"/>
-          <w:lang w:val="en-US"/>
-        </w:rPr>
-      </w:pPr>
-      <w:r>
-        <w:rPr>
-          <w:rFonts w:ascii="Lato" w:hAnsi="Lato"/>
-          <w:sz w:val="20"/>
-          <w:szCs w:val="20"/>
-          <w:lang w:val="en-US"/>
-        </w:rPr>
-        <w:t xml:space="preserve">Fifty (50%) percent of the Executive Officers shall be considered a quorum for an executive meeting. </w:t>
+          <w:color w:val="00B050"/>
+          <w:sz w:val="20"/>
+          <w:szCs w:val="20"/>
+          <w:lang w:val="en-US"/>
+        </w:rPr>
+      </w:pPr>
+      <w:r>
+        <w:rPr>
+          <w:rFonts w:ascii="Lato" w:hAnsi="Lato"/>
+          <w:color w:val="00B050"/>
+          <w:sz w:val="20"/>
+          <w:szCs w:val="20"/>
+          <w:lang w:val="en-US"/>
+        </w:rPr>
+        <w:t>A quorum of the Executive Board is a simple majority of the members</w:t>
+      </w:r>
+      <w:r>
+        <w:rPr>
+          <w:rFonts w:ascii="Lato" w:hAnsi="Lato"/>
+          <w:color w:val="00B050"/>
+          <w:sz w:val="20"/>
+          <w:szCs w:val="20"/>
+          <w:lang w:val="en-US"/>
+        </w:rPr>
+        <w:t xml:space="preserve">. </w:t>
+      </w:r>
+      <w:r>
+        <w:rPr>
+          <w:rFonts w:ascii="Lato" w:hAnsi="Lato"/>
+          <w:strike/>
+          <w:color w:val="00B050"/>
+          <w:sz w:val="20"/>
+          <w:szCs w:val="20"/>
+          <w:lang w:val="en-US"/>
+        </w:rPr>
+        <w:t>Fifty (50%) percent of the Executive Officers shall be considered a quorum for an executive meeting</w:t>
+      </w:r>
+      <w:r>
+        <w:rPr>
+          <w:rFonts w:ascii="Lato" w:hAnsi="Lato"/>
+          <w:color w:val="00B050"/>
+          <w:sz w:val="20"/>
+          <w:szCs w:val="20"/>
+          <w:lang w:val="en-US"/>
+        </w:rPr>
+        <w:t xml:space="preserve">. </w:t>
       </w:r>
     </w:p>
     <w:p>
@@ -5833,11 +5904,54 @@
           <w:szCs w:val="20"/>
           <w:lang w:val="en-US"/>
         </w:rPr>
-        <w:t>For Unit meetings at least ten (10%) percent of the unit membership</w:t>
-      </w:r>
-      <w:r>
-        <w:rPr>
-          <w:rFonts w:ascii="Lato" w:hAnsi="Lato"/>
+        <w:t xml:space="preserve">For Unit </w:t>
+      </w:r>
+      <w:r>
+        <w:rPr>
+          <w:rFonts w:ascii="Lato" w:hAnsi="Lato"/>
+          <w:sz w:val="20"/>
+          <w:szCs w:val="20"/>
+          <w:lang w:val="en-US"/>
+        </w:rPr>
+        <w:t>meetings</w:t>
+      </w:r>
+      <w:r>
+        <w:rPr>
+          <w:rFonts w:ascii="Lato" w:hAnsi="Lato"/>
+          <w:strike/>
+          <w:color w:val="00B050"/>
+          <w:sz w:val="20"/>
+          <w:szCs w:val="20"/>
+          <w:lang w:val="en-US"/>
+        </w:rPr>
+        <w:t xml:space="preserve"> at least ten (10%) percent of the unit membership</w:t>
+      </w:r>
+      <w:r>
+        <w:rPr>
+          <w:rFonts w:ascii="Lato" w:hAnsi="Lato"/>
+          <w:strike/>
+          <w:color w:val="00B050"/>
+          <w:sz w:val="20"/>
+          <w:szCs w:val="20"/>
+          <w:lang w:val="en-US"/>
+        </w:rPr>
+        <w:t xml:space="preserve"> or a minimum of 8 (whichever is greater)</w:t>
+      </w:r>
+      <w:r>
+        <w:rPr>
+          <w:rFonts w:ascii="Lato" w:hAnsi="Lato"/>
+          <w:strike/>
+          <w:color w:val="00B050"/>
+          <w:sz w:val="20"/>
+          <w:szCs w:val="20"/>
+          <w:lang w:val="en-US"/>
+        </w:rPr>
+        <w:t xml:space="preserve"> not</w:t>
+      </w:r>
+      <w:r>
+        <w:rPr>
+          <w:rFonts w:ascii="Lato" w:hAnsi="Lato"/>
+          <w:color w:val="00B050"/>
           <w:sz w:val="20"/>
           <w:szCs w:val="20"/>
           <w:lang w:val="en-US"/>
@@ -5847,31 +5961,21 @@
       <w:r>
         <w:rPr>
           <w:rFonts w:ascii="Lato" w:hAnsi="Lato"/>
-          <w:color w:val="FF0000"/>
-          <w:sz w:val="20"/>
-          <w:szCs w:val="20"/>
-          <w:lang w:val="en-US"/>
-        </w:rPr>
-        <w:t>or a minimum of 8 (whichever is greater)</w:t>
-      </w:r>
-      <w:r>
-        <w:rPr>
-          <w:rFonts w:ascii="Lato" w:hAnsi="Lato"/>
-          <w:color w:val="FF0000"/>
-          <w:sz w:val="20"/>
-          <w:szCs w:val="20"/>
-          <w:lang w:val="en-US"/>
-        </w:rPr>
-        <w:t xml:space="preserve"> </w:t>
-      </w:r>
-      <w:r>
-        <w:rPr>
-          <w:rFonts w:ascii="Lato" w:hAnsi="Lato"/>
-          <w:sz w:val="20"/>
-          <w:szCs w:val="20"/>
-          <w:lang w:val="en-US"/>
-        </w:rPr>
-        <w:t>not including the bargaining committee shall constitute a quorum for the transaction of unit business. Notwithstanding the above, a Special Meeting may be called</w:t>
+          <w:color w:val="00B050"/>
+          <w:sz w:val="20"/>
+          <w:szCs w:val="20"/>
+          <w:lang w:val="en-US"/>
+        </w:rPr>
+        <w:t xml:space="preserve"> a minimum of eight (8) </w:t>
+      </w:r>
+      <w:r>
+        <w:rPr>
+          <w:rFonts w:ascii="Lato" w:hAnsi="Lato"/>
+          <w:sz w:val="20"/>
+          <w:szCs w:val="20"/>
+          <w:lang w:val="en-US"/>
+        </w:rPr>
+        <w:t>including the bargaining committee shall constitute a quorum for the transaction of unit business. Notwithstanding the above, a Special Meeting may be called</w:t>
       </w:r>
       <w:r>
         <w:rPr>
@@ -5983,7 +6087,6 @@
           <w:szCs w:val="24"/>
           <w:lang w:val="en-US"/>
         </w:rPr>
-        <w:lastRenderedPageBreak/>
         <w:t>Article 14 - Order of Business</w:t>
       </w:r>
     </w:p>
@@ -6254,6 +6357,7 @@
           <w:szCs w:val="24"/>
           <w:lang w:val="en-US"/>
         </w:rPr>
+        <w:lastRenderedPageBreak/>
         <w:t>Article 15</w:t>
       </w:r>
       <w:r>
@@ -6648,7 +6752,6 @@
           <w:szCs w:val="24"/>
           <w:lang w:val="en-US"/>
         </w:rPr>
-        <w:lastRenderedPageBreak/>
         <w:t>Article 17 - Sick and Visitation Committee</w:t>
       </w:r>
     </w:p>
@@ -7037,6 +7140,7 @@
           <w:szCs w:val="24"/>
           <w:lang w:val="en-US"/>
         </w:rPr>
+        <w:lastRenderedPageBreak/>
         <w:t>Article 18 - Bylaw Committee, Procedure and Amendments</w:t>
       </w:r>
     </w:p>
@@ -7202,47 +7306,7 @@
           <w:szCs w:val="20"/>
           <w:lang w:val="en-US"/>
         </w:rPr>
-        <w:t xml:space="preserve">A vote shall be taken on the recommendations of the bylaw </w:t>
-      </w:r>
-      <w:proofErr w:type="gramStart"/>
-      <w:r>
-        <w:rPr>
-          <w:rFonts w:ascii="Lato" w:hAnsi="Lato"/>
-          <w:sz w:val="20"/>
-          <w:szCs w:val="20"/>
-          <w:lang w:val="en-US"/>
-        </w:rPr>
-        <w:t>committee</w:t>
-      </w:r>
-      <w:proofErr w:type="gramEnd"/>
-      <w:r>
-        <w:rPr>
-          <w:rFonts w:ascii="Lato" w:hAnsi="Lato"/>
-          <w:sz w:val="20"/>
-          <w:szCs w:val="20"/>
-          <w:lang w:val="en-US"/>
-        </w:rPr>
-        <w:t xml:space="preserve"> and it </w:t>
-      </w:r>
-      <w:proofErr w:type="gramStart"/>
-      <w:r>
-        <w:rPr>
-          <w:rFonts w:ascii="Lato" w:hAnsi="Lato"/>
-          <w:sz w:val="20"/>
-          <w:szCs w:val="20"/>
-          <w:lang w:val="en-US"/>
-        </w:rPr>
-        <w:t>shall</w:t>
-      </w:r>
-      <w:proofErr w:type="gramEnd"/>
-      <w:r>
-        <w:rPr>
-          <w:rFonts w:ascii="Lato" w:hAnsi="Lato"/>
-          <w:sz w:val="20"/>
-          <w:szCs w:val="20"/>
-          <w:lang w:val="en-US"/>
-        </w:rPr>
-        <w:t xml:space="preserve"> require a majority vote for adoption. </w:t>
+        <w:t xml:space="preserve">A vote shall be taken on the recommendations of the bylaw committee and it shall require a majority vote for adoption. </w:t>
       </w:r>
     </w:p>
     <w:p>
@@ -7298,47 +7362,7 @@
           <w:szCs w:val="20"/>
           <w:lang w:val="en-US"/>
         </w:rPr>
-        <w:t xml:space="preserve">The bylaws of the local union shall at all times be subordinate and subject to the provisions of the constitution of the National Union Unifor-Canada as such a constitution now </w:t>
-      </w:r>
-      <w:proofErr w:type="gramStart"/>
-      <w:r>
-        <w:rPr>
-          <w:rFonts w:ascii="Lato" w:hAnsi="Lato"/>
-          <w:sz w:val="20"/>
-          <w:szCs w:val="20"/>
-          <w:lang w:val="en-US"/>
-        </w:rPr>
-        <w:t>exists, or</w:t>
-      </w:r>
-      <w:proofErr w:type="gramEnd"/>
-      <w:r>
-        <w:rPr>
-          <w:rFonts w:ascii="Lato" w:hAnsi="Lato"/>
-          <w:sz w:val="20"/>
-          <w:szCs w:val="20"/>
-          <w:lang w:val="en-US"/>
-        </w:rPr>
-        <w:t xml:space="preserve"> may from </w:t>
-      </w:r>
-      <w:proofErr w:type="gramStart"/>
-      <w:r>
-        <w:rPr>
-          <w:rFonts w:ascii="Lato" w:hAnsi="Lato"/>
-          <w:sz w:val="20"/>
-          <w:szCs w:val="20"/>
-          <w:lang w:val="en-US"/>
-        </w:rPr>
-        <w:t>time to time</w:t>
-      </w:r>
-      <w:proofErr w:type="gramEnd"/>
-      <w:r>
-        <w:rPr>
-          <w:rFonts w:ascii="Lato" w:hAnsi="Lato"/>
-          <w:sz w:val="20"/>
-          <w:szCs w:val="20"/>
-          <w:lang w:val="en-US"/>
-        </w:rPr>
-        <w:t xml:space="preserve"> hereafter be altered or amended: and in the event of any conflict the constitution of the National Union Unifor-Canada shall govern.</w:t>
+        <w:t>The bylaws of the local union shall at all times be subordinate and subject to the provisions of the constitution of the National Union Unifor-Canada as such a constitution now exists, or may from time to time hereafter be altered or amended: and in the event of any conflict the constitution of the National Union Unifor-Canada shall govern.</w:t>
       </w:r>
     </w:p>
     <w:p>
@@ -7381,7 +7405,6 @@
           <w:szCs w:val="24"/>
           <w:lang w:val="en-US"/>
         </w:rPr>
-        <w:lastRenderedPageBreak/>
         <w:t>Article 19 - Delegates from Local</w:t>
       </w:r>
     </w:p>
@@ -7522,6 +7545,7 @@
           <w:szCs w:val="24"/>
           <w:lang w:val="en-US"/>
         </w:rPr>
+        <w:lastRenderedPageBreak/>
         <w:t xml:space="preserve">Article 20 </w:t>
       </w:r>
       <w:r>
@@ -11837,6 +11861,178 @@
     </w:lvl>
   </w:abstractNum>
   <w:abstractNum w:abstractNumId="19" w15:restartNumberingAfterBreak="0">
+    <w:nsid w:val="5FE35D72"/>
+    <w:multiLevelType w:val="multilevel"/>
+    <w:tmpl w:val="BEAC3F9A"/>
+    <w:lvl w:ilvl="0">
+      <w:start w:val="1"/>
+      <w:numFmt w:val="decimal"/>
+      <w:lvlText w:val="%1."/>
+      <w:lvlJc w:val="left"/>
+      <w:pPr>
+        <w:ind w:left="2220" w:hanging="360"/>
+      </w:pPr>
+    </w:lvl>
+    <w:lvl w:ilvl="1">
+      <w:start w:val="1"/>
+      <w:numFmt w:val="lowerLetter"/>
+      <w:lvlText w:val="%2."/>
+      <w:lvlJc w:val="left"/>
+      <w:pPr>
+        <w:ind w:left="2940" w:hanging="360"/>
+      </w:pPr>
+    </w:lvl>
+    <w:lvl w:ilvl="2">
+      <w:start w:val="1"/>
+      <w:numFmt w:val="lowerRoman"/>
+      <w:lvlText w:val="%3."/>
+      <w:lvlJc w:val="right"/>
+      <w:pPr>
+        <w:ind w:left="3660" w:hanging="180"/>
+      </w:pPr>
+    </w:lvl>
+    <w:lvl w:ilvl="3">
+      <w:start w:val="1"/>
+      <w:numFmt w:val="decimal"/>
+      <w:lvlText w:val="%4."/>
+      <w:lvlJc w:val="left"/>
+      <w:pPr>
+        <w:ind w:left="4380" w:hanging="360"/>
+      </w:pPr>
+    </w:lvl>
+    <w:lvl w:ilvl="4">
+      <w:start w:val="1"/>
+      <w:numFmt w:val="lowerLetter"/>
+      <w:lvlText w:val="%5."/>
+      <w:lvlJc w:val="left"/>
+      <w:pPr>
+        <w:ind w:left="5100" w:hanging="360"/>
+      </w:pPr>
+    </w:lvl>
+    <w:lvl w:ilvl="5">
+      <w:start w:val="1"/>
+      <w:numFmt w:val="lowerRoman"/>
+      <w:lvlText w:val="%6."/>
+      <w:lvlJc w:val="right"/>
+      <w:pPr>
+        <w:ind w:left="5820" w:hanging="180"/>
+      </w:pPr>
+    </w:lvl>
+    <w:lvl w:ilvl="6">
+      <w:start w:val="1"/>
+      <w:numFmt w:val="decimal"/>
+      <w:lvlText w:val="%7."/>
+      <w:lvlJc w:val="left"/>
+      <w:pPr>
+        <w:ind w:left="6540" w:hanging="360"/>
+      </w:pPr>
+    </w:lvl>
+    <w:lvl w:ilvl="7">
+      <w:start w:val="1"/>
+      <w:numFmt w:val="lowerLetter"/>
+      <w:lvlText w:val="%8."/>
+      <w:lvlJc w:val="left"/>
+      <w:pPr>
+        <w:ind w:left="7260" w:hanging="360"/>
+      </w:pPr>
+    </w:lvl>
+    <w:lvl w:ilvl="8">
+      <w:start w:val="1"/>
+      <w:numFmt w:val="lowerRoman"/>
+      <w:lvlText w:val="%9."/>
+      <w:lvlJc w:val="right"/>
+      <w:pPr>
+        <w:ind w:left="7980" w:hanging="180"/>
+      </w:pPr>
+    </w:lvl>
+  </w:abstractNum>
+  <w:abstractNum w:abstractNumId="20" w15:restartNumberingAfterBreak="0">
+    <w:nsid w:val="656F1522"/>
+    <w:multiLevelType w:val="hybridMultilevel"/>
+    <w:tmpl w:val="BEAC3F9A"/>
+    <w:lvl w:ilvl="0" w:tplc="1009000F">
+      <w:start w:val="1"/>
+      <w:numFmt w:val="decimal"/>
+      <w:lvlText w:val="%1."/>
+      <w:lvlJc w:val="left"/>
+      <w:pPr>
+        <w:ind w:left="2220" w:hanging="360"/>
+      </w:pPr>
+    </w:lvl>
+    <w:lvl w:ilvl="1" w:tplc="10090019" w:tentative="1">
+      <w:start w:val="1"/>
+      <w:numFmt w:val="lowerLetter"/>
+      <w:lvlText w:val="%2."/>
+      <w:lvlJc w:val="left"/>
+      <w:pPr>
+        <w:ind w:left="2940" w:hanging="360"/>
+      </w:pPr>
+    </w:lvl>
+    <w:lvl w:ilvl="2" w:tplc="1009001B" w:tentative="1">
+      <w:start w:val="1"/>
+      <w:numFmt w:val="lowerRoman"/>
+      <w:lvlText w:val="%3."/>
+      <w:lvlJc w:val="right"/>
+      <w:pPr>
+        <w:ind w:left="3660" w:hanging="180"/>
+      </w:pPr>
+    </w:lvl>
+    <w:lvl w:ilvl="3" w:tplc="1009000F" w:tentative="1">
+      <w:start w:val="1"/>
+      <w:numFmt w:val="decimal"/>
+      <w:lvlText w:val="%4."/>
+      <w:lvlJc w:val="left"/>
+      <w:pPr>
+        <w:ind w:left="4380" w:hanging="360"/>
+      </w:pPr>
+    </w:lvl>
+    <w:lvl w:ilvl="4" w:tplc="10090019" w:tentative="1">
+      <w:start w:val="1"/>
+      <w:numFmt w:val="lowerLetter"/>
+      <w:lvlText w:val="%5."/>
+      <w:lvlJc w:val="left"/>
+      <w:pPr>
+        <w:ind w:left="5100" w:hanging="360"/>
+      </w:pPr>
+    </w:lvl>
+    <w:lvl w:ilvl="5" w:tplc="1009001B" w:tentative="1">
+      <w:start w:val="1"/>
+      <w:numFmt w:val="lowerRoman"/>
+      <w:lvlText w:val="%6."/>
+      <w:lvlJc w:val="right"/>
+      <w:pPr>
+        <w:ind w:left="5820" w:hanging="180"/>
+      </w:pPr>
+    </w:lvl>
+    <w:lvl w:ilvl="6" w:tplc="1009000F" w:tentative="1">
+      <w:start w:val="1"/>
+      <w:numFmt w:val="decimal"/>
+      <w:lvlText w:val="%7."/>
+      <w:lvlJc w:val="left"/>
+      <w:pPr>
+        <w:ind w:left="6540" w:hanging="360"/>
+      </w:pPr>
+    </w:lvl>
+    <w:lvl w:ilvl="7" w:tplc="10090019" w:tentative="1">
+      <w:start w:val="1"/>
+      <w:numFmt w:val="lowerLetter"/>
+      <w:lvlText w:val="%8."/>
+      <w:lvlJc w:val="left"/>
+      <w:pPr>
+        <w:ind w:left="7260" w:hanging="360"/>
+      </w:pPr>
+    </w:lvl>
+    <w:lvl w:ilvl="8" w:tplc="1009001B" w:tentative="1">
+      <w:start w:val="1"/>
+      <w:numFmt w:val="lowerRoman"/>
+      <w:lvlText w:val="%9."/>
+      <w:lvlJc w:val="right"/>
+      <w:pPr>
+        <w:ind w:left="7980" w:hanging="180"/>
+      </w:pPr>
+    </w:lvl>
+  </w:abstractNum>
+  <w:abstractNum w:abstractNumId="21" w15:restartNumberingAfterBreak="0">
     <w:nsid w:val="781C0FAB"/>
     <w:multiLevelType w:val="hybridMultilevel"/>
     <w:tmpl w:val="2256BD46"/>
@@ -11953,7 +12149,7 @@
     <w:abstractNumId w:val="14"/>
   </w:num>
   <w:num w:numId="10" w16cid:durableId="1568765555">
-    <w:abstractNumId w:val="19"/>
+    <w:abstractNumId w:val="21"/>
   </w:num>
   <w:num w:numId="11" w16cid:durableId="2091610213">
     <w:abstractNumId w:val="3"/>
@@ -11984,6 +12180,12 @@
   </w:num>
   <w:num w:numId="20" w16cid:durableId="1256522059">
     <w:abstractNumId w:val="7"/>
+  </w:num>
+  <w:num w:numId="21" w16cid:durableId="1561165154">
+    <w:abstractNumId w:val="20"/>
+  </w:num>
+  <w:num w:numId="22" w16cid:durableId="1861579560">
+    <w:abstractNumId w:val="19"/>
   </w:num>
 </w:numbering>
 </file>

</xml_diff>

<commit_message>
Article 18 section 2 D
added - Amendments to existing By-Laws, or new By-Laws must be submitted to the National Executive Board for approval. The amendments, or the new By-Laws are not effective until approved by the National Executive Board.” (Article 15, A, 4 of the Unifor Constitution).

removed - All local union bylaws except attendance rules are in full force and effective upon submission to the National Union Unifor-Canada.

Signed-off-by: frothbeast <frothbeast@gmail.com>
</commit_message>
<xml_diff>
--- a/Union bylaws.docx
+++ b/Union bylaws.docx
@@ -419,7 +419,19 @@
           <w:sz w:val="28"/>
           <w:szCs w:val="28"/>
         </w:rPr>
-        <w:t xml:space="preserve"> Dec 06, 2024 </w:t>
+        <w:t xml:space="preserve"> Dec 06, </w:t>
+      </w:r>
+      <w:proofErr w:type="gramStart"/>
+      <w:r>
+        <w:rPr>
+          <w:rFonts w:ascii="Lato" w:hAnsi="Lato"/>
+          <w:b/>
+          <w:bCs/>
+          <w:color w:val="FF0000"/>
+          <w:sz w:val="28"/>
+          <w:szCs w:val="28"/>
+        </w:rPr>
+        <w:t xml:space="preserve">2024 </w:t>
       </w:r>
       <w:r>
         <w:rPr>
@@ -431,7 +443,20 @@
           <w:sz w:val="28"/>
           <w:szCs w:val="28"/>
         </w:rPr>
-        <w:t xml:space="preserve"> Dec 12, 2017</w:t>
+        <w:t xml:space="preserve"> Dec</w:t>
+      </w:r>
+      <w:proofErr w:type="gramEnd"/>
+      <w:r>
+        <w:rPr>
+          <w:rFonts w:ascii="Lato" w:hAnsi="Lato"/>
+          <w:b/>
+          <w:bCs/>
+          <w:strike/>
+          <w:color w:val="FF0000"/>
+          <w:sz w:val="28"/>
+          <w:szCs w:val="28"/>
+        </w:rPr>
+        <w:t xml:space="preserve"> 12, 2017</w:t>
       </w:r>
     </w:p>
     <w:p>
@@ -622,7 +647,21 @@
         <w:rPr>
           <w:rFonts w:ascii="Lato" w:hAnsi="Lato"/>
         </w:rPr>
-        <w:t xml:space="preserve">The objectives of this organization shall be to improve the working </w:t>
+        <w:t xml:space="preserve">The objectives of this organization </w:t>
+      </w:r>
+      <w:proofErr w:type="gramStart"/>
+      <w:r>
+        <w:rPr>
+          <w:rFonts w:ascii="Lato" w:hAnsi="Lato"/>
+        </w:rPr>
+        <w:t>shall</w:t>
+      </w:r>
+      <w:proofErr w:type="gramEnd"/>
+      <w:r>
+        <w:rPr>
+          <w:rFonts w:ascii="Lato" w:hAnsi="Lato"/>
+        </w:rPr>
+        <w:t xml:space="preserve"> be to improve the working </w:t>
       </w:r>
       <w:r>
         <w:rPr>
@@ -3913,7 +3952,31 @@
           <w:szCs w:val="20"/>
           <w:lang w:val="en-US"/>
         </w:rPr>
-        <w:t>Every member in good standing, (currently active, or a member who has been laid off for more than seven (7) months and has notified the Financial Secretary of their intention to remain in good standing, no less than one (1) month prior to the date of the election) shall be entitled to vote at all local union election.</w:t>
+        <w:t xml:space="preserve">Every member in good standing, (currently active, or a member who has been laid off for more than seven (7) months and has notified the Financial Secretary of their intention to remain in good standing, no less than one (1) month prior to the date of the election) shall be entitled to vote at all local union </w:t>
+      </w:r>
+      <w:proofErr w:type="gramStart"/>
+      <w:r>
+        <w:rPr>
+          <w:rFonts w:ascii="Lato" w:hAnsi="Lato"/>
+          <w:strike/>
+          <w:color w:val="00B050"/>
+          <w:sz w:val="20"/>
+          <w:szCs w:val="20"/>
+          <w:lang w:val="en-US"/>
+        </w:rPr>
+        <w:t>election</w:t>
+      </w:r>
+      <w:proofErr w:type="gramEnd"/>
+      <w:r>
+        <w:rPr>
+          <w:rFonts w:ascii="Lato" w:hAnsi="Lato"/>
+          <w:strike/>
+          <w:color w:val="00B050"/>
+          <w:sz w:val="20"/>
+          <w:szCs w:val="20"/>
+          <w:lang w:val="en-US"/>
+        </w:rPr>
+        <w:t>.</w:t>
       </w:r>
     </w:p>
     <w:p>
@@ -5727,16 +5790,58 @@
           <w:szCs w:val="20"/>
           <w:lang w:val="en-US"/>
         </w:rPr>
-        <w:t xml:space="preserve">) members present </w:t>
-      </w:r>
-      <w:r>
-        <w:rPr>
-          <w:rFonts w:ascii="Lato" w:hAnsi="Lato"/>
-          <w:sz w:val="20"/>
-          <w:szCs w:val="20"/>
-          <w:lang w:val="en-US"/>
-        </w:rPr>
-        <w:t xml:space="preserve">including the Executive Board, at a regular meeting of the general membership of the local Union shall constitute a quorum for the transaction of Union business. All known new business at the time of posting the meeting shall be listed on the agenda. Notice of a regular membership meeting must be posted at least seven (7) days prior to the meeting. </w:t>
+        <w:t xml:space="preserve">) members </w:t>
+      </w:r>
+      <w:proofErr w:type="gramStart"/>
+      <w:r>
+        <w:rPr>
+          <w:rFonts w:ascii="Lato" w:hAnsi="Lato"/>
+          <w:color w:val="00B050"/>
+          <w:sz w:val="20"/>
+          <w:szCs w:val="20"/>
+          <w:lang w:val="en-US"/>
+        </w:rPr>
+        <w:t>present</w:t>
+      </w:r>
+      <w:proofErr w:type="gramEnd"/>
+      <w:r>
+        <w:rPr>
+          <w:rFonts w:ascii="Lato" w:hAnsi="Lato"/>
+          <w:color w:val="00B050"/>
+          <w:sz w:val="20"/>
+          <w:szCs w:val="20"/>
+          <w:lang w:val="en-US"/>
+        </w:rPr>
+        <w:t xml:space="preserve"> </w:t>
+      </w:r>
+      <w:r>
+        <w:rPr>
+          <w:rFonts w:ascii="Lato" w:hAnsi="Lato"/>
+          <w:sz w:val="20"/>
+          <w:szCs w:val="20"/>
+          <w:lang w:val="en-US"/>
+        </w:rPr>
+        <w:t xml:space="preserve">including the Executive Board, at a regular meeting of the general membership of the local </w:t>
+      </w:r>
+      <w:proofErr w:type="gramStart"/>
+      <w:r>
+        <w:rPr>
+          <w:rFonts w:ascii="Lato" w:hAnsi="Lato"/>
+          <w:sz w:val="20"/>
+          <w:szCs w:val="20"/>
+          <w:lang w:val="en-US"/>
+        </w:rPr>
+        <w:t>Union</w:t>
+      </w:r>
+      <w:proofErr w:type="gramEnd"/>
+      <w:r>
+        <w:rPr>
+          <w:rFonts w:ascii="Lato" w:hAnsi="Lato"/>
+          <w:sz w:val="20"/>
+          <w:szCs w:val="20"/>
+          <w:lang w:val="en-US"/>
+        </w:rPr>
+        <w:t xml:space="preserve"> shall constitute a quorum for the transaction of Union business. All known new business at the time of posting the meeting shall be listed on the agenda. Notice of a regular membership meeting must be posted at least seven (7) days prior to the meeting. </w:t>
       </w:r>
     </w:p>
     <w:p>
@@ -5838,15 +5943,27 @@
           <w:lang w:val="en-US"/>
         </w:rPr>
       </w:pPr>
-      <w:r>
-        <w:rPr>
-          <w:rFonts w:ascii="Lato" w:hAnsi="Lato"/>
-          <w:color w:val="00B050"/>
-          <w:sz w:val="20"/>
-          <w:szCs w:val="20"/>
-          <w:lang w:val="en-US"/>
-        </w:rPr>
-        <w:t>A quorum of the Executive Board is a simple majority of the members</w:t>
+      <w:proofErr w:type="gramStart"/>
+      <w:r>
+        <w:rPr>
+          <w:rFonts w:ascii="Lato" w:hAnsi="Lato"/>
+          <w:color w:val="00B050"/>
+          <w:sz w:val="20"/>
+          <w:szCs w:val="20"/>
+          <w:lang w:val="en-US"/>
+        </w:rPr>
+        <w:t>A quorum</w:t>
+      </w:r>
+      <w:proofErr w:type="gramEnd"/>
+      <w:r>
+        <w:rPr>
+          <w:rFonts w:ascii="Lato" w:hAnsi="Lato"/>
+          <w:color w:val="00B050"/>
+          <w:sz w:val="20"/>
+          <w:szCs w:val="20"/>
+          <w:lang w:val="en-US"/>
+        </w:rPr>
+        <w:t xml:space="preserve"> of the Executive Board is a simple majority of the members</w:t>
       </w:r>
       <w:r>
         <w:rPr>
@@ -5946,27 +6063,50 @@
           <w:szCs w:val="20"/>
           <w:lang w:val="en-US"/>
         </w:rPr>
-        <w:t xml:space="preserve"> not</w:t>
-      </w:r>
-      <w:r>
-        <w:rPr>
-          <w:rFonts w:ascii="Lato" w:hAnsi="Lato"/>
-          <w:color w:val="00B050"/>
-          <w:sz w:val="20"/>
-          <w:szCs w:val="20"/>
-          <w:lang w:val="en-US"/>
-        </w:rPr>
         <w:t xml:space="preserve"> </w:t>
       </w:r>
-      <w:r>
-        <w:rPr>
-          <w:rFonts w:ascii="Lato" w:hAnsi="Lato"/>
-          <w:color w:val="00B050"/>
-          <w:sz w:val="20"/>
-          <w:szCs w:val="20"/>
-          <w:lang w:val="en-US"/>
-        </w:rPr>
-        <w:t xml:space="preserve"> a minimum of eight (8) </w:t>
+      <w:proofErr w:type="gramStart"/>
+      <w:r>
+        <w:rPr>
+          <w:rFonts w:ascii="Lato" w:hAnsi="Lato"/>
+          <w:strike/>
+          <w:color w:val="00B050"/>
+          <w:sz w:val="20"/>
+          <w:szCs w:val="20"/>
+          <w:lang w:val="en-US"/>
+        </w:rPr>
+        <w:t>not</w:t>
+      </w:r>
+      <w:r>
+        <w:rPr>
+          <w:rFonts w:ascii="Lato" w:hAnsi="Lato"/>
+          <w:color w:val="00B050"/>
+          <w:sz w:val="20"/>
+          <w:szCs w:val="20"/>
+          <w:lang w:val="en-US"/>
+        </w:rPr>
+        <w:t xml:space="preserve"> </w:t>
+      </w:r>
+      <w:r>
+        <w:rPr>
+          <w:rFonts w:ascii="Lato" w:hAnsi="Lato"/>
+          <w:color w:val="00B050"/>
+          <w:sz w:val="20"/>
+          <w:szCs w:val="20"/>
+          <w:lang w:val="en-US"/>
+        </w:rPr>
+        <w:t xml:space="preserve"> a</w:t>
+      </w:r>
+      <w:proofErr w:type="gramEnd"/>
+      <w:r>
+        <w:rPr>
+          <w:rFonts w:ascii="Lato" w:hAnsi="Lato"/>
+          <w:color w:val="00B050"/>
+          <w:sz w:val="20"/>
+          <w:szCs w:val="20"/>
+          <w:lang w:val="en-US"/>
+        </w:rPr>
+        <w:t xml:space="preserve"> minimum of eight (8) </w:t>
       </w:r>
       <w:r>
         <w:rPr>
@@ -7753,7 +7893,47 @@
           <w:szCs w:val="20"/>
           <w:lang w:val="en-US"/>
         </w:rPr>
-        <w:t xml:space="preserve">A vote shall be taken on the recommendations of the bylaw committee and it shall require a majority vote for adoption. </w:t>
+        <w:t xml:space="preserve">A vote shall be taken on the recommendations of the bylaw </w:t>
+      </w:r>
+      <w:proofErr w:type="gramStart"/>
+      <w:r>
+        <w:rPr>
+          <w:rFonts w:ascii="Lato" w:hAnsi="Lato"/>
+          <w:sz w:val="20"/>
+          <w:szCs w:val="20"/>
+          <w:lang w:val="en-US"/>
+        </w:rPr>
+        <w:t>committee</w:t>
+      </w:r>
+      <w:proofErr w:type="gramEnd"/>
+      <w:r>
+        <w:rPr>
+          <w:rFonts w:ascii="Lato" w:hAnsi="Lato"/>
+          <w:sz w:val="20"/>
+          <w:szCs w:val="20"/>
+          <w:lang w:val="en-US"/>
+        </w:rPr>
+        <w:t xml:space="preserve"> and it </w:t>
+      </w:r>
+      <w:proofErr w:type="gramStart"/>
+      <w:r>
+        <w:rPr>
+          <w:rFonts w:ascii="Lato" w:hAnsi="Lato"/>
+          <w:sz w:val="20"/>
+          <w:szCs w:val="20"/>
+          <w:lang w:val="en-US"/>
+        </w:rPr>
+        <w:t>shall</w:t>
+      </w:r>
+      <w:proofErr w:type="gramEnd"/>
+      <w:r>
+        <w:rPr>
+          <w:rFonts w:ascii="Lato" w:hAnsi="Lato"/>
+          <w:sz w:val="20"/>
+          <w:szCs w:val="20"/>
+          <w:lang w:val="en-US"/>
+        </w:rPr>
+        <w:t xml:space="preserve"> require a majority vote for adoption. </w:t>
       </w:r>
     </w:p>
     <w:p>
@@ -7769,14 +7949,84 @@
         <w:jc w:val="both"/>
         <w:rPr>
           <w:rFonts w:ascii="Lato" w:hAnsi="Lato"/>
-          <w:sz w:val="20"/>
-          <w:szCs w:val="20"/>
-          <w:lang w:val="en-US"/>
-        </w:rPr>
-      </w:pPr>
-      <w:r>
-        <w:rPr>
-          <w:rFonts w:ascii="Lato" w:hAnsi="Lato"/>
+          <w:color w:val="00B050"/>
+          <w:sz w:val="20"/>
+          <w:szCs w:val="20"/>
+          <w:lang w:val="en-US"/>
+        </w:rPr>
+      </w:pPr>
+      <w:r>
+        <w:rPr>
+          <w:rFonts w:ascii="Lato" w:hAnsi="Lato"/>
+          <w:color w:val="00B050"/>
+          <w:sz w:val="20"/>
+          <w:szCs w:val="20"/>
+          <w:lang w:val="en-US"/>
+        </w:rPr>
+        <w:t>Amendments to existing By-Laws, or new By-Laws must be submitted to the National</w:t>
+      </w:r>
+      <w:r>
+        <w:rPr>
+          <w:rFonts w:ascii="Lato" w:hAnsi="Lato"/>
+          <w:color w:val="00B050"/>
+          <w:sz w:val="20"/>
+          <w:szCs w:val="20"/>
+          <w:lang w:val="en-US"/>
+        </w:rPr>
+        <w:t xml:space="preserve"> </w:t>
+      </w:r>
+      <w:r>
+        <w:rPr>
+          <w:rFonts w:ascii="Lato" w:hAnsi="Lato"/>
+          <w:color w:val="00B050"/>
+          <w:sz w:val="20"/>
+          <w:szCs w:val="20"/>
+          <w:lang w:val="en-US"/>
+        </w:rPr>
+        <w:t>Executive Board for approval. The amendments, or the new By-Laws are not effective until</w:t>
+      </w:r>
+      <w:r>
+        <w:rPr>
+          <w:rFonts w:ascii="Lato" w:hAnsi="Lato"/>
+          <w:color w:val="00B050"/>
+          <w:sz w:val="20"/>
+          <w:szCs w:val="20"/>
+          <w:lang w:val="en-US"/>
+        </w:rPr>
+        <w:t xml:space="preserve"> </w:t>
+      </w:r>
+      <w:r>
+        <w:rPr>
+          <w:rFonts w:ascii="Lato" w:hAnsi="Lato"/>
+          <w:color w:val="00B050"/>
+          <w:sz w:val="20"/>
+          <w:szCs w:val="20"/>
+          <w:lang w:val="en-US"/>
+        </w:rPr>
+        <w:t>approved by the National Executive Board.” (Article 15, A, 4 of the Unifor Constitution).</w:t>
+      </w:r>
+    </w:p>
+    <w:p>
+      <w:pPr>
+        <w:pStyle w:val="ListParagraph"/>
+        <w:keepNext/>
+        <w:keepLines/>
+        <w:ind w:left="1134"/>
+        <w:jc w:val="both"/>
+        <w:rPr>
+          <w:rFonts w:ascii="Lato" w:hAnsi="Lato"/>
+          <w:strike/>
+          <w:color w:val="00B050"/>
+          <w:sz w:val="20"/>
+          <w:szCs w:val="20"/>
+          <w:lang w:val="en-US"/>
+        </w:rPr>
+      </w:pPr>
+      <w:r>
+        <w:rPr>
+          <w:rFonts w:ascii="Lato" w:hAnsi="Lato"/>
+          <w:strike/>
+          <w:color w:val="00B050"/>
           <w:sz w:val="20"/>
           <w:szCs w:val="20"/>
           <w:lang w:val="en-US"/>
@@ -7809,7 +8059,47 @@
           <w:szCs w:val="20"/>
           <w:lang w:val="en-US"/>
         </w:rPr>
-        <w:t>The bylaws of the local union shall at all times be subordinate and subject to the provisions of the constitution of the National Union Unifor-Canada as such a constitution now exists, or may from time to time hereafter be altered or amended: and in the event of any conflict the constitution of the National Union Unifor-Canada shall govern.</w:t>
+        <w:t xml:space="preserve">The bylaws of the local union shall at all times be subordinate and subject to the provisions of the constitution of the National Union Unifor-Canada as such a constitution now </w:t>
+      </w:r>
+      <w:proofErr w:type="gramStart"/>
+      <w:r>
+        <w:rPr>
+          <w:rFonts w:ascii="Lato" w:hAnsi="Lato"/>
+          <w:sz w:val="20"/>
+          <w:szCs w:val="20"/>
+          <w:lang w:val="en-US"/>
+        </w:rPr>
+        <w:t>exists, or</w:t>
+      </w:r>
+      <w:proofErr w:type="gramEnd"/>
+      <w:r>
+        <w:rPr>
+          <w:rFonts w:ascii="Lato" w:hAnsi="Lato"/>
+          <w:sz w:val="20"/>
+          <w:szCs w:val="20"/>
+          <w:lang w:val="en-US"/>
+        </w:rPr>
+        <w:t xml:space="preserve"> may from </w:t>
+      </w:r>
+      <w:proofErr w:type="gramStart"/>
+      <w:r>
+        <w:rPr>
+          <w:rFonts w:ascii="Lato" w:hAnsi="Lato"/>
+          <w:sz w:val="20"/>
+          <w:szCs w:val="20"/>
+          <w:lang w:val="en-US"/>
+        </w:rPr>
+        <w:t>time to time</w:t>
+      </w:r>
+      <w:proofErr w:type="gramEnd"/>
+      <w:r>
+        <w:rPr>
+          <w:rFonts w:ascii="Lato" w:hAnsi="Lato"/>
+          <w:sz w:val="20"/>
+          <w:szCs w:val="20"/>
+          <w:lang w:val="en-US"/>
+        </w:rPr>
+        <w:t xml:space="preserve"> hereafter be altered or amended: and in the event of any conflict the constitution of the National Union Unifor-Canada shall govern.</w:t>
       </w:r>
     </w:p>
     <w:p>

</xml_diff>

<commit_message>
Article 21 Section 4:
Added - Each Local Union will set out in its By-Laws the number of petitioners required for a recall and the quorum needed to hold a recall meeting. The Local Union By-Laws shall provide that a recall petition must be supported by at least 25% of the members that the representative represents, and the quorum for the special meeting must be at least 50% of the members that the representative represents.

removed - A majority vote of those present and voting is necessary to recall. The petition requirement and quorum requirements must be the same percentage figure. It should not be less than twenty-five (25%) percent, or more than fifty (50%) percent of the members represented.

Signed-off-by: frothbeast <frothbeast@gmail.com>
</commit_message>
<xml_diff>
--- a/Union bylaws.docx
+++ b/Union bylaws.docx
@@ -9461,23 +9461,143 @@
         <w:jc w:val="both"/>
         <w:rPr>
           <w:rFonts w:ascii="Lato" w:hAnsi="Lato"/>
-          <w:sz w:val="20"/>
-          <w:szCs w:val="20"/>
-          <w:lang w:val="en-US"/>
-        </w:rPr>
-      </w:pPr>
-      <w:r>
-        <w:rPr>
-          <w:rFonts w:ascii="Lato" w:hAnsi="Lato"/>
-          <w:sz w:val="20"/>
-          <w:szCs w:val="20"/>
-          <w:lang w:val="en-US"/>
-        </w:rPr>
-        <w:t xml:space="preserve">A majority vote of those present and voting is necessary to recall. The petition requirement and quorum requirements must be the same percentage figure. It should not be less than twenty-five (25%) </w:t>
-      </w:r>
-      <w:r>
-        <w:rPr>
-          <w:rFonts w:ascii="Lato" w:hAnsi="Lato"/>
+          <w:color w:val="00B050"/>
+          <w:sz w:val="20"/>
+          <w:szCs w:val="20"/>
+          <w:lang w:val="en-US"/>
+        </w:rPr>
+      </w:pPr>
+      <w:r>
+        <w:rPr>
+          <w:rFonts w:ascii="Lato" w:hAnsi="Lato"/>
+          <w:color w:val="00B050"/>
+          <w:sz w:val="20"/>
+          <w:szCs w:val="20"/>
+          <w:lang w:val="en-US"/>
+        </w:rPr>
+        <w:t>Each Local Union will set out in its By-Laws the number of petitioners required for a recall and</w:t>
+      </w:r>
+      <w:r>
+        <w:rPr>
+          <w:color w:val="00B050"/>
+        </w:rPr>
+        <w:t xml:space="preserve"> </w:t>
+      </w:r>
+      <w:r>
+        <w:rPr>
+          <w:rFonts w:ascii="Lato" w:hAnsi="Lato"/>
+          <w:color w:val="00B050"/>
+          <w:sz w:val="20"/>
+          <w:szCs w:val="20"/>
+          <w:lang w:val="en-US"/>
+        </w:rPr>
+        <w:t>the quorum needed to hold a recall meeting. The Local Union By-Laws shall provide that a</w:t>
+      </w:r>
+      <w:r>
+        <w:rPr>
+          <w:color w:val="00B050"/>
+        </w:rPr>
+        <w:t xml:space="preserve"> </w:t>
+      </w:r>
+      <w:r>
+        <w:rPr>
+          <w:rFonts w:ascii="Lato" w:hAnsi="Lato"/>
+          <w:color w:val="00B050"/>
+          <w:sz w:val="20"/>
+          <w:szCs w:val="20"/>
+          <w:lang w:val="en-US"/>
+        </w:rPr>
+        <w:t>recall petition must be supported by at least 25% of the members that the representative</w:t>
+      </w:r>
+      <w:r>
+        <w:rPr>
+          <w:color w:val="00B050"/>
+        </w:rPr>
+        <w:t xml:space="preserve"> </w:t>
+      </w:r>
+      <w:r>
+        <w:rPr>
+          <w:rFonts w:ascii="Lato" w:hAnsi="Lato"/>
+          <w:color w:val="00B050"/>
+          <w:sz w:val="20"/>
+          <w:szCs w:val="20"/>
+          <w:lang w:val="en-US"/>
+        </w:rPr>
+        <w:t>represents, and the quorum for the special meeting must be at least 50% of the members that</w:t>
+      </w:r>
+      <w:r>
+        <w:rPr>
+          <w:color w:val="00B050"/>
+        </w:rPr>
+        <w:t xml:space="preserve"> </w:t>
+      </w:r>
+      <w:r>
+        <w:rPr>
+          <w:rFonts w:ascii="Lato" w:hAnsi="Lato"/>
+          <w:color w:val="00B050"/>
+          <w:sz w:val="20"/>
+          <w:szCs w:val="20"/>
+          <w:lang w:val="en-US"/>
+        </w:rPr>
+        <w:t>the representative represents.</w:t>
+      </w:r>
+    </w:p>
+    <w:p>
+      <w:pPr>
+        <w:pStyle w:val="ListParagraph"/>
+        <w:keepNext/>
+        <w:keepLines/>
+        <w:ind w:left="1134"/>
+        <w:jc w:val="both"/>
+        <w:rPr>
+          <w:rFonts w:ascii="Lato" w:hAnsi="Lato"/>
+          <w:strike/>
+          <w:color w:val="00B050"/>
+          <w:sz w:val="20"/>
+          <w:szCs w:val="20"/>
+          <w:lang w:val="en-US"/>
+        </w:rPr>
+      </w:pPr>
+      <w:r>
+        <w:rPr>
+          <w:rFonts w:ascii="Lato" w:hAnsi="Lato"/>
+          <w:strike/>
+          <w:color w:val="00B050"/>
+          <w:sz w:val="20"/>
+          <w:szCs w:val="20"/>
+          <w:lang w:val="en-US"/>
+        </w:rPr>
+        <w:t xml:space="preserve">A majority vote of those </w:t>
+      </w:r>
+      <w:proofErr w:type="gramStart"/>
+      <w:r>
+        <w:rPr>
+          <w:rFonts w:ascii="Lato" w:hAnsi="Lato"/>
+          <w:strike/>
+          <w:color w:val="00B050"/>
+          <w:sz w:val="20"/>
+          <w:szCs w:val="20"/>
+          <w:lang w:val="en-US"/>
+        </w:rPr>
+        <w:t>present</w:t>
+      </w:r>
+      <w:proofErr w:type="gramEnd"/>
+      <w:r>
+        <w:rPr>
+          <w:rFonts w:ascii="Lato" w:hAnsi="Lato"/>
+          <w:strike/>
+          <w:color w:val="00B050"/>
+          <w:sz w:val="20"/>
+          <w:szCs w:val="20"/>
+          <w:lang w:val="en-US"/>
+        </w:rPr>
+        <w:t xml:space="preserve"> and voting is necessary to recall. The petition requirement and quorum requirements must be the same percentage figure. It should not be less than twenty-five (25%) </w:t>
+      </w:r>
+      <w:r>
+        <w:rPr>
+          <w:rFonts w:ascii="Lato" w:hAnsi="Lato"/>
+          <w:strike/>
+          <w:color w:val="00B050"/>
           <w:sz w:val="20"/>
           <w:szCs w:val="20"/>
           <w:lang w:val="en-US"/>
@@ -9487,6 +9607,8 @@
       <w:r>
         <w:rPr>
           <w:rFonts w:ascii="Lato" w:hAnsi="Lato"/>
+          <w:strike/>
+          <w:color w:val="00B050"/>
           <w:sz w:val="20"/>
           <w:szCs w:val="20"/>
           <w:lang w:val="en-US"/>

</xml_diff>

<commit_message>
changed finalized at Johns
Signed-off-by: frothbeast <frothbeast@gmail.com>
</commit_message>
<xml_diff>
--- a/Union bylaws.docx
+++ b/Union bylaws.docx
@@ -699,14 +699,7 @@
           <w:rFonts w:ascii="Lato" w:hAnsi="Lato"/>
           <w:color w:val="00B050"/>
         </w:rPr>
-        <w:t xml:space="preserve"> T</w:t>
-      </w:r>
-      <w:r>
-        <w:rPr>
-          <w:rFonts w:ascii="Lato" w:hAnsi="Lato"/>
-          <w:color w:val="00B050"/>
-        </w:rPr>
-        <w:t>he regulation of labour relations and collective bargaining between employers and</w:t>
+        <w:t xml:space="preserve"> The regulation of labour relations and collective bargaining between employers and</w:t>
       </w:r>
       <w:r>
         <w:rPr>
@@ -3496,27 +3489,7 @@
           <w:szCs w:val="20"/>
           <w:lang w:val="en-US"/>
         </w:rPr>
-        <w:t>A member on layoff or leave ceases to be a member when they no longer have recall rights in</w:t>
-      </w:r>
-      <w:r>
-        <w:rPr>
-          <w:rFonts w:ascii="Lato" w:hAnsi="Lato"/>
-          <w:color w:val="00B050"/>
-          <w:sz w:val="20"/>
-          <w:szCs w:val="20"/>
-          <w:lang w:val="en-US"/>
-        </w:rPr>
-        <w:t xml:space="preserve"> </w:t>
-      </w:r>
-      <w:r>
-        <w:rPr>
-          <w:rFonts w:ascii="Lato" w:hAnsi="Lato"/>
-          <w:color w:val="00B050"/>
-          <w:sz w:val="20"/>
-          <w:szCs w:val="20"/>
-          <w:lang w:val="en-US"/>
-        </w:rPr>
-        <w:t>their collective agreement, or when the member’s employment has permanently ended</w:t>
+        <w:t>A member on layoff or leave ceases to be a member when they no longer have recall rights in their collective agreement, or when the member’s employment has permanently ended</w:t>
       </w:r>
       <w:r>
         <w:rPr>
@@ -3670,6 +3643,200 @@
           <w:lang w:val="en-US"/>
         </w:rPr>
       </w:pPr>
+      <w:proofErr w:type="gramStart"/>
+      <w:r>
+        <w:rPr>
+          <w:rFonts w:ascii="Lato" w:hAnsi="Lato"/>
+          <w:color w:val="00B050"/>
+          <w:sz w:val="20"/>
+          <w:szCs w:val="20"/>
+          <w:lang w:val="en-US"/>
+        </w:rPr>
+        <w:t>Nominations,</w:t>
+      </w:r>
+      <w:proofErr w:type="gramEnd"/>
+      <w:r>
+        <w:rPr>
+          <w:rFonts w:ascii="Lato" w:hAnsi="Lato"/>
+          <w:color w:val="00B050"/>
+          <w:sz w:val="20"/>
+          <w:szCs w:val="20"/>
+          <w:lang w:val="en-US"/>
+        </w:rPr>
+        <w:t xml:space="preserve"> elections of officers will follow </w:t>
+      </w:r>
+      <w:r>
+        <w:rPr>
+          <w:rFonts w:ascii="Lato" w:hAnsi="Lato"/>
+          <w:color w:val="00B050"/>
+          <w:sz w:val="20"/>
+          <w:szCs w:val="20"/>
+          <w:lang w:val="en-US"/>
+        </w:rPr>
+        <w:t>U</w:t>
+      </w:r>
+      <w:r>
+        <w:rPr>
+          <w:rFonts w:ascii="Lato" w:hAnsi="Lato"/>
+          <w:color w:val="00B050"/>
+          <w:sz w:val="20"/>
+          <w:szCs w:val="20"/>
+          <w:lang w:val="en-US"/>
+        </w:rPr>
+        <w:t xml:space="preserve">nifor national’s </w:t>
+      </w:r>
+      <w:r>
+        <w:rPr>
+          <w:rFonts w:ascii="Lato" w:hAnsi="Lato"/>
+          <w:color w:val="00B050"/>
+          <w:sz w:val="20"/>
+          <w:szCs w:val="20"/>
+          <w:lang w:val="en-US"/>
+        </w:rPr>
+        <w:t>‘P</w:t>
+      </w:r>
+      <w:r>
+        <w:rPr>
+          <w:rFonts w:ascii="Lato" w:hAnsi="Lato"/>
+          <w:color w:val="00B050"/>
+          <w:sz w:val="20"/>
+          <w:szCs w:val="20"/>
+          <w:lang w:val="en-US"/>
+        </w:rPr>
+        <w:t xml:space="preserve">olicy </w:t>
+      </w:r>
+      <w:r>
+        <w:rPr>
+          <w:rFonts w:ascii="Lato" w:hAnsi="Lato"/>
+          <w:color w:val="00B050"/>
+          <w:sz w:val="20"/>
+          <w:szCs w:val="20"/>
+          <w:lang w:val="en-US"/>
+        </w:rPr>
+        <w:t>R</w:t>
+      </w:r>
+      <w:r>
+        <w:rPr>
+          <w:rFonts w:ascii="Lato" w:hAnsi="Lato"/>
+          <w:color w:val="00B050"/>
+          <w:sz w:val="20"/>
+          <w:szCs w:val="20"/>
+          <w:lang w:val="en-US"/>
+        </w:rPr>
+        <w:t>egard</w:t>
+      </w:r>
+      <w:r>
+        <w:rPr>
+          <w:rFonts w:ascii="Lato" w:hAnsi="Lato"/>
+          <w:color w:val="00B050"/>
+          <w:sz w:val="20"/>
+          <w:szCs w:val="20"/>
+          <w:lang w:val="en-US"/>
+        </w:rPr>
+        <w:t>ing</w:t>
+      </w:r>
+      <w:r>
+        <w:rPr>
+          <w:rFonts w:ascii="Lato" w:hAnsi="Lato"/>
+          <w:color w:val="00B050"/>
+          <w:sz w:val="20"/>
+          <w:szCs w:val="20"/>
+          <w:lang w:val="en-US"/>
+        </w:rPr>
+        <w:t xml:space="preserve"> </w:t>
+      </w:r>
+      <w:r>
+        <w:rPr>
+          <w:rFonts w:ascii="Lato" w:hAnsi="Lato"/>
+          <w:color w:val="00B050"/>
+          <w:sz w:val="20"/>
+          <w:szCs w:val="20"/>
+          <w:lang w:val="en-US"/>
+        </w:rPr>
+        <w:t>L</w:t>
+      </w:r>
+      <w:r>
+        <w:rPr>
+          <w:rFonts w:ascii="Lato" w:hAnsi="Lato"/>
+          <w:color w:val="00B050"/>
+          <w:sz w:val="20"/>
+          <w:szCs w:val="20"/>
+          <w:lang w:val="en-US"/>
+        </w:rPr>
+        <w:t xml:space="preserve">ocal </w:t>
+      </w:r>
+      <w:r>
+        <w:rPr>
+          <w:rFonts w:ascii="Lato" w:hAnsi="Lato"/>
+          <w:color w:val="00B050"/>
+          <w:sz w:val="20"/>
+          <w:szCs w:val="20"/>
+          <w:lang w:val="en-US"/>
+        </w:rPr>
+        <w:t>U</w:t>
+      </w:r>
+      <w:r>
+        <w:rPr>
+          <w:rFonts w:ascii="Lato" w:hAnsi="Lato"/>
+          <w:color w:val="00B050"/>
+          <w:sz w:val="20"/>
+          <w:szCs w:val="20"/>
+          <w:lang w:val="en-US"/>
+        </w:rPr>
+        <w:t xml:space="preserve">nion </w:t>
+      </w:r>
+      <w:proofErr w:type="gramStart"/>
+      <w:r>
+        <w:rPr>
+          <w:rFonts w:ascii="Lato" w:hAnsi="Lato"/>
+          <w:color w:val="00B050"/>
+          <w:sz w:val="20"/>
+          <w:szCs w:val="20"/>
+          <w:lang w:val="en-US"/>
+        </w:rPr>
+        <w:t>E</w:t>
+      </w:r>
+      <w:r>
+        <w:rPr>
+          <w:rFonts w:ascii="Lato" w:hAnsi="Lato"/>
+          <w:color w:val="00B050"/>
+          <w:sz w:val="20"/>
+          <w:szCs w:val="20"/>
+          <w:lang w:val="en-US"/>
+        </w:rPr>
+        <w:t>lections</w:t>
+      </w:r>
+      <w:r>
+        <w:rPr>
+          <w:rFonts w:ascii="Lato" w:hAnsi="Lato"/>
+          <w:color w:val="00B050"/>
+          <w:sz w:val="20"/>
+          <w:szCs w:val="20"/>
+          <w:lang w:val="en-US"/>
+        </w:rPr>
+        <w:t>’</w:t>
+      </w:r>
+      <w:r>
+        <w:rPr>
+          <w:rFonts w:ascii="Lato" w:hAnsi="Lato"/>
+          <w:color w:val="00B050"/>
+          <w:sz w:val="20"/>
+          <w:szCs w:val="20"/>
+          <w:lang w:val="en-US"/>
+        </w:rPr>
+        <w:t>.</w:t>
+      </w:r>
+      <w:proofErr w:type="gramEnd"/>
+      <w:r>
+        <w:rPr>
+          <w:rFonts w:ascii="Lato" w:hAnsi="Lato"/>
+          <w:color w:val="00B050"/>
+          <w:sz w:val="20"/>
+          <w:szCs w:val="20"/>
+          <w:lang w:val="en-US"/>
+        </w:rPr>
+        <w:t xml:space="preserve"> </w:t>
+      </w:r>
       <w:r>
         <w:rPr>
           <w:rFonts w:ascii="Lato" w:hAnsi="Lato"/>
@@ -3679,27 +3846,9 @@
           <w:szCs w:val="20"/>
           <w:lang w:val="en-US"/>
         </w:rPr>
-        <w:t>Any member in good standing may nominate any eligible member for office. Nominations shall be held at a General Membership meeting of the local and shall be made from the floor.  The membership shall be duly notified at least seven (7) days in advance of the time and place of nominations and notice containing both the time and place of the elections shall be given at least fifteen (15) days in advance of the election, and at least seven (7) days shall elapse between the time of nominations and the date the election shall take place.</w:t>
-      </w:r>
-    </w:p>
-    <w:p>
-      <w:pPr>
-        <w:pStyle w:val="ListParagraph"/>
-        <w:keepNext/>
-        <w:keepLines/>
-        <w:ind w:left="1134"/>
-        <w:rPr>
-          <w:rFonts w:ascii="Lato" w:hAnsi="Lato"/>
-          <w:color w:val="FF0000"/>
-        </w:rPr>
-      </w:pPr>
-    </w:p>
-    <w:p>
-      <w:pPr>
-        <w:pStyle w:val="ListParagraph"/>
-        <w:keepNext/>
-        <w:keepLines/>
-        <w:ind w:left="1134"/>
+        <w:t xml:space="preserve"> </w:t>
+      </w:r>
+      <w:r>
         <w:rPr>
           <w:rFonts w:ascii="Lato" w:hAnsi="Lato"/>
           <w:strike/>
@@ -3708,14 +3857,20 @@
           <w:szCs w:val="20"/>
           <w:lang w:val="en-US"/>
         </w:rPr>
-      </w:pPr>
-      <w:r>
+        <w:t>Any member in good standing may nominate any eligible member for office. Nominations shall be held at a General Membership meeting of the local and shall be made from the floor.  The membership shall be duly notified at least seven (7) days in advance of the time and place of nominations and notice containing both the time and place of the elections shall be given at least fifteen (15) days in advance of the election, and at least seven (7) days shall elapse between the time of nominations and the date the election shall take place.</w:t>
+      </w:r>
+    </w:p>
+    <w:p>
+      <w:pPr>
+        <w:pStyle w:val="ListParagraph"/>
+        <w:keepNext/>
+        <w:keepLines/>
+        <w:ind w:left="1134"/>
         <w:rPr>
           <w:rFonts w:ascii="Lato" w:hAnsi="Lato"/>
           <w:color w:val="FF0000"/>
         </w:rPr>
-        <w:t>A member in good standing has the right to propose any eligible member for a position in office. These nominations will be conducted during a General Membership meeting of the local, and they must be made during the meeting. The entire membership will be formally informed at least seven (7) days prior to the scheduled nominations, specifying both the time and location. Furthermore, a notice disclosing the time and place of the elections must be provided at least fifteen (15) days before the election date. Additionally, there should be a minimum of seven (7) days between the nomination period and the actual election date.</w:t>
-      </w:r>
+      </w:pPr>
     </w:p>
     <w:p>
       <w:pPr>
@@ -3725,12 +3880,46 @@
         <w:ind w:left="1134"/>
         <w:rPr>
           <w:rFonts w:ascii="Lato" w:hAnsi="Lato"/>
-          <w:color w:val="FF0000"/>
-          <w:sz w:val="20"/>
-          <w:szCs w:val="20"/>
-          <w:lang w:val="en-US"/>
-        </w:rPr>
-      </w:pPr>
+          <w:strike/>
+          <w:color w:val="00B050"/>
+          <w:sz w:val="20"/>
+          <w:szCs w:val="20"/>
+          <w:lang w:val="en-US"/>
+        </w:rPr>
+      </w:pPr>
+      <w:r>
+        <w:rPr>
+          <w:rFonts w:ascii="Lato" w:hAnsi="Lato"/>
+          <w:color w:val="00B050"/>
+        </w:rPr>
+        <w:t xml:space="preserve">A member in good standing has the right to propose any eligible member for a position in office. These nominations will be conducted during a General Membership meeting of the local, and they must be made during the meeting. </w:t>
+      </w:r>
+      <w:r>
+        <w:rPr>
+          <w:rFonts w:ascii="Lato" w:hAnsi="Lato"/>
+          <w:strike/>
+          <w:color w:val="00B050"/>
+        </w:rPr>
+        <w:t xml:space="preserve">The entire membership will be formally informed at least seven (7) days prior to the scheduled nominations, specifying both the time and location. Furthermore, a notice disclosing the time and place of the elections must be provided at least fifteen (15) days before the election date. Additionally, there </w:t>
+      </w:r>
+      <w:proofErr w:type="gramStart"/>
+      <w:r>
+        <w:rPr>
+          <w:rFonts w:ascii="Lato" w:hAnsi="Lato"/>
+          <w:strike/>
+          <w:color w:val="00B050"/>
+        </w:rPr>
+        <w:t>should will</w:t>
+      </w:r>
+      <w:proofErr w:type="gramEnd"/>
+      <w:r>
+        <w:rPr>
+          <w:rFonts w:ascii="Lato" w:hAnsi="Lato"/>
+          <w:strike/>
+          <w:color w:val="00B050"/>
+        </w:rPr>
+        <w:t xml:space="preserve"> be a minimum of seven (7) days between the nomination period and the actual election date.</w:t>
+      </w:r>
     </w:p>
     <w:p>
       <w:pPr>
@@ -3740,16 +3929,31 @@
         <w:ind w:left="1134"/>
         <w:rPr>
           <w:rFonts w:ascii="Lato" w:hAnsi="Lato"/>
-          <w:color w:val="FF0000"/>
-          <w:sz w:val="20"/>
-          <w:szCs w:val="20"/>
-          <w:lang w:val="en-US"/>
-        </w:rPr>
-      </w:pPr>
-      <w:r>
-        <w:rPr>
-          <w:rFonts w:ascii="Lato" w:hAnsi="Lato"/>
-          <w:color w:val="FF0000"/>
+          <w:color w:val="00B050"/>
+          <w:sz w:val="20"/>
+          <w:szCs w:val="20"/>
+          <w:lang w:val="en-US"/>
+        </w:rPr>
+      </w:pPr>
+    </w:p>
+    <w:p>
+      <w:pPr>
+        <w:pStyle w:val="ListParagraph"/>
+        <w:keepNext/>
+        <w:keepLines/>
+        <w:ind w:left="1134"/>
+        <w:rPr>
+          <w:rFonts w:ascii="Lato" w:hAnsi="Lato"/>
+          <w:color w:val="00B050"/>
+          <w:sz w:val="20"/>
+          <w:szCs w:val="20"/>
+          <w:lang w:val="en-US"/>
+        </w:rPr>
+      </w:pPr>
+      <w:r>
+        <w:rPr>
+          <w:rFonts w:ascii="Lato" w:hAnsi="Lato"/>
+          <w:color w:val="00B050"/>
           <w:sz w:val="20"/>
           <w:szCs w:val="20"/>
           <w:lang w:val="en-US"/>
@@ -3765,46 +3969,7 @@
         <w:ind w:left="1134"/>
         <w:rPr>
           <w:rFonts w:ascii="Lato" w:hAnsi="Lato"/>
-          <w:color w:val="FF0000"/>
-          <w:sz w:val="20"/>
-          <w:szCs w:val="20"/>
-          <w:lang w:val="en-US"/>
-        </w:rPr>
-      </w:pPr>
-    </w:p>
-    <w:p>
-      <w:pPr>
-        <w:pStyle w:val="ListParagraph"/>
-        <w:keepNext/>
-        <w:keepLines/>
-        <w:ind w:left="1134"/>
-        <w:rPr>
-          <w:rFonts w:ascii="Lato" w:hAnsi="Lato"/>
-          <w:color w:val="00B050"/>
-          <w:sz w:val="20"/>
-          <w:szCs w:val="20"/>
-          <w:lang w:val="en-US"/>
-        </w:rPr>
-      </w:pPr>
-      <w:r>
-        <w:rPr>
-          <w:rFonts w:ascii="Lato" w:hAnsi="Lato"/>
-          <w:color w:val="00B050"/>
-          <w:sz w:val="20"/>
-          <w:szCs w:val="20"/>
-          <w:lang w:val="en-US"/>
-        </w:rPr>
-        <w:t>Can we just reference ‘policy regarding local union elections?</w:t>
-      </w:r>
-    </w:p>
-    <w:p>
-      <w:pPr>
-        <w:pStyle w:val="ListParagraph"/>
-        <w:keepNext/>
-        <w:keepLines/>
-        <w:ind w:left="1134"/>
-        <w:rPr>
-          <w:rFonts w:ascii="Lato" w:hAnsi="Lato"/>
+          <w:color w:val="00B050"/>
           <w:sz w:val="20"/>
           <w:szCs w:val="20"/>
           <w:lang w:val="en-US"/>
@@ -3835,7 +4000,27 @@
           <w:szCs w:val="20"/>
           <w:lang w:val="en-US"/>
         </w:rPr>
-        <w:t xml:space="preserve"> Nominees shall notify to the Election Committee verbally or in writing of the intentions to stand for election within seventy-two (72) hours of the date of nomination. Failure to notify the Election Committee by the specified date will remove the nominee's name from the election list.</w:t>
+        <w:t xml:space="preserve"> Nominees shall </w:t>
+      </w:r>
+      <w:proofErr w:type="gramStart"/>
+      <w:r>
+        <w:rPr>
+          <w:rFonts w:ascii="Lato" w:hAnsi="Lato"/>
+          <w:sz w:val="20"/>
+          <w:szCs w:val="20"/>
+          <w:lang w:val="en-US"/>
+        </w:rPr>
+        <w:t>notify to</w:t>
+      </w:r>
+      <w:proofErr w:type="gramEnd"/>
+      <w:r>
+        <w:rPr>
+          <w:rFonts w:ascii="Lato" w:hAnsi="Lato"/>
+          <w:sz w:val="20"/>
+          <w:szCs w:val="20"/>
+          <w:lang w:val="en-US"/>
+        </w:rPr>
+        <w:t xml:space="preserve"> the Election Committee verbally or in writing of the intentions to stand for election within seventy-two (72) hours of the date of nomination. Failure to notify the Election Committee by the specified date will remove the nominee's name from the election list.</w:t>
       </w:r>
     </w:p>
     <w:p>
@@ -4001,47 +4186,7 @@
           <w:szCs w:val="20"/>
           <w:lang w:val="en-US"/>
         </w:rPr>
-        <w:t>Every member of a Local Union who is in good standing is eligible to vote in all Local Union</w:t>
-      </w:r>
-      <w:r>
-        <w:rPr>
-          <w:rFonts w:ascii="Lato" w:hAnsi="Lato"/>
-          <w:color w:val="00B050"/>
-          <w:sz w:val="20"/>
-          <w:szCs w:val="20"/>
-          <w:lang w:val="en-US"/>
-        </w:rPr>
-        <w:t xml:space="preserve"> </w:t>
-      </w:r>
-      <w:r>
-        <w:rPr>
-          <w:rFonts w:ascii="Lato" w:hAnsi="Lato"/>
-          <w:color w:val="00B050"/>
-          <w:sz w:val="20"/>
-          <w:szCs w:val="20"/>
-          <w:lang w:val="en-US"/>
-        </w:rPr>
-        <w:t>elections, unless disqualified from voting by a provision of the Unifor Constitution. Each</w:t>
-      </w:r>
-      <w:r>
-        <w:rPr>
-          <w:rFonts w:ascii="Lato" w:hAnsi="Lato"/>
-          <w:color w:val="00B050"/>
-          <w:sz w:val="20"/>
-          <w:szCs w:val="20"/>
-          <w:lang w:val="en-US"/>
-        </w:rPr>
-        <w:t xml:space="preserve"> </w:t>
-      </w:r>
-      <w:r>
-        <w:rPr>
-          <w:rFonts w:ascii="Lato" w:hAnsi="Lato"/>
-          <w:color w:val="00B050"/>
-          <w:sz w:val="20"/>
-          <w:szCs w:val="20"/>
-          <w:lang w:val="en-US"/>
-        </w:rPr>
-        <w:t>member who votes must vote personally. For clarity, proxy votes are not permitted.</w:t>
+        <w:t>Every member of a Local Union who is in good standing is eligible to vote in all Local Union elections, unless disqualified from voting by a provision of the Unifor Constitution. Each member who votes must vote personally. For clarity, proxy votes are not permitted.</w:t>
       </w:r>
     </w:p>
     <w:p>
@@ -4657,17 +4802,7 @@
           <w:szCs w:val="20"/>
           <w:lang w:val="en-US"/>
         </w:rPr>
-        <w:t>Procedure Policy on Constitutional Matters</w:t>
-      </w:r>
-      <w:r>
-        <w:rPr>
-          <w:rFonts w:ascii="Lato" w:hAnsi="Lato"/>
-          <w:color w:val="00B050"/>
-          <w:sz w:val="20"/>
-          <w:szCs w:val="20"/>
-          <w:lang w:val="en-US"/>
-        </w:rPr>
-        <w:t>.</w:t>
+        <w:t>Procedure Policy on Constitutional Matters.</w:t>
       </w:r>
     </w:p>
     <w:p>
@@ -4735,7 +4870,65 @@
           <w:szCs w:val="24"/>
           <w:lang w:val="en-US"/>
         </w:rPr>
-        <w:t>Article 10 - Expenses of Officers</w:t>
+        <w:t xml:space="preserve">Article 10 </w:t>
+      </w:r>
+      <w:r>
+        <w:rPr>
+          <w:rFonts w:ascii="Lato" w:hAnsi="Lato"/>
+          <w:b/>
+          <w:bCs/>
+          <w:sz w:val="24"/>
+          <w:szCs w:val="24"/>
+          <w:lang w:val="en-US"/>
+        </w:rPr>
+        <w:t>–</w:t>
+      </w:r>
+      <w:r>
+        <w:rPr>
+          <w:rFonts w:ascii="Lato" w:hAnsi="Lato"/>
+          <w:b/>
+          <w:bCs/>
+          <w:sz w:val="24"/>
+          <w:szCs w:val="24"/>
+          <w:lang w:val="en-US"/>
+        </w:rPr>
+        <w:t xml:space="preserve"> </w:t>
+      </w:r>
+      <w:r>
+        <w:rPr>
+          <w:rFonts w:ascii="Lato" w:hAnsi="Lato"/>
+          <w:b/>
+          <w:bCs/>
+          <w:color w:val="00B050"/>
+          <w:sz w:val="24"/>
+          <w:szCs w:val="24"/>
+          <w:lang w:val="en-US"/>
+        </w:rPr>
+        <w:t>Honorariums</w:t>
+      </w:r>
+      <w:r>
+        <w:rPr>
+          <w:rFonts w:ascii="Lato" w:hAnsi="Lato"/>
+          <w:b/>
+          <w:bCs/>
+          <w:sz w:val="24"/>
+          <w:szCs w:val="24"/>
+          <w:lang w:val="en-US"/>
+        </w:rPr>
+        <w:t xml:space="preserve"> </w:t>
+      </w:r>
+      <w:r>
+        <w:rPr>
+          <w:rFonts w:ascii="Lato" w:hAnsi="Lato"/>
+          <w:b/>
+          <w:bCs/>
+          <w:strike/>
+          <w:color w:val="00B050"/>
+          <w:sz w:val="24"/>
+          <w:szCs w:val="24"/>
+          <w:lang w:val="en-US"/>
+        </w:rPr>
+        <w:t>Expenses of Officers</w:t>
       </w:r>
     </w:p>
     <w:p>
@@ -4761,14 +4954,18 @@
         <w:ind w:left="0"/>
         <w:rPr>
           <w:rFonts w:ascii="Lato" w:hAnsi="Lato"/>
-          <w:sz w:val="20"/>
-          <w:szCs w:val="20"/>
-          <w:lang w:val="en-US"/>
-        </w:rPr>
-      </w:pPr>
-      <w:r>
-        <w:rPr>
-          <w:rFonts w:ascii="Lato" w:hAnsi="Lato"/>
+          <w:strike/>
+          <w:color w:val="00B050"/>
+          <w:sz w:val="20"/>
+          <w:szCs w:val="20"/>
+          <w:lang w:val="en-US"/>
+        </w:rPr>
+      </w:pPr>
+      <w:r>
+        <w:rPr>
+          <w:rFonts w:ascii="Lato" w:hAnsi="Lato"/>
+          <w:strike/>
+          <w:color w:val="00B050"/>
           <w:sz w:val="20"/>
           <w:szCs w:val="20"/>
           <w:lang w:val="en-US"/>
@@ -4812,31 +5009,45 @@
           <w:szCs w:val="20"/>
           <w:lang w:val="en-US"/>
         </w:rPr>
-        <w:t>If the Local wishes to use this provision to reimburse Officers for expenses</w:t>
-      </w:r>
-      <w:r>
-        <w:rPr>
-          <w:rFonts w:ascii="Lato" w:hAnsi="Lato"/>
-          <w:color w:val="00B050"/>
-          <w:sz w:val="20"/>
-          <w:szCs w:val="20"/>
-          <w:lang w:val="en-US"/>
-        </w:rPr>
-        <w:t>,</w:t>
-      </w:r>
-      <w:r>
-        <w:rPr>
-          <w:rFonts w:ascii="Lato" w:hAnsi="Lato"/>
-          <w:color w:val="00B050"/>
-          <w:sz w:val="20"/>
-          <w:szCs w:val="20"/>
-          <w:lang w:val="en-US"/>
-        </w:rPr>
-        <w:t xml:space="preserve"> such</w:t>
-      </w:r>
-      <w:r>
-        <w:rPr>
-          <w:color w:val="00B050"/>
+        <w:t>The</w:t>
+      </w:r>
+      <w:r>
+        <w:rPr>
+          <w:rFonts w:ascii="Lato" w:hAnsi="Lato"/>
+          <w:color w:val="00B050"/>
+          <w:sz w:val="20"/>
+          <w:szCs w:val="20"/>
+          <w:lang w:val="en-US"/>
+        </w:rPr>
+        <w:t xml:space="preserve"> Local </w:t>
+      </w:r>
+      <w:r>
+        <w:rPr>
+          <w:rFonts w:ascii="Lato" w:hAnsi="Lato"/>
+          <w:color w:val="00B050"/>
+          <w:sz w:val="20"/>
+          <w:szCs w:val="20"/>
+          <w:lang w:val="en-US"/>
+        </w:rPr>
+        <w:t>shall provide</w:t>
+      </w:r>
+      <w:r>
+        <w:rPr>
+          <w:rFonts w:ascii="Lato" w:hAnsi="Lato"/>
+          <w:color w:val="00B050"/>
+          <w:sz w:val="20"/>
+          <w:szCs w:val="20"/>
+          <w:lang w:val="en-US"/>
+        </w:rPr>
+        <w:t xml:space="preserve"> monthly</w:t>
+      </w:r>
+      <w:r>
+        <w:rPr>
+          <w:rFonts w:ascii="Lato" w:hAnsi="Lato"/>
+          <w:color w:val="00B050"/>
+          <w:sz w:val="20"/>
+          <w:szCs w:val="20"/>
+          <w:lang w:val="en-US"/>
         </w:rPr>
         <w:t xml:space="preserve"> </w:t>
       </w:r>
@@ -4848,83 +5059,27 @@
           <w:szCs w:val="20"/>
           <w:lang w:val="en-US"/>
         </w:rPr>
-        <w:t xml:space="preserve">expenses can only be paid up to </w:t>
-      </w:r>
-      <w:r>
-        <w:rPr>
-          <w:rFonts w:ascii="Lato" w:hAnsi="Lato"/>
-          <w:color w:val="00B050"/>
-          <w:sz w:val="20"/>
-          <w:szCs w:val="20"/>
-          <w:lang w:val="en-US"/>
-        </w:rPr>
-        <w:t>the following amounts,</w:t>
-      </w:r>
-      <w:r>
-        <w:rPr>
-          <w:rFonts w:ascii="Lato" w:hAnsi="Lato"/>
-          <w:color w:val="00B050"/>
-          <w:sz w:val="20"/>
-          <w:szCs w:val="20"/>
-          <w:lang w:val="en-US"/>
-        </w:rPr>
-        <w:t xml:space="preserve"> </w:t>
-      </w:r>
-      <w:r>
-        <w:rPr>
-          <w:rFonts w:ascii="Lato" w:hAnsi="Lato"/>
-          <w:color w:val="00B050"/>
-          <w:sz w:val="20"/>
-          <w:szCs w:val="20"/>
-          <w:lang w:val="en-US"/>
-        </w:rPr>
-        <w:t>so</w:t>
-      </w:r>
-      <w:r>
-        <w:rPr>
-          <w:rFonts w:ascii="Lato" w:hAnsi="Lato"/>
-          <w:color w:val="00B050"/>
-          <w:sz w:val="20"/>
-          <w:szCs w:val="20"/>
-          <w:lang w:val="en-US"/>
-        </w:rPr>
-        <w:t xml:space="preserve"> long as there are receipts for</w:t>
-      </w:r>
-      <w:r>
-        <w:rPr>
-          <w:color w:val="00B050"/>
-        </w:rPr>
-        <w:t xml:space="preserve"> </w:t>
-      </w:r>
-      <w:r>
-        <w:rPr>
-          <w:rFonts w:ascii="Lato" w:hAnsi="Lato"/>
-          <w:color w:val="00B050"/>
-          <w:sz w:val="20"/>
-          <w:szCs w:val="20"/>
-          <w:lang w:val="en-US"/>
-        </w:rPr>
-        <w:t xml:space="preserve">the expense. </w:t>
-      </w:r>
-      <w:r>
-        <w:rPr>
-          <w:rFonts w:ascii="Lato" w:hAnsi="Lato"/>
-          <w:color w:val="00B050"/>
-          <w:sz w:val="20"/>
-          <w:szCs w:val="20"/>
-          <w:lang w:val="en-US"/>
-        </w:rPr>
-        <w:t xml:space="preserve"> President - $300.00, Recording Secretary - $150.00, Secretary Treasurer - $300.00. </w:t>
-      </w:r>
-      <w:r>
-        <w:rPr>
-          <w:rFonts w:ascii="Lato" w:hAnsi="Lato"/>
-          <w:color w:val="00B050"/>
-          <w:sz w:val="20"/>
-          <w:szCs w:val="20"/>
-          <w:lang w:val="en-US"/>
-        </w:rPr>
-        <w:t>Expenses cannot be paid for reimbursement without receipts</w:t>
+        <w:t>honorariums to the following officers</w:t>
+      </w:r>
+      <w:r>
+        <w:rPr>
+          <w:rFonts w:ascii="Lato" w:hAnsi="Lato"/>
+          <w:color w:val="00B050"/>
+          <w:sz w:val="20"/>
+          <w:szCs w:val="20"/>
+          <w:lang w:val="en-US"/>
+        </w:rPr>
+        <w:t>:</w:t>
+      </w:r>
+      <w:r>
+        <w:rPr>
+          <w:rFonts w:ascii="Lato" w:hAnsi="Lato"/>
+          <w:color w:val="00B050"/>
+          <w:sz w:val="20"/>
+          <w:szCs w:val="20"/>
+          <w:lang w:val="en-US"/>
+        </w:rPr>
+        <w:t xml:space="preserve">  President - $300.00, Recording Secretary - $150.00, Secretary Treasurer - $300.00. </w:t>
       </w:r>
     </w:p>
     <w:p>
@@ -5592,7 +5747,6 @@
           <w:szCs w:val="24"/>
           <w:lang w:val="en-US"/>
         </w:rPr>
-        <w:lastRenderedPageBreak/>
         <w:t>Article 13 - Membership Meetings and Quorums</w:t>
       </w:r>
     </w:p>
@@ -5644,7 +5798,7 @@
           <w:rFonts w:ascii="Lato" w:hAnsi="Lato"/>
           <w:color w:val="00B050"/>
         </w:rPr>
-        <w:t>months. Please amend the current language. (Article 15, F, Section 1 of the Unifor</w:t>
+        <w:t>months.  (Article 15, F, Section 1 of the Unifor</w:t>
       </w:r>
       <w:r>
         <w:rPr>
@@ -5963,17 +6117,7 @@
           <w:szCs w:val="20"/>
           <w:lang w:val="en-US"/>
         </w:rPr>
-        <w:t xml:space="preserve"> of the Executive Board is a simple majority of the members</w:t>
-      </w:r>
-      <w:r>
-        <w:rPr>
-          <w:rFonts w:ascii="Lato" w:hAnsi="Lato"/>
-          <w:color w:val="00B050"/>
-          <w:sz w:val="20"/>
-          <w:szCs w:val="20"/>
-          <w:lang w:val="en-US"/>
-        </w:rPr>
-        <w:t xml:space="preserve">. </w:t>
+        <w:t xml:space="preserve"> of the Executive Board is a simple majority of the members. </w:t>
       </w:r>
       <w:r>
         <w:rPr>
@@ -6652,17 +6796,7 @@
           <w:szCs w:val="20"/>
           <w:lang w:val="en-US"/>
         </w:rPr>
-        <w:t xml:space="preserve"> </w:t>
-      </w:r>
-      <w:r>
-        <w:rPr>
-          <w:rFonts w:ascii="Lato" w:hAnsi="Lato"/>
-          <w:color w:val="00B050"/>
-          <w:sz w:val="20"/>
-          <w:szCs w:val="20"/>
-          <w:lang w:val="en-US"/>
-        </w:rPr>
-        <w:t>• Adjournment</w:t>
+        <w:t xml:space="preserve"> • Adjournment</w:t>
       </w:r>
     </w:p>
     <w:p>
@@ -8864,17 +8998,7 @@
           <w:szCs w:val="20"/>
           <w:lang w:val="en-US"/>
         </w:rPr>
-        <w:t>Two-Spirit, Lesbian, Gay, Bisexual, Transgender, Queer, Intersex, Asexual + (2SLGBTQIA+ or Pride) Workers</w:t>
-      </w:r>
-      <w:r>
-        <w:rPr>
-          <w:rFonts w:ascii="Lato" w:hAnsi="Lato"/>
-          <w:color w:val="00B050"/>
-          <w:sz w:val="20"/>
-          <w:szCs w:val="20"/>
-          <w:lang w:val="en-US"/>
-        </w:rPr>
-        <w:t xml:space="preserve"> </w:t>
+        <w:t xml:space="preserve">Two-Spirit, Lesbian, Gay, Bisexual, Transgender, Queer, Intersex, Asexual + (2SLGBTQIA+ or Pride) Workers </w:t>
       </w:r>
       <w:r>
         <w:rPr>
@@ -8928,17 +9052,7 @@
           <w:szCs w:val="20"/>
           <w:lang w:val="en-US"/>
         </w:rPr>
-        <w:t>Black, Indigenous and Workers of Colour</w:t>
-      </w:r>
-      <w:r>
-        <w:rPr>
-          <w:rFonts w:ascii="Lato" w:hAnsi="Lato"/>
-          <w:color w:val="00B050"/>
-          <w:sz w:val="20"/>
-          <w:szCs w:val="20"/>
-          <w:lang w:val="en-US"/>
-        </w:rPr>
-        <w:t xml:space="preserve"> </w:t>
+        <w:t xml:space="preserve">Black, Indigenous and Workers of Colour </w:t>
       </w:r>
       <w:r>
         <w:rPr>
@@ -9136,15 +9250,6 @@
           <w:lang w:val="en-US"/>
         </w:rPr>
         <w:tab/>
-      </w:r>
-      <w:r>
-        <w:rPr>
-          <w:rFonts w:ascii="Lato" w:hAnsi="Lato"/>
-          <w:color w:val="00B050"/>
-          <w:sz w:val="20"/>
-          <w:szCs w:val="20"/>
-          <w:lang w:val="en-US"/>
-        </w:rPr>
         <w:t>Young Workers</w:t>
       </w:r>
     </w:p>
@@ -9182,15 +9287,6 @@
           <w:lang w:val="en-US"/>
         </w:rPr>
         <w:tab/>
-      </w:r>
-      <w:r>
-        <w:rPr>
-          <w:rFonts w:ascii="Lato" w:hAnsi="Lato"/>
-          <w:color w:val="00B050"/>
-          <w:sz w:val="20"/>
-          <w:szCs w:val="20"/>
-          <w:lang w:val="en-US"/>
-        </w:rPr>
         <w:t>Health and Safety</w:t>
       </w:r>
     </w:p>
@@ -9228,15 +9324,6 @@
           <w:lang w:val="en-US"/>
         </w:rPr>
         <w:tab/>
-      </w:r>
-      <w:r>
-        <w:rPr>
-          <w:rFonts w:ascii="Lato" w:hAnsi="Lato"/>
-          <w:color w:val="00B050"/>
-          <w:sz w:val="20"/>
-          <w:szCs w:val="20"/>
-          <w:lang w:val="en-US"/>
-        </w:rPr>
         <w:t>Employee and Family Assistance Program Committee (EFAP)</w:t>
       </w:r>
     </w:p>
@@ -10828,7 +10915,6 @@
         <w:docPartUnique/>
       </w:docPartObj>
     </w:sdtPr>
-    <w:sdtEndPr/>
     <w:sdtContent>
       <w:sdt>
         <w:sdtPr>
@@ -10838,7 +10924,6 @@
             <w:docPartUnique/>
           </w:docPartObj>
         </w:sdtPr>
-        <w:sdtEndPr/>
         <w:sdtContent>
           <w:p>
             <w:pPr>
@@ -13680,6 +13765,7 @@
   <w:style w:type="character" w:default="1" w:styleId="DefaultParagraphFont">
     <w:name w:val="Default Paragraph Font"/>
     <w:uiPriority w:val="1"/>
+    <w:semiHidden/>
     <w:unhideWhenUsed/>
   </w:style>
   <w:style w:type="table" w:default="1" w:styleId="TableNormal">

</xml_diff>

<commit_message>
Changes made at Johns house with Garry, John, and myself
Signed-off-by: frothbeast <frothbeast@gmail.com>
</commit_message>
<xml_diff>
--- a/Union bylaws.docx
+++ b/Union bylaws.docx
@@ -598,7 +598,21 @@
         <w:rPr>
           <w:rFonts w:ascii="Lato" w:hAnsi="Lato"/>
         </w:rPr>
-        <w:t>The constitution of this local union shall be the constitution of the National Union Unifor and these by­laws shall be in all respects subordinate to said constitution and all applications and interpretations thereof.</w:t>
+        <w:t xml:space="preserve">The constitution of this local union shall be the constitution of the National Union Unifor and </w:t>
+      </w:r>
+      <w:proofErr w:type="gramStart"/>
+      <w:r>
+        <w:rPr>
+          <w:rFonts w:ascii="Lato" w:hAnsi="Lato"/>
+        </w:rPr>
+        <w:t>these by­laws</w:t>
+      </w:r>
+      <w:proofErr w:type="gramEnd"/>
+      <w:r>
+        <w:rPr>
+          <w:rFonts w:ascii="Lato" w:hAnsi="Lato"/>
+        </w:rPr>
+        <w:t xml:space="preserve"> shall be in all respects subordinate to said constitution and all applications and interpretations thereof.</w:t>
       </w:r>
     </w:p>
     <w:p>
@@ -781,7 +795,21 @@
         <w:rPr>
           <w:rFonts w:ascii="Lato" w:hAnsi="Lato"/>
         </w:rPr>
-        <w:t>The fiscal year of this union shall begin January 1 and end on December 31.</w:t>
+        <w:t xml:space="preserve">The fiscal year of this union </w:t>
+      </w:r>
+      <w:proofErr w:type="gramStart"/>
+      <w:r>
+        <w:rPr>
+          <w:rFonts w:ascii="Lato" w:hAnsi="Lato"/>
+        </w:rPr>
+        <w:t>shall</w:t>
+      </w:r>
+      <w:proofErr w:type="gramEnd"/>
+      <w:r>
+        <w:rPr>
+          <w:rFonts w:ascii="Lato" w:hAnsi="Lato"/>
+        </w:rPr>
+        <w:t xml:space="preserve"> begin January 1 and end on December 31.</w:t>
       </w:r>
     </w:p>
     <w:p>
@@ -3637,153 +3665,328 @@
         <w:rPr>
           <w:rFonts w:ascii="Lato" w:hAnsi="Lato"/>
           <w:strike/>
+          <w:color w:val="00B050"/>
+          <w:sz w:val="20"/>
+          <w:szCs w:val="20"/>
+          <w:lang w:val="en-US"/>
+        </w:rPr>
+      </w:pPr>
+      <w:proofErr w:type="gramStart"/>
+      <w:r>
+        <w:rPr>
+          <w:rFonts w:ascii="Lato" w:hAnsi="Lato"/>
+          <w:color w:val="00B050"/>
+          <w:sz w:val="20"/>
+          <w:szCs w:val="20"/>
+          <w:lang w:val="en-US"/>
+        </w:rPr>
+        <w:t>Nominations,</w:t>
+      </w:r>
+      <w:proofErr w:type="gramEnd"/>
+      <w:r>
+        <w:rPr>
+          <w:rFonts w:ascii="Lato" w:hAnsi="Lato"/>
+          <w:color w:val="00B050"/>
+          <w:sz w:val="20"/>
+          <w:szCs w:val="20"/>
+          <w:lang w:val="en-US"/>
+        </w:rPr>
+        <w:t xml:space="preserve"> elections of officers will follow </w:t>
+      </w:r>
+      <w:r>
+        <w:rPr>
+          <w:rFonts w:ascii="Lato" w:hAnsi="Lato"/>
+          <w:color w:val="00B050"/>
+          <w:sz w:val="20"/>
+          <w:szCs w:val="20"/>
+          <w:lang w:val="en-US"/>
+        </w:rPr>
+        <w:t>U</w:t>
+      </w:r>
+      <w:r>
+        <w:rPr>
+          <w:rFonts w:ascii="Lato" w:hAnsi="Lato"/>
+          <w:color w:val="00B050"/>
+          <w:sz w:val="20"/>
+          <w:szCs w:val="20"/>
+          <w:lang w:val="en-US"/>
+        </w:rPr>
+        <w:t xml:space="preserve">nifor national’s </w:t>
+      </w:r>
+      <w:r>
+        <w:rPr>
+          <w:rFonts w:ascii="Lato" w:hAnsi="Lato"/>
+          <w:color w:val="00B050"/>
+          <w:sz w:val="20"/>
+          <w:szCs w:val="20"/>
+          <w:lang w:val="en-US"/>
+        </w:rPr>
+        <w:t>‘P</w:t>
+      </w:r>
+      <w:r>
+        <w:rPr>
+          <w:rFonts w:ascii="Lato" w:hAnsi="Lato"/>
+          <w:color w:val="00B050"/>
+          <w:sz w:val="20"/>
+          <w:szCs w:val="20"/>
+          <w:lang w:val="en-US"/>
+        </w:rPr>
+        <w:t xml:space="preserve">olicy </w:t>
+      </w:r>
+      <w:r>
+        <w:rPr>
+          <w:rFonts w:ascii="Lato" w:hAnsi="Lato"/>
+          <w:color w:val="00B050"/>
+          <w:sz w:val="20"/>
+          <w:szCs w:val="20"/>
+          <w:lang w:val="en-US"/>
+        </w:rPr>
+        <w:t>R</w:t>
+      </w:r>
+      <w:r>
+        <w:rPr>
+          <w:rFonts w:ascii="Lato" w:hAnsi="Lato"/>
+          <w:color w:val="00B050"/>
+          <w:sz w:val="20"/>
+          <w:szCs w:val="20"/>
+          <w:lang w:val="en-US"/>
+        </w:rPr>
+        <w:t>egard</w:t>
+      </w:r>
+      <w:r>
+        <w:rPr>
+          <w:rFonts w:ascii="Lato" w:hAnsi="Lato"/>
+          <w:color w:val="00B050"/>
+          <w:sz w:val="20"/>
+          <w:szCs w:val="20"/>
+          <w:lang w:val="en-US"/>
+        </w:rPr>
+        <w:t>ing</w:t>
+      </w:r>
+      <w:r>
+        <w:rPr>
+          <w:rFonts w:ascii="Lato" w:hAnsi="Lato"/>
+          <w:color w:val="00B050"/>
+          <w:sz w:val="20"/>
+          <w:szCs w:val="20"/>
+          <w:lang w:val="en-US"/>
+        </w:rPr>
+        <w:t xml:space="preserve"> </w:t>
+      </w:r>
+      <w:r>
+        <w:rPr>
+          <w:rFonts w:ascii="Lato" w:hAnsi="Lato"/>
+          <w:color w:val="00B050"/>
+          <w:sz w:val="20"/>
+          <w:szCs w:val="20"/>
+          <w:lang w:val="en-US"/>
+        </w:rPr>
+        <w:t>L</w:t>
+      </w:r>
+      <w:r>
+        <w:rPr>
+          <w:rFonts w:ascii="Lato" w:hAnsi="Lato"/>
+          <w:color w:val="00B050"/>
+          <w:sz w:val="20"/>
+          <w:szCs w:val="20"/>
+          <w:lang w:val="en-US"/>
+        </w:rPr>
+        <w:t xml:space="preserve">ocal </w:t>
+      </w:r>
+      <w:r>
+        <w:rPr>
+          <w:rFonts w:ascii="Lato" w:hAnsi="Lato"/>
+          <w:color w:val="00B050"/>
+          <w:sz w:val="20"/>
+          <w:szCs w:val="20"/>
+          <w:lang w:val="en-US"/>
+        </w:rPr>
+        <w:t>U</w:t>
+      </w:r>
+      <w:r>
+        <w:rPr>
+          <w:rFonts w:ascii="Lato" w:hAnsi="Lato"/>
+          <w:color w:val="00B050"/>
+          <w:sz w:val="20"/>
+          <w:szCs w:val="20"/>
+          <w:lang w:val="en-US"/>
+        </w:rPr>
+        <w:t xml:space="preserve">nion </w:t>
+      </w:r>
+      <w:proofErr w:type="gramStart"/>
+      <w:r>
+        <w:rPr>
+          <w:rFonts w:ascii="Lato" w:hAnsi="Lato"/>
+          <w:color w:val="00B050"/>
+          <w:sz w:val="20"/>
+          <w:szCs w:val="20"/>
+          <w:lang w:val="en-US"/>
+        </w:rPr>
+        <w:t>E</w:t>
+      </w:r>
+      <w:r>
+        <w:rPr>
+          <w:rFonts w:ascii="Lato" w:hAnsi="Lato"/>
+          <w:color w:val="00B050"/>
+          <w:sz w:val="20"/>
+          <w:szCs w:val="20"/>
+          <w:lang w:val="en-US"/>
+        </w:rPr>
+        <w:t>lections</w:t>
+      </w:r>
+      <w:r>
+        <w:rPr>
+          <w:rFonts w:ascii="Lato" w:hAnsi="Lato"/>
+          <w:color w:val="00B050"/>
+          <w:sz w:val="20"/>
+          <w:szCs w:val="20"/>
+          <w:lang w:val="en-US"/>
+        </w:rPr>
+        <w:t>’</w:t>
+      </w:r>
+      <w:r>
+        <w:rPr>
+          <w:rFonts w:ascii="Lato" w:hAnsi="Lato"/>
+          <w:color w:val="00B050"/>
+          <w:sz w:val="20"/>
+          <w:szCs w:val="20"/>
+          <w:lang w:val="en-US"/>
+        </w:rPr>
+        <w:t>.</w:t>
+      </w:r>
+      <w:proofErr w:type="gramEnd"/>
+      <w:r>
+        <w:rPr>
+          <w:rFonts w:ascii="Lato" w:hAnsi="Lato"/>
+          <w:color w:val="00B050"/>
+          <w:sz w:val="20"/>
+          <w:szCs w:val="20"/>
+          <w:lang w:val="en-US"/>
+        </w:rPr>
+        <w:t xml:space="preserve"> </w:t>
+      </w:r>
+      <w:r>
+        <w:rPr>
+          <w:rFonts w:ascii="Lato" w:hAnsi="Lato"/>
+          <w:strike/>
+          <w:color w:val="00B050"/>
+          <w:sz w:val="20"/>
+          <w:szCs w:val="20"/>
+          <w:lang w:val="en-US"/>
+        </w:rPr>
+        <w:t xml:space="preserve"> </w:t>
+      </w:r>
+      <w:r>
+        <w:rPr>
+          <w:rFonts w:ascii="Lato" w:hAnsi="Lato"/>
+          <w:strike/>
+          <w:color w:val="00B050"/>
+          <w:sz w:val="20"/>
+          <w:szCs w:val="20"/>
+          <w:lang w:val="en-US"/>
+        </w:rPr>
+        <w:t>Any member in good standing may nominate any eligible member for office. Nominations shall be held at a General Membership meeting of the local and shall be made from the floor.  The membership shall be duly notified at least seven (7) days in advance of the time and place of nominations and notice containing both the time and place of the elections shall be given at least fifteen (15) days in advance of the election, and at least seven (7) days shall elapse between the time of nominations and the date the election shall take place.</w:t>
+      </w:r>
+    </w:p>
+    <w:p>
+      <w:pPr>
+        <w:pStyle w:val="ListParagraph"/>
+        <w:keepNext/>
+        <w:keepLines/>
+        <w:ind w:left="1134"/>
+        <w:rPr>
+          <w:rFonts w:ascii="Lato" w:hAnsi="Lato"/>
           <w:color w:val="FF0000"/>
-          <w:sz w:val="20"/>
-          <w:szCs w:val="20"/>
-          <w:lang w:val="en-US"/>
-        </w:rPr>
-      </w:pPr>
+        </w:rPr>
+      </w:pPr>
+    </w:p>
+    <w:p>
+      <w:pPr>
+        <w:pStyle w:val="ListParagraph"/>
+        <w:keepNext/>
+        <w:keepLines/>
+        <w:ind w:left="1134"/>
+        <w:rPr>
+          <w:rFonts w:ascii="Lato" w:hAnsi="Lato"/>
+          <w:strike/>
+          <w:color w:val="00B050"/>
+          <w:sz w:val="20"/>
+          <w:szCs w:val="20"/>
+          <w:lang w:val="en-US"/>
+        </w:rPr>
+      </w:pPr>
+      <w:r>
+        <w:rPr>
+          <w:rFonts w:ascii="Lato" w:hAnsi="Lato"/>
+          <w:color w:val="00B050"/>
+        </w:rPr>
+        <w:t xml:space="preserve">A member in good standing has the right to propose any eligible member for a position in office. These nominations will be conducted during a General Membership meeting of the local, and they must be made during the meeting. </w:t>
+      </w:r>
+      <w:r>
+        <w:rPr>
+          <w:rFonts w:ascii="Lato" w:hAnsi="Lato"/>
+          <w:strike/>
+          <w:color w:val="00B050"/>
+        </w:rPr>
+        <w:t xml:space="preserve">The entire membership will be formally informed at least seven (7) days prior to the scheduled nominations, specifying both the time and location. Furthermore, a notice disclosing the time and place of the elections must be provided at least fifteen (15) days before the election date. Additionally, there </w:t>
+      </w:r>
       <w:proofErr w:type="gramStart"/>
       <w:r>
         <w:rPr>
           <w:rFonts w:ascii="Lato" w:hAnsi="Lato"/>
-          <w:color w:val="00B050"/>
-          <w:sz w:val="20"/>
-          <w:szCs w:val="20"/>
-          <w:lang w:val="en-US"/>
-        </w:rPr>
-        <w:t>Nominations,</w:t>
+          <w:strike/>
+          <w:color w:val="00B050"/>
+        </w:rPr>
+        <w:t>should will</w:t>
       </w:r>
       <w:proofErr w:type="gramEnd"/>
       <w:r>
         <w:rPr>
           <w:rFonts w:ascii="Lato" w:hAnsi="Lato"/>
-          <w:color w:val="00B050"/>
-          <w:sz w:val="20"/>
-          <w:szCs w:val="20"/>
-          <w:lang w:val="en-US"/>
-        </w:rPr>
-        <w:t xml:space="preserve"> elections of officers will follow </w:t>
-      </w:r>
-      <w:r>
-        <w:rPr>
-          <w:rFonts w:ascii="Lato" w:hAnsi="Lato"/>
-          <w:color w:val="00B050"/>
-          <w:sz w:val="20"/>
-          <w:szCs w:val="20"/>
-          <w:lang w:val="en-US"/>
-        </w:rPr>
-        <w:t>U</w:t>
-      </w:r>
-      <w:r>
-        <w:rPr>
-          <w:rFonts w:ascii="Lato" w:hAnsi="Lato"/>
-          <w:color w:val="00B050"/>
-          <w:sz w:val="20"/>
-          <w:szCs w:val="20"/>
-          <w:lang w:val="en-US"/>
-        </w:rPr>
-        <w:t xml:space="preserve">nifor national’s </w:t>
-      </w:r>
-      <w:r>
-        <w:rPr>
-          <w:rFonts w:ascii="Lato" w:hAnsi="Lato"/>
-          <w:color w:val="00B050"/>
-          <w:sz w:val="20"/>
-          <w:szCs w:val="20"/>
-          <w:lang w:val="en-US"/>
-        </w:rPr>
-        <w:t>‘P</w:t>
-      </w:r>
-      <w:r>
-        <w:rPr>
-          <w:rFonts w:ascii="Lato" w:hAnsi="Lato"/>
-          <w:color w:val="00B050"/>
-          <w:sz w:val="20"/>
-          <w:szCs w:val="20"/>
-          <w:lang w:val="en-US"/>
-        </w:rPr>
-        <w:t xml:space="preserve">olicy </w:t>
-      </w:r>
-      <w:r>
-        <w:rPr>
-          <w:rFonts w:ascii="Lato" w:hAnsi="Lato"/>
-          <w:color w:val="00B050"/>
-          <w:sz w:val="20"/>
-          <w:szCs w:val="20"/>
-          <w:lang w:val="en-US"/>
-        </w:rPr>
-        <w:t>R</w:t>
-      </w:r>
-      <w:r>
-        <w:rPr>
-          <w:rFonts w:ascii="Lato" w:hAnsi="Lato"/>
-          <w:color w:val="00B050"/>
-          <w:sz w:val="20"/>
-          <w:szCs w:val="20"/>
-          <w:lang w:val="en-US"/>
-        </w:rPr>
-        <w:t>egard</w:t>
-      </w:r>
-      <w:r>
-        <w:rPr>
-          <w:rFonts w:ascii="Lato" w:hAnsi="Lato"/>
-          <w:color w:val="00B050"/>
-          <w:sz w:val="20"/>
-          <w:szCs w:val="20"/>
-          <w:lang w:val="en-US"/>
-        </w:rPr>
-        <w:t>ing</w:t>
-      </w:r>
-      <w:r>
-        <w:rPr>
-          <w:rFonts w:ascii="Lato" w:hAnsi="Lato"/>
-          <w:color w:val="00B050"/>
-          <w:sz w:val="20"/>
-          <w:szCs w:val="20"/>
-          <w:lang w:val="en-US"/>
-        </w:rPr>
-        <w:t xml:space="preserve"> </w:t>
-      </w:r>
-      <w:r>
-        <w:rPr>
-          <w:rFonts w:ascii="Lato" w:hAnsi="Lato"/>
-          <w:color w:val="00B050"/>
-          <w:sz w:val="20"/>
-          <w:szCs w:val="20"/>
-          <w:lang w:val="en-US"/>
-        </w:rPr>
-        <w:t>L</w:t>
-      </w:r>
-      <w:r>
-        <w:rPr>
-          <w:rFonts w:ascii="Lato" w:hAnsi="Lato"/>
-          <w:color w:val="00B050"/>
-          <w:sz w:val="20"/>
-          <w:szCs w:val="20"/>
-          <w:lang w:val="en-US"/>
-        </w:rPr>
-        <w:t xml:space="preserve">ocal </w:t>
-      </w:r>
-      <w:r>
-        <w:rPr>
-          <w:rFonts w:ascii="Lato" w:hAnsi="Lato"/>
-          <w:color w:val="00B050"/>
-          <w:sz w:val="20"/>
-          <w:szCs w:val="20"/>
-          <w:lang w:val="en-US"/>
-        </w:rPr>
-        <w:t>U</w:t>
-      </w:r>
-      <w:r>
-        <w:rPr>
-          <w:rFonts w:ascii="Lato" w:hAnsi="Lato"/>
-          <w:color w:val="00B050"/>
-          <w:sz w:val="20"/>
-          <w:szCs w:val="20"/>
-          <w:lang w:val="en-US"/>
-        </w:rPr>
-        <w:t xml:space="preserve">nion </w:t>
+          <w:strike/>
+          <w:color w:val="00B050"/>
+        </w:rPr>
+        <w:t xml:space="preserve"> be a minimum of seven (7) days between the nomination period and the actual election date.</w:t>
+      </w:r>
+    </w:p>
+    <w:p>
+      <w:pPr>
+        <w:pStyle w:val="ListParagraph"/>
+        <w:keepNext/>
+        <w:keepLines/>
+        <w:ind w:left="1134"/>
+        <w:rPr>
+          <w:rFonts w:ascii="Lato" w:hAnsi="Lato"/>
+          <w:color w:val="00B050"/>
+          <w:sz w:val="20"/>
+          <w:szCs w:val="20"/>
+          <w:lang w:val="en-US"/>
+        </w:rPr>
+      </w:pPr>
+    </w:p>
+    <w:p>
+      <w:pPr>
+        <w:pStyle w:val="ListParagraph"/>
+        <w:keepNext/>
+        <w:keepLines/>
+        <w:ind w:left="1134"/>
+        <w:rPr>
+          <w:rFonts w:ascii="Lato" w:hAnsi="Lato"/>
+          <w:color w:val="00B050"/>
+          <w:sz w:val="20"/>
+          <w:szCs w:val="20"/>
+          <w:lang w:val="en-US"/>
+        </w:rPr>
+      </w:pPr>
+      <w:r>
+        <w:rPr>
+          <w:rFonts w:ascii="Lato" w:hAnsi="Lato"/>
+          <w:color w:val="00B050"/>
+          <w:sz w:val="20"/>
+          <w:szCs w:val="20"/>
+          <w:lang w:val="en-US"/>
+        </w:rPr>
+        <w:t xml:space="preserve">Any member in good standing possesses the right to call for a special election by submitting a written request to the Executive Board. This request must outline the reasons for the proposed election and be signed by the </w:t>
       </w:r>
       <w:proofErr w:type="gramStart"/>
       <w:r>
@@ -3794,37 +3997,7 @@
           <w:szCs w:val="20"/>
           <w:lang w:val="en-US"/>
         </w:rPr>
-        <w:t>E</w:t>
-      </w:r>
-      <w:r>
-        <w:rPr>
-          <w:rFonts w:ascii="Lato" w:hAnsi="Lato"/>
-          <w:color w:val="00B050"/>
-          <w:sz w:val="20"/>
-          <w:szCs w:val="20"/>
-          <w:lang w:val="en-US"/>
-        </w:rPr>
-        <w:t>lections</w:t>
-      </w:r>
-      <w:r>
-        <w:rPr>
-          <w:rFonts w:ascii="Lato" w:hAnsi="Lato"/>
-          <w:color w:val="00B050"/>
-          <w:sz w:val="20"/>
-          <w:szCs w:val="20"/>
-          <w:lang w:val="en-US"/>
-        </w:rPr>
-        <w:t>’</w:t>
-      </w:r>
-      <w:r>
-        <w:rPr>
-          <w:rFonts w:ascii="Lato" w:hAnsi="Lato"/>
-          <w:color w:val="00B050"/>
-          <w:sz w:val="20"/>
-          <w:szCs w:val="20"/>
-          <w:lang w:val="en-US"/>
-        </w:rPr>
-        <w:t>.</w:t>
+        <w:t>member</w:t>
       </w:r>
       <w:proofErr w:type="gramEnd"/>
       <w:r>
@@ -3835,130 +4008,7 @@
           <w:szCs w:val="20"/>
           <w:lang w:val="en-US"/>
         </w:rPr>
-        <w:t xml:space="preserve"> </w:t>
-      </w:r>
-      <w:r>
-        <w:rPr>
-          <w:rFonts w:ascii="Lato" w:hAnsi="Lato"/>
-          <w:strike/>
-          <w:color w:val="FF0000"/>
-          <w:sz w:val="20"/>
-          <w:szCs w:val="20"/>
-          <w:lang w:val="en-US"/>
-        </w:rPr>
-        <w:t xml:space="preserve"> </w:t>
-      </w:r>
-      <w:r>
-        <w:rPr>
-          <w:rFonts w:ascii="Lato" w:hAnsi="Lato"/>
-          <w:strike/>
-          <w:color w:val="FF0000"/>
-          <w:sz w:val="20"/>
-          <w:szCs w:val="20"/>
-          <w:lang w:val="en-US"/>
-        </w:rPr>
-        <w:t>Any member in good standing may nominate any eligible member for office. Nominations shall be held at a General Membership meeting of the local and shall be made from the floor.  The membership shall be duly notified at least seven (7) days in advance of the time and place of nominations and notice containing both the time and place of the elections shall be given at least fifteen (15) days in advance of the election, and at least seven (7) days shall elapse between the time of nominations and the date the election shall take place.</w:t>
-      </w:r>
-    </w:p>
-    <w:p>
-      <w:pPr>
-        <w:pStyle w:val="ListParagraph"/>
-        <w:keepNext/>
-        <w:keepLines/>
-        <w:ind w:left="1134"/>
-        <w:rPr>
-          <w:rFonts w:ascii="Lato" w:hAnsi="Lato"/>
-          <w:color w:val="FF0000"/>
-        </w:rPr>
-      </w:pPr>
-    </w:p>
-    <w:p>
-      <w:pPr>
-        <w:pStyle w:val="ListParagraph"/>
-        <w:keepNext/>
-        <w:keepLines/>
-        <w:ind w:left="1134"/>
-        <w:rPr>
-          <w:rFonts w:ascii="Lato" w:hAnsi="Lato"/>
-          <w:strike/>
-          <w:color w:val="00B050"/>
-          <w:sz w:val="20"/>
-          <w:szCs w:val="20"/>
-          <w:lang w:val="en-US"/>
-        </w:rPr>
-      </w:pPr>
-      <w:r>
-        <w:rPr>
-          <w:rFonts w:ascii="Lato" w:hAnsi="Lato"/>
-          <w:color w:val="00B050"/>
-        </w:rPr>
-        <w:t xml:space="preserve">A member in good standing has the right to propose any eligible member for a position in office. These nominations will be conducted during a General Membership meeting of the local, and they must be made during the meeting. </w:t>
-      </w:r>
-      <w:r>
-        <w:rPr>
-          <w:rFonts w:ascii="Lato" w:hAnsi="Lato"/>
-          <w:strike/>
-          <w:color w:val="00B050"/>
-        </w:rPr>
-        <w:t xml:space="preserve">The entire membership will be formally informed at least seven (7) days prior to the scheduled nominations, specifying both the time and location. Furthermore, a notice disclosing the time and place of the elections must be provided at least fifteen (15) days before the election date. Additionally, there </w:t>
-      </w:r>
-      <w:proofErr w:type="gramStart"/>
-      <w:r>
-        <w:rPr>
-          <w:rFonts w:ascii="Lato" w:hAnsi="Lato"/>
-          <w:strike/>
-          <w:color w:val="00B050"/>
-        </w:rPr>
-        <w:t>should will</w:t>
-      </w:r>
-      <w:proofErr w:type="gramEnd"/>
-      <w:r>
-        <w:rPr>
-          <w:rFonts w:ascii="Lato" w:hAnsi="Lato"/>
-          <w:strike/>
-          <w:color w:val="00B050"/>
-        </w:rPr>
-        <w:t xml:space="preserve"> be a minimum of seven (7) days between the nomination period and the actual election date.</w:t>
-      </w:r>
-    </w:p>
-    <w:p>
-      <w:pPr>
-        <w:pStyle w:val="ListParagraph"/>
-        <w:keepNext/>
-        <w:keepLines/>
-        <w:ind w:left="1134"/>
-        <w:rPr>
-          <w:rFonts w:ascii="Lato" w:hAnsi="Lato"/>
-          <w:color w:val="00B050"/>
-          <w:sz w:val="20"/>
-          <w:szCs w:val="20"/>
-          <w:lang w:val="en-US"/>
-        </w:rPr>
-      </w:pPr>
-    </w:p>
-    <w:p>
-      <w:pPr>
-        <w:pStyle w:val="ListParagraph"/>
-        <w:keepNext/>
-        <w:keepLines/>
-        <w:ind w:left="1134"/>
-        <w:rPr>
-          <w:rFonts w:ascii="Lato" w:hAnsi="Lato"/>
-          <w:color w:val="00B050"/>
-          <w:sz w:val="20"/>
-          <w:szCs w:val="20"/>
-          <w:lang w:val="en-US"/>
-        </w:rPr>
-      </w:pPr>
-      <w:r>
-        <w:rPr>
-          <w:rFonts w:ascii="Lato" w:hAnsi="Lato"/>
-          <w:color w:val="00B050"/>
-          <w:sz w:val="20"/>
-          <w:szCs w:val="20"/>
-          <w:lang w:val="en-US"/>
-        </w:rPr>
-        <w:t>Any member in good standing possesses the right to call for a special election by submitting a written request to the Executive Board. This request must outline the reasons for the proposed election and be signed by the member making the request. Upon receipt of such a request, the executive board shall promptly assess its validity and, if deemed appropriate, proceed to schedule, and conduct the special election in accordance with the established election procedures outlined in these bylaws.</w:t>
+        <w:t xml:space="preserve"> making the request. Upon receipt of such a request, the executive board shall promptly assess its validity and, if deemed appropriate, proceed to schedule, and conduct the special election in accordance with the established election procedures outlined in these bylaws.</w:t>
       </w:r>
     </w:p>
     <w:p>
@@ -4730,7 +4780,47 @@
           <w:szCs w:val="20"/>
           <w:lang w:val="en-US"/>
         </w:rPr>
-        <w:t>The Election Committee shall be responsible to the local membership and shall not be interfered with by any officer of the Executive Board.</w:t>
+        <w:t xml:space="preserve">The Election Committee shall be responsible </w:t>
+      </w:r>
+      <w:proofErr w:type="gramStart"/>
+      <w:r>
+        <w:rPr>
+          <w:rFonts w:ascii="Lato" w:hAnsi="Lato"/>
+          <w:sz w:val="20"/>
+          <w:szCs w:val="20"/>
+          <w:lang w:val="en-US"/>
+        </w:rPr>
+        <w:t>to</w:t>
+      </w:r>
+      <w:proofErr w:type="gramEnd"/>
+      <w:r>
+        <w:rPr>
+          <w:rFonts w:ascii="Lato" w:hAnsi="Lato"/>
+          <w:sz w:val="20"/>
+          <w:szCs w:val="20"/>
+          <w:lang w:val="en-US"/>
+        </w:rPr>
+        <w:t xml:space="preserve"> the local membership and shall not be interfered with by any officer </w:t>
+      </w:r>
+      <w:proofErr w:type="gramStart"/>
+      <w:r>
+        <w:rPr>
+          <w:rFonts w:ascii="Lato" w:hAnsi="Lato"/>
+          <w:sz w:val="20"/>
+          <w:szCs w:val="20"/>
+          <w:lang w:val="en-US"/>
+        </w:rPr>
+        <w:t>of</w:t>
+      </w:r>
+      <w:proofErr w:type="gramEnd"/>
+      <w:r>
+        <w:rPr>
+          <w:rFonts w:ascii="Lato" w:hAnsi="Lato"/>
+          <w:sz w:val="20"/>
+          <w:szCs w:val="20"/>
+          <w:lang w:val="en-US"/>
+        </w:rPr>
+        <w:t xml:space="preserve"> the Executive Board.</w:t>
       </w:r>
     </w:p>
     <w:p>
@@ -5282,7 +5372,27 @@
           <w:szCs w:val="20"/>
           <w:lang w:val="en-US"/>
         </w:rPr>
-        <w:t>An ‘out of town’ overnight expense allowance will be eighty-five ($85.00) dollars per day plus room rate</w:t>
+        <w:t xml:space="preserve">An ‘out of </w:t>
+      </w:r>
+      <w:proofErr w:type="gramStart"/>
+      <w:r>
+        <w:rPr>
+          <w:rFonts w:ascii="Lato" w:hAnsi="Lato"/>
+          <w:sz w:val="20"/>
+          <w:szCs w:val="20"/>
+          <w:lang w:val="en-US"/>
+        </w:rPr>
+        <w:t>town’</w:t>
+      </w:r>
+      <w:proofErr w:type="gramEnd"/>
+      <w:r>
+        <w:rPr>
+          <w:rFonts w:ascii="Lato" w:hAnsi="Lato"/>
+          <w:sz w:val="20"/>
+          <w:szCs w:val="20"/>
+          <w:lang w:val="en-US"/>
+        </w:rPr>
+        <w:t xml:space="preserve"> overnight expense allowance will be eighty-five ($85.00) dollars per day plus room rate</w:t>
       </w:r>
       <w:r>
         <w:rPr>
@@ -5327,7 +5437,27 @@
           <w:szCs w:val="20"/>
           <w:lang w:val="en-US"/>
         </w:rPr>
-        <w:t>Any member on union business on a full day (beyond noon hour) basis outside the city but not stay overnight will be allowed fifty ($50.00) dollars</w:t>
+        <w:t xml:space="preserve">Any member on union business on a full day (beyond noon hour) basis outside the city but not </w:t>
+      </w:r>
+      <w:proofErr w:type="gramStart"/>
+      <w:r>
+        <w:rPr>
+          <w:rFonts w:ascii="Lato" w:hAnsi="Lato"/>
+          <w:sz w:val="20"/>
+          <w:szCs w:val="20"/>
+          <w:lang w:val="en-US"/>
+        </w:rPr>
+        <w:t>stay</w:t>
+      </w:r>
+      <w:proofErr w:type="gramEnd"/>
+      <w:r>
+        <w:rPr>
+          <w:rFonts w:ascii="Lato" w:hAnsi="Lato"/>
+          <w:sz w:val="20"/>
+          <w:szCs w:val="20"/>
+          <w:lang w:val="en-US"/>
+        </w:rPr>
+        <w:t xml:space="preserve"> overnight will be allowed fifty ($50.00) dollars</w:t>
       </w:r>
       <w:r>
         <w:rPr>
@@ -5372,7 +5502,27 @@
           <w:szCs w:val="20"/>
           <w:lang w:val="en-US"/>
         </w:rPr>
-        <w:t>Any member on union business within the municipality of Chatham-Kent will be reimbursed the greater of the sum of their receipts of twenty-five ($25.00) dollars</w:t>
+        <w:t xml:space="preserve">Any member </w:t>
+      </w:r>
+      <w:proofErr w:type="gramStart"/>
+      <w:r>
+        <w:rPr>
+          <w:rFonts w:ascii="Lato" w:hAnsi="Lato"/>
+          <w:sz w:val="20"/>
+          <w:szCs w:val="20"/>
+          <w:lang w:val="en-US"/>
+        </w:rPr>
+        <w:t>on</w:t>
+      </w:r>
+      <w:proofErr w:type="gramEnd"/>
+      <w:r>
+        <w:rPr>
+          <w:rFonts w:ascii="Lato" w:hAnsi="Lato"/>
+          <w:sz w:val="20"/>
+          <w:szCs w:val="20"/>
+          <w:lang w:val="en-US"/>
+        </w:rPr>
+        <w:t xml:space="preserve"> union business within the municipality of Chatham-Kent will be reimbursed the greater of the sum of their receipts of twenty-five ($25.00) dollars</w:t>
       </w:r>
       <w:r>
         <w:rPr>
@@ -5462,7 +5612,27 @@
           <w:szCs w:val="20"/>
           <w:lang w:val="en-US"/>
         </w:rPr>
-        <w:t xml:space="preserve">A delegate in attendance at the Unifor Education Centre or a like facility where the Local Union pays for both room and board plus mileage, will be entitled to no more than twenty-five ($25.00) dollars per day to cover (out of pocket) expenses. </w:t>
+        <w:t xml:space="preserve">A delegate in attendance at the Unifor Education Centre or </w:t>
+      </w:r>
+      <w:proofErr w:type="gramStart"/>
+      <w:r>
+        <w:rPr>
+          <w:rFonts w:ascii="Lato" w:hAnsi="Lato"/>
+          <w:sz w:val="20"/>
+          <w:szCs w:val="20"/>
+          <w:lang w:val="en-US"/>
+        </w:rPr>
+        <w:t>a like</w:t>
+      </w:r>
+      <w:proofErr w:type="gramEnd"/>
+      <w:r>
+        <w:rPr>
+          <w:rFonts w:ascii="Lato" w:hAnsi="Lato"/>
+          <w:sz w:val="20"/>
+          <w:szCs w:val="20"/>
+          <w:lang w:val="en-US"/>
+        </w:rPr>
+        <w:t xml:space="preserve"> facility where the Local Union pays for both room and board plus mileage, will be entitled to no more than twenty-five ($25.00) dollars per day to cover (out of pocket) expenses. </w:t>
       </w:r>
     </w:p>
     <w:p>
@@ -5489,7 +5659,27 @@
           <w:szCs w:val="20"/>
           <w:lang w:val="en-US"/>
         </w:rPr>
-        <w:t>The executive may make donations to the United Way, or other registered charities, not exceed three thousand ($3,000.00) dollars</w:t>
+        <w:t xml:space="preserve">The executive may make donations to the United Way, or other registered charities, not </w:t>
+      </w:r>
+      <w:proofErr w:type="gramStart"/>
+      <w:r>
+        <w:rPr>
+          <w:rFonts w:ascii="Lato" w:hAnsi="Lato"/>
+          <w:sz w:val="20"/>
+          <w:szCs w:val="20"/>
+          <w:lang w:val="en-US"/>
+        </w:rPr>
+        <w:t>exceed</w:t>
+      </w:r>
+      <w:proofErr w:type="gramEnd"/>
+      <w:r>
+        <w:rPr>
+          <w:rFonts w:ascii="Lato" w:hAnsi="Lato"/>
+          <w:sz w:val="20"/>
+          <w:szCs w:val="20"/>
+          <w:lang w:val="en-US"/>
+        </w:rPr>
+        <w:t xml:space="preserve"> three thousand ($3,000.00) dollars</w:t>
       </w:r>
       <w:r>
         <w:rPr>
@@ -6304,7 +6494,27 @@
           <w:szCs w:val="20"/>
           <w:lang w:val="en-US"/>
         </w:rPr>
-        <w:t xml:space="preserve">Any member who attends a meeting under the influence of alcohol or drugs and/or creates a disturbance or becomes unruly shall lose voice and his/her right to vote at said meeting. Where necessary to maintain order, the member may be evicted from the meeting by order of the Chairperson subject to the challenge of the membership. Flagrant or persistent violation of this section by any member shall be conduct unbecoming a union member. </w:t>
+        <w:t xml:space="preserve">Any member who attends a meeting under the influence of alcohol or drugs and/or creates a disturbance or becomes unruly shall lose voice and his/her right to vote at said meeting. Where necessary to maintain order, the member may be evicted from the meeting by order of the Chairperson subject to the challenge of the membership. Flagrant or persistent violation of this section by any member shall be </w:t>
+      </w:r>
+      <w:proofErr w:type="gramStart"/>
+      <w:r>
+        <w:rPr>
+          <w:rFonts w:ascii="Lato" w:hAnsi="Lato"/>
+          <w:sz w:val="20"/>
+          <w:szCs w:val="20"/>
+          <w:lang w:val="en-US"/>
+        </w:rPr>
+        <w:t>conduct</w:t>
+      </w:r>
+      <w:proofErr w:type="gramEnd"/>
+      <w:r>
+        <w:rPr>
+          <w:rFonts w:ascii="Lato" w:hAnsi="Lato"/>
+          <w:sz w:val="20"/>
+          <w:szCs w:val="20"/>
+          <w:lang w:val="en-US"/>
+        </w:rPr>
+        <w:t xml:space="preserve"> unbecoming a union member. </w:t>
       </w:r>
     </w:p>
     <w:p>
@@ -7377,7 +7587,27 @@
           <w:szCs w:val="20"/>
           <w:lang w:val="en-US"/>
         </w:rPr>
-        <w:t xml:space="preserve">Minutes shall be taken of all Executive Board meetings by the Recording Secretary and these minutes shall be available to the membership at general membership </w:t>
+        <w:t xml:space="preserve">Minutes shall be taken of all Executive Board meetings by the Recording </w:t>
+      </w:r>
+      <w:proofErr w:type="gramStart"/>
+      <w:r>
+        <w:rPr>
+          <w:rFonts w:ascii="Lato" w:hAnsi="Lato"/>
+          <w:sz w:val="20"/>
+          <w:szCs w:val="20"/>
+          <w:lang w:val="en-US"/>
+        </w:rPr>
+        <w:t>Secretary</w:t>
+      </w:r>
+      <w:proofErr w:type="gramEnd"/>
+      <w:r>
+        <w:rPr>
+          <w:rFonts w:ascii="Lato" w:hAnsi="Lato"/>
+          <w:sz w:val="20"/>
+          <w:szCs w:val="20"/>
+          <w:lang w:val="en-US"/>
+        </w:rPr>
+        <w:t xml:space="preserve"> and these minutes shall be available to the membership at general membership </w:t>
       </w:r>
       <w:r>
         <w:rPr>
@@ -7432,7 +7662,27 @@
           <w:szCs w:val="20"/>
           <w:lang w:val="en-US"/>
         </w:rPr>
-        <w:t>All decisions and recommendations of the Executive Board shall be referred to the next regular general membership meeting for approval.</w:t>
+        <w:t xml:space="preserve">All decisions and recommendations of the Executive Board shall be referred </w:t>
+      </w:r>
+      <w:proofErr w:type="gramStart"/>
+      <w:r>
+        <w:rPr>
+          <w:rFonts w:ascii="Lato" w:hAnsi="Lato"/>
+          <w:sz w:val="20"/>
+          <w:szCs w:val="20"/>
+          <w:lang w:val="en-US"/>
+        </w:rPr>
+        <w:t>to</w:t>
+      </w:r>
+      <w:proofErr w:type="gramEnd"/>
+      <w:r>
+        <w:rPr>
+          <w:rFonts w:ascii="Lato" w:hAnsi="Lato"/>
+          <w:sz w:val="20"/>
+          <w:szCs w:val="20"/>
+          <w:lang w:val="en-US"/>
+        </w:rPr>
+        <w:t xml:space="preserve"> the next regular general membership meeting for approval.</w:t>
       </w:r>
     </w:p>
     <w:p>
@@ -7709,7 +7959,27 @@
           <w:szCs w:val="20"/>
           <w:lang w:val="en-US"/>
         </w:rPr>
-        <w:t xml:space="preserve">A sum of ten ($10.00) dollars for each full year of active membership within Unifor, but not less than two hundred ($200.00) dollars will be given the family for any active member who becomes deceased. </w:t>
+        <w:t xml:space="preserve">A sum of ten ($10.00) dollars for each full year of active membership within Unifor, but not less than two hundred ($200.00) dollars will be </w:t>
+      </w:r>
+      <w:proofErr w:type="gramStart"/>
+      <w:r>
+        <w:rPr>
+          <w:rFonts w:ascii="Lato" w:hAnsi="Lato"/>
+          <w:sz w:val="20"/>
+          <w:szCs w:val="20"/>
+          <w:lang w:val="en-US"/>
+        </w:rPr>
+        <w:t>given</w:t>
+      </w:r>
+      <w:proofErr w:type="gramEnd"/>
+      <w:r>
+        <w:rPr>
+          <w:rFonts w:ascii="Lato" w:hAnsi="Lato"/>
+          <w:sz w:val="20"/>
+          <w:szCs w:val="20"/>
+          <w:lang w:val="en-US"/>
+        </w:rPr>
+        <w:t xml:space="preserve"> the family for any active member who becomes deceased. </w:t>
       </w:r>
     </w:p>
     <w:p>
@@ -7999,7 +8269,47 @@
           <w:szCs w:val="20"/>
           <w:lang w:val="en-US"/>
         </w:rPr>
-        <w:t>The resolution or motion shall then be referred to the bylaw committee and shall be reported by said committee at the next meeting together with the recommendations of the committee.</w:t>
+        <w:t xml:space="preserve">The resolution or motion shall then be referred </w:t>
+      </w:r>
+      <w:proofErr w:type="gramStart"/>
+      <w:r>
+        <w:rPr>
+          <w:rFonts w:ascii="Lato" w:hAnsi="Lato"/>
+          <w:sz w:val="20"/>
+          <w:szCs w:val="20"/>
+          <w:lang w:val="en-US"/>
+        </w:rPr>
+        <w:t>to</w:t>
+      </w:r>
+      <w:proofErr w:type="gramEnd"/>
+      <w:r>
+        <w:rPr>
+          <w:rFonts w:ascii="Lato" w:hAnsi="Lato"/>
+          <w:sz w:val="20"/>
+          <w:szCs w:val="20"/>
+          <w:lang w:val="en-US"/>
+        </w:rPr>
+        <w:t xml:space="preserve"> the </w:t>
+      </w:r>
+      <w:proofErr w:type="gramStart"/>
+      <w:r>
+        <w:rPr>
+          <w:rFonts w:ascii="Lato" w:hAnsi="Lato"/>
+          <w:sz w:val="20"/>
+          <w:szCs w:val="20"/>
+          <w:lang w:val="en-US"/>
+        </w:rPr>
+        <w:t>bylaw</w:t>
+      </w:r>
+      <w:proofErr w:type="gramEnd"/>
+      <w:r>
+        <w:rPr>
+          <w:rFonts w:ascii="Lato" w:hAnsi="Lato"/>
+          <w:sz w:val="20"/>
+          <w:szCs w:val="20"/>
+          <w:lang w:val="en-US"/>
+        </w:rPr>
+        <w:t xml:space="preserve"> committee and shall be reported by said committee at the next meeting together with the recommendations of the committee.</w:t>
       </w:r>
     </w:p>
     <w:p>
@@ -8621,6 +8931,17 @@
           <w:szCs w:val="20"/>
           <w:lang w:val="en-US"/>
         </w:rPr>
+        <w:t xml:space="preserve">Schaeffler </w:t>
+      </w:r>
+      <w:r>
+        <w:rPr>
+          <w:rFonts w:ascii="Lato" w:hAnsi="Lato"/>
+          <w:strike/>
+          <w:color w:val="00B050"/>
+          <w:sz w:val="20"/>
+          <w:szCs w:val="20"/>
+          <w:lang w:val="en-US"/>
+        </w:rPr>
         <w:t>Vitesco</w:t>
       </w:r>
       <w:r>
@@ -8727,7 +9048,27 @@
           <w:szCs w:val="20"/>
           <w:lang w:val="en-US"/>
         </w:rPr>
-        <w:t xml:space="preserve">ill by appointment all the standing committees as they are listed under Article 15 Section O of the National Union Unifor-Canada Constitution. Any member interested serving on a committee is encouraged to submit their name to the Executive Board for consideration. </w:t>
+        <w:t xml:space="preserve">ill by appointment all the standing committees as they are listed under Article 15 Section O of the National Union Unifor-Canada Constitution. Any member </w:t>
+      </w:r>
+      <w:proofErr w:type="gramStart"/>
+      <w:r>
+        <w:rPr>
+          <w:rFonts w:ascii="Lato" w:hAnsi="Lato"/>
+          <w:sz w:val="20"/>
+          <w:szCs w:val="20"/>
+          <w:lang w:val="en-US"/>
+        </w:rPr>
+        <w:t>interested</w:t>
+      </w:r>
+      <w:proofErr w:type="gramEnd"/>
+      <w:r>
+        <w:rPr>
+          <w:rFonts w:ascii="Lato" w:hAnsi="Lato"/>
+          <w:sz w:val="20"/>
+          <w:szCs w:val="20"/>
+          <w:lang w:val="en-US"/>
+        </w:rPr>
+        <w:t xml:space="preserve"> serving on a committee is encouraged to submit their name to the Executive Board for consideration. </w:t>
       </w:r>
     </w:p>
     <w:p>
@@ -9525,14 +9866,25 @@
           <w:lang w:val="en-US"/>
         </w:rPr>
       </w:pPr>
-      <w:r>
-        <w:rPr>
-          <w:rFonts w:ascii="Lato" w:hAnsi="Lato"/>
-          <w:sz w:val="20"/>
-          <w:szCs w:val="20"/>
-          <w:lang w:val="en-US"/>
-        </w:rPr>
-        <w:t>Twenty --five (25%) percent of the current members working under the jurisdiction of the steward or committeeperson must be present at the recall meeting to establish a quorum.</w:t>
+      <w:proofErr w:type="gramStart"/>
+      <w:r>
+        <w:rPr>
+          <w:rFonts w:ascii="Lato" w:hAnsi="Lato"/>
+          <w:sz w:val="20"/>
+          <w:szCs w:val="20"/>
+          <w:lang w:val="en-US"/>
+        </w:rPr>
+        <w:t>Twenty --five</w:t>
+      </w:r>
+      <w:proofErr w:type="gramEnd"/>
+      <w:r>
+        <w:rPr>
+          <w:rFonts w:ascii="Lato" w:hAnsi="Lato"/>
+          <w:sz w:val="20"/>
+          <w:szCs w:val="20"/>
+          <w:lang w:val="en-US"/>
+        </w:rPr>
+        <w:t xml:space="preserve"> (25%) percent of the current members working under the jurisdiction of the steward or committeeperson must be present at the recall meeting to establish a quorum.</w:t>
       </w:r>
     </w:p>
     <w:p>

</xml_diff>